<commit_message>
Update pipeline, add models, remove old processing module
</commit_message>
<xml_diff>
--- a/reports/AAI590 Capstone Project Template.docx
+++ b/reports/AAI590 Capstone Project Template.docx
@@ -179,16 +179,39 @@
     </w:p>
     <w:p>
       <w:r>
-        <w:t>This report should be written in a formal style, similar to an academic article or a professional white paper. You should write for</w:t>
-      </w:r>
-      <w:r>
-        <w:t xml:space="preserve"> an audience of semi-technical stakeholders, such as a VP of engineering or a CTO. You can assume some technical </w:t>
+        <w:t xml:space="preserve">This report should be written in a formal style, </w:t>
+      </w:r>
+      <w:proofErr w:type="gramStart"/>
+      <w:r>
+        <w:t>similar to</w:t>
+      </w:r>
+      <w:proofErr w:type="gramEnd"/>
+      <w:r>
+        <w:t xml:space="preserve"> an academic article or a professional white paper. You should write </w:t>
+      </w:r>
+      <w:proofErr w:type="gramStart"/>
+      <w:r>
+        <w:t>for</w:t>
+      </w:r>
+      <w:proofErr w:type="gramEnd"/>
+      <w:r>
+        <w:t xml:space="preserve"> an audience of semi-technical stakeholders, such as a VP of engineering or a CTO. You can </w:t>
+      </w:r>
+      <w:proofErr w:type="gramStart"/>
+      <w:r>
+        <w:t>assume</w:t>
+      </w:r>
+      <w:proofErr w:type="gramEnd"/>
+      <w:r>
+        <w:t xml:space="preserve"> some technical </w:t>
       </w:r>
       <w:bookmarkStart w:id="0" w:name="_Int_xnK9Yxka"/>
+      <w:proofErr w:type="gramStart"/>
       <w:r>
         <w:t>knowledge, but</w:t>
       </w:r>
       <w:bookmarkEnd w:id="0"/>
+      <w:proofErr w:type="gramEnd"/>
       <w:r>
         <w:t xml:space="preserve"> keep the details at a level that would be interesting to this group. For example, in describing your model architecture, you should give details about the number of hidden layers, nodes, and activation functions used, but not the specific lines of code or names of function calls used to build it.</w:t>
       </w:r>
@@ -209,10 +232,7 @@
         <w:t>DO NOT SUBMIT A LIST OF QUESTIONS AND ANSWERS</w:t>
       </w:r>
       <w:r>
-        <w:t xml:space="preserve">. A reader should be able to answer these questions after reading your text if they are relevant to your project; they do not need to be answered explicitly, and you should avoid repeating </w:t>
-      </w:r>
-      <w:r>
-        <w:t>information in your report just for the sake of answering each question independently.</w:t>
+        <w:t>. A reader should be able to answer these questions after reading your text if they are relevant to your project; they do not need to be answered explicitly, and you should avoid repeating information in your report just for the sake of answering each question independently.</w:t>
       </w:r>
     </w:p>
     <w:p>
@@ -288,79 +308,51 @@
       </w:r>
     </w:p>
     <w:p>
-      <w:pPr>
-        <w:spacing w:before="240" w:after="240"/>
-      </w:pPr>
+      <w:r>
+        <w:t>Understanding and predicting short</w:t>
+      </w:r>
+      <w:r>
+        <w:noBreakHyphen/>
+        <w:t>term motion from minimal sensor data is a foundational capability in modern intelligent systems. Many real</w:t>
+      </w:r>
+      <w:r>
+        <w:noBreakHyphen/>
+        <w:t>world environments rely on GPS as the only consistently available signal, especially in transportation analytics, such as large</w:t>
+      </w:r>
+      <w:r>
+        <w:noBreakHyphen/>
+        <w:t xml:space="preserve">scale mobility studies that infer movement patterns from raw GPS traces (Zheng et al., 2008), </w:t>
+      </w:r>
+      <w:r>
+        <w:lastRenderedPageBreak/>
+        <w:t>mobility</w:t>
+      </w:r>
+      <w:r>
+        <w:noBreakHyphen/>
+        <w:t>as</w:t>
+      </w:r>
+      <w:r>
+        <w:noBreakHyphen/>
+        <w:t>a</w:t>
+      </w:r>
+      <w:r>
+        <w:noBreakHyphen/>
+        <w:t>service platforms that depend on smartphone GPS for real</w:t>
+      </w:r>
+      <w:r>
+        <w:noBreakHyphen/>
+        <w:t>time positioning (Zandbergen &amp; Barbeau, 2011), and safety</w:t>
+      </w:r>
+      <w:r>
+        <w:noBreakHyphen/>
+        <w:t>critical monitoring systems where continuous geolocation is required to detect abnormal or hazardous motion (Zheng et al., 2010). This project addresses the problem of short</w:t>
+      </w:r>
+      <w:r>
+        <w:noBreakHyphen/>
+        <w:t xml:space="preserve">horizon trajectory forecasting using only timestamps and GPS coordinates, with the goal of predicting an agent’s future position one to five seconds ahead. The central question guiding this work is: </w:t>
+      </w:r>
       <w:r>
         <w:rPr>
-          <w:rFonts w:eastAsia="Times New Roman" w:cs="Times New Roman"/>
-        </w:rPr>
-        <w:t>Understanding and predicting short</w:t>
-      </w:r>
-      <w:r>
-        <w:noBreakHyphen/>
-      </w:r>
-      <w:r>
-        <w:rPr>
-          <w:rFonts w:eastAsia="Times New Roman" w:cs="Times New Roman"/>
-        </w:rPr>
-        <w:t xml:space="preserve">term motion from minimal sensor data is a foundational capability in modern intelligent systems. </w:t>
-      </w:r>
-      <w:r>
-        <w:rPr>
-          <w:rFonts w:eastAsia="Times New Roman" w:cs="Times New Roman"/>
-        </w:rPr>
-        <w:t>Many real‑world environments rely on GPS as the only consistently available signal, especially in transportation analytics—such as large‑scale mobility studies that infer movement patterns from raw GPS traces (Zheng et al., 2008)—</w:t>
-      </w:r>
-      <w:r>
-        <w:rPr>
-          <w:rFonts w:eastAsia="Times New Roman" w:cs="Times New Roman"/>
-        </w:rPr>
-        <w:lastRenderedPageBreak/>
-        <w:t>mobility‑as‑a‑service platforms that depend on smartphone GPS for real‑time positioning (Zandbergen &amp; Barbeau, 2011),</w:t>
-      </w:r>
-      <w:r>
-        <w:rPr>
-          <w:rFonts w:eastAsia="Times New Roman" w:cs="Times New Roman"/>
-        </w:rPr>
-        <w:t xml:space="preserve"> </w:t>
-      </w:r>
-      <w:r>
-        <w:rPr>
-          <w:rFonts w:eastAsia="Times New Roman" w:cs="Times New Roman"/>
-        </w:rPr>
-        <w:t>and safety‑critical monitoring systems where continuous geolocation is required to detect abnormal or hazardous motion (Zheng et al., 2010).</w:t>
-      </w:r>
-      <w:r>
-        <w:rPr>
-          <w:rFonts w:eastAsia="Times New Roman" w:cs="Times New Roman"/>
-        </w:rPr>
-        <w:t xml:space="preserve"> This project addresses the problem of </w:t>
-      </w:r>
-      <w:r>
-        <w:rPr>
-          <w:rFonts w:eastAsia="Times New Roman" w:cs="Times New Roman"/>
-        </w:rPr>
-        <w:t>short</w:t>
-      </w:r>
-      <w:r>
-        <w:noBreakHyphen/>
-      </w:r>
-      <w:r>
-        <w:rPr>
-          <w:rFonts w:eastAsia="Times New Roman" w:cs="Times New Roman"/>
-        </w:rPr>
-        <w:t>horizon trajectory forecasting using only timestamps and GPS coordinates,</w:t>
-      </w:r>
-      <w:r>
-        <w:rPr>
-          <w:rFonts w:eastAsia="Times New Roman" w:cs="Times New Roman"/>
-        </w:rPr>
-        <w:t xml:space="preserve"> with the goal of predicting an agent’s future position one to five seconds ahead. The central question guiding this work is: </w:t>
-      </w:r>
-      <w:r>
-        <w:rPr>
-          <w:rFonts w:eastAsia="Times New Roman" w:cs="Times New Roman"/>
           <w:i/>
           <w:iCs/>
         </w:rPr>
@@ -371,7 +363,6 @@
       </w:r>
       <w:r>
         <w:rPr>
-          <w:rFonts w:eastAsia="Times New Roman" w:cs="Times New Roman"/>
           <w:i/>
           <w:iCs/>
         </w:rPr>
@@ -382,7 +373,6 @@
       </w:r>
       <w:r>
         <w:rPr>
-          <w:rFonts w:eastAsia="Times New Roman" w:cs="Times New Roman"/>
           <w:i/>
           <w:iCs/>
         </w:rPr>
@@ -390,169 +380,91 @@
       </w:r>
     </w:p>
     <w:p>
-      <w:pPr>
-        <w:spacing w:before="240" w:after="240"/>
-      </w:pPr>
-      <w:r>
-        <w:rPr>
-          <w:rFonts w:eastAsia="Times New Roman" w:cs="Times New Roman"/>
-        </w:rPr>
+      <w:r>
         <w:t>This problem is important because many operational systems must function in settings where sensor availability is limited, degraded, or inconsistent. A model capable of inferring short</w:t>
       </w:r>
       <w:r>
         <w:noBreakHyphen/>
       </w:r>
       <w:r>
-        <w:rPr>
-          <w:rFonts w:eastAsia="Times New Roman" w:cs="Times New Roman"/>
-        </w:rPr>
         <w:t>term motion from sparse GPS feeds can support downstream tasks such as anomaly detection, collision risk estimation, and real</w:t>
       </w:r>
       <w:r>
         <w:noBreakHyphen/>
       </w:r>
       <w:r>
-        <w:rPr>
-          <w:rFonts w:eastAsia="Times New Roman" w:cs="Times New Roman"/>
-        </w:rPr>
         <w:t>time decision support. In practical deployments, this capability can improve safety, reduce operational risk, and enhance situational awareness without requiring expensive or complex hardware.</w:t>
       </w:r>
     </w:p>
     <w:p>
-      <w:pPr>
-        <w:spacing w:before="240" w:after="240"/>
-      </w:pPr>
-      <w:r>
-        <w:rPr>
-          <w:rFonts w:eastAsia="Times New Roman" w:cs="Times New Roman"/>
-        </w:rPr>
+      <w:r>
         <w:t>The primary end users of this system depend on the deployment context. In operational environments, engineers and analysts may use trajectory forecasts to detect deviations from expected behavior or to support automated decision</w:t>
       </w:r>
       <w:r>
         <w:noBreakHyphen/>
       </w:r>
       <w:r>
-        <w:rPr>
-          <w:rFonts w:eastAsia="Times New Roman" w:cs="Times New Roman"/>
-        </w:rPr>
         <w:t>making. In research or educational settings, the end user is the practitioner evaluating model performance and exploring the limits of GPS</w:t>
       </w:r>
       <w:r>
         <w:noBreakHyphen/>
       </w:r>
       <w:r>
-        <w:rPr>
-          <w:rFonts w:eastAsia="Times New Roman" w:cs="Times New Roman"/>
-        </w:rPr>
         <w:t>only forecasting. In both cases, the value lies in producing accurate, low</w:t>
       </w:r>
       <w:r>
         <w:noBreakHyphen/>
       </w:r>
       <w:r>
-        <w:rPr>
-          <w:rFonts w:eastAsia="Times New Roman" w:cs="Times New Roman"/>
-        </w:rPr>
         <w:t>latency predictions that can be integrated into larger analytical or control pipelines.</w:t>
       </w:r>
     </w:p>
     <w:p>
-      <w:pPr>
-        <w:spacing w:before="240" w:after="240"/>
-      </w:pPr>
-      <w:r>
-        <w:rPr>
-          <w:rFonts w:eastAsia="Times New Roman" w:cs="Times New Roman"/>
-        </w:rPr>
-        <w:t xml:space="preserve">This project uses the </w:t>
-      </w:r>
-      <w:r>
-        <w:rPr>
-          <w:rFonts w:eastAsia="Times New Roman" w:cs="Times New Roman"/>
-        </w:rPr>
-        <w:t>Microsoft GeoLife GPS Trajectory Dataset,</w:t>
-      </w:r>
-      <w:r>
-        <w:rPr>
-          <w:rFonts w:eastAsia="Times New Roman" w:cs="Times New Roman"/>
-        </w:rPr>
-        <w:t xml:space="preserve"> a large</w:t>
+      <w:r>
+        <w:t>This project uses the Microsoft GeoLife GPS Trajectory Dataset, a large</w:t>
       </w:r>
       <w:r>
         <w:noBreakHyphen/>
       </w:r>
       <w:r>
-        <w:rPr>
-          <w:rFonts w:eastAsia="Times New Roman" w:cs="Times New Roman"/>
-        </w:rPr>
-        <w:t>scale collection of real</w:t>
+        <w:t xml:space="preserve">scale collection of </w:t>
+      </w:r>
+      <w:r>
+        <w:t>real</w:t>
       </w:r>
       <w:r>
         <w:noBreakHyphen/>
       </w:r>
       <w:r>
-        <w:rPr>
-          <w:rFonts w:eastAsia="Times New Roman" w:cs="Times New Roman"/>
-        </w:rPr>
         <w:t>world GPS trajectories recorded by 182 users over a five</w:t>
       </w:r>
       <w:r>
         <w:noBreakHyphen/>
       </w:r>
       <w:r>
-        <w:rPr>
-          <w:rFonts w:eastAsia="Times New Roman" w:cs="Times New Roman"/>
-        </w:rPr>
-        <w:t xml:space="preserve">year period (Zheng et al., 2008; Microsoft Research Asia, 2012). The dataset contains more than 17,000 trajectories covering over 1.2 million kilometers of movement, with </w:t>
-      </w:r>
-      <w:r>
-        <w:rPr>
-          <w:rFonts w:eastAsia="Times New Roman" w:cs="Times New Roman"/>
-        </w:rPr>
-        <w:t>91% of trajectories sampled every 1–5 seconds</w:t>
-      </w:r>
-      <w:r>
-        <w:rPr>
-          <w:rFonts w:eastAsia="Times New Roman" w:cs="Times New Roman"/>
-        </w:rPr>
-        <w:t xml:space="preserve"> (Zheng et al., 2010). Each trajectory provides latitude, longitude, altitude, and timestamp information, enabling the derivation of kinematic features such as speed, heading, and acceleration. The dataset includes walking, biking, and driving trajectories, offering rich behavioral diversity and realistic GPS noise. Its high sampling rate and clean geospatial structure make it well suited for short</w:t>
+        <w:t>year period (Zheng et al., 2008; Microsoft Research Asia, 2012). The dataset contains more than 17,000 trajectories covering over 1.2 million kilometers of movement, with 91% of trajectories sampled every 1-5 seconds (Zheng et al., 2010). Each trajectory provides latitude, longitude, altitude, and timestamp information, enabling the derivation of kinematic features such as speed, heading, and acceleration. The dataset includes walking, biking, and driving trajectories, offering rich behavioral diversity and realistic GPS noise. Its high sampling rate and clean geospatial structure make it well suited for short</w:t>
       </w:r>
       <w:r>
         <w:noBreakHyphen/>
       </w:r>
       <w:r>
-        <w:rPr>
-          <w:rFonts w:eastAsia="Times New Roman" w:cs="Times New Roman"/>
-        </w:rPr>
         <w:t>horizon forecasting tasks.</w:t>
       </w:r>
     </w:p>
     <w:p>
-      <w:pPr>
-        <w:spacing w:before="240" w:after="240"/>
-      </w:pPr>
-      <w:r>
-        <w:rPr>
-          <w:rFonts w:eastAsia="Times New Roman" w:cs="Times New Roman"/>
-        </w:rPr>
+      <w:r>
         <w:t>The overarching goal of this project is to build a lightweight, real</w:t>
       </w:r>
       <w:r>
         <w:noBreakHyphen/>
       </w:r>
       <w:r>
-        <w:rPr>
-          <w:rFonts w:eastAsia="Times New Roman" w:cs="Times New Roman"/>
-        </w:rPr>
         <w:t>time forecasting model capable of predicting future positions over short horizons. The working hypothesis is that even with limited inputs, a combination of derived kinematic features and sequence</w:t>
       </w:r>
       <w:r>
         <w:noBreakHyphen/>
       </w:r>
       <w:r>
-        <w:rPr>
-          <w:rFonts w:eastAsia="Times New Roman" w:cs="Times New Roman"/>
-        </w:rPr>
         <w:t>based neural models—such as LSTMs or temporal convolutional networks—can achieve accurate and stable predictions. The final deliverable will be a small, deployable inference module that accepts a stream of GPS points and outputs predicted positions for the next several seconds. Model performance will be evaluated using geodesic displacement metrics, latency measurements, and visual comparisons between predicted and actual trajectories.</w:t>
       </w:r>
     </w:p>
@@ -571,316 +483,413 @@
     </w:p>
     <w:p>
       <w:r>
-        <w:t xml:space="preserve">The dataset used in this project consists of time‑ordered GPS trajectory records that capture real‑world vehicle motion. Each record represents a single moment in a trip and includes both raw positional information and several engineered </w:t>
+        <w:t>The dataset used in this project is the Microsoft GeoLife GPS Trajectory Dataset, a collection of time</w:t>
+      </w:r>
+      <w:r>
+        <w:t>-</w:t>
+      </w:r>
+      <w:r>
+        <w:t xml:space="preserve">ordered GPS trajectory records released by Microsoft Research Asia (Microsoft Research Asia, 2012). </w:t>
+      </w:r>
+      <w:r>
+        <w:t>In this report, a record refers to one time</w:t>
+      </w:r>
+      <w:r>
+        <w:t>-</w:t>
+      </w:r>
+      <w:r>
+        <w:t xml:space="preserve">stamped GPS observation within a trajectory, while a trajectory refers to the ordered sequence of observations that make up a trip segment. </w:t>
+      </w:r>
+      <w:r>
+        <w:t xml:space="preserve">Each </w:t>
       </w:r>
       <w:r>
         <w:lastRenderedPageBreak/>
-        <w:t>motion variables derived from those positions. At the foundation of the dataset is a timestamp variable, which provides the chronological ordering necessary for computing motion dynamics. From these timestamps, a time‑delta variable was computed to measure the interval between consecutive samples. In principle, GPS devices often attempt to record at a fixed sampling rate—commonly one sample per second—but real‑world conditions such as signal obstruction or device latency frequently introduce irregularities (Zandbergen &amp; Barbeau, 2011). These irregularities directly influence the stability of derived motion variables.</w:t>
-      </w:r>
-    </w:p>
-    <w:p/>
-    <w:p>
-      <w:r>
-        <w:t>Spatial coordinates are represented in a local East‑North‑Up (ENU) reference frame, a standard Cartesian coordinate system used in geospatial applications to express positions in meters relative to a fixed origin (Teunissen &amp; Montenbruck, 2017). Using these coordinates, instantaneous speed was computed as the rate of change of position over time. Acceleration was then derived as the change in speed across consecutive samples, providing insight into how quickly the vehicle increases or decreases velocity. Heading, expressed in radians, represents the vehicle’s orientation relative to true north, and turn rate captures the rate at which heading changes over time. Because heading is an angular quantity, it naturally wraps around at ±π, which can introduce discontinuities if not properly unwrapped (Sola, 2017). Together, these variables form a comprehensive description of the vehicle’s motion state at each moment in the trajectory.</w:t>
-      </w:r>
-    </w:p>
-    <w:p/>
-    <w:p>
-      <w:r>
-        <w:t xml:space="preserve">Exploratory analysis revealed several data quality issues. The most prominent involved irregular timestamp intervals, where the expected </w:t>
-      </w:r>
-      <w:r>
-        <w:t>one‑second sampling rate occasionally deviated. These deviations produced spikes in derived variables such as speed, acceleration, and turn rate, since each depends directly on the time delta between samples. In addition, heading values exhibited discontinuities near ±π, a known artifact of angular wraparound that can artificially inflate turn rate calculations. A small number of trajectories contained extremely short sequences that were not suitable for meaningful analysis. To address these issues, the dataset was regularized by computing explicit time deltas, identifying outliers, and validating that most samples adhered to the expected sampling interval. Derived variables were inspected for physically implausible values, such as speeds exceeding 50 meters per second or accelerations greater than 10 meters per second squared, which typically indicate noise rather than true vehicle behavior. While these issues were manageable during exploratory analysis, a fully developed machine learning pipeline would require more robust preprocessing, including smoothing filters, interpolation for missing timestamps, heading unwrapping, and automated outlier removal to ensure stable model inputs.</w:t>
-      </w:r>
-    </w:p>
-    <w:p/>
-    <w:p>
-      <w:r>
-        <w:t xml:space="preserve">The variables in this dataset are directly aligned with the project’s goal of forecasting short‑term vehicle motion. Speed, acceleration, and turn rate are fundamental indicators of how a vehicle is likely to move in the near future, and patterns observed in the exploratory analysis suggest that these variables contain meaningful structure. Speed tends to vary smoothly over time except in cases of timestamp irregularities, indicating that short‑term forecasting models should be able to learn predictable trends. Acceleration exhibits more volatility but still reflects recognizable driving behaviors such as gradual acceleration, steady cruising, and braking. Heading and turn </w:t>
+        <w:t>record includes raw positional information</w:t>
+      </w:r>
+      <w:r>
+        <w:t>,</w:t>
+      </w:r>
+      <w:r>
+        <w:t xml:space="preserve"> and several engineered motion variables </w:t>
+      </w:r>
+      <w:r>
+        <w:t xml:space="preserve">were </w:t>
+      </w:r>
+      <w:r>
+        <w:t xml:space="preserve">derived from </w:t>
+      </w:r>
+      <w:r>
+        <w:t xml:space="preserve">consecutive </w:t>
+      </w:r>
+      <w:r>
+        <w:t xml:space="preserve">positions. </w:t>
+      </w:r>
+      <w:r>
+        <w:t xml:space="preserve">The </w:t>
+      </w:r>
+      <w:r>
+        <w:t xml:space="preserve">timestamp variable provides the chronological ordering </w:t>
+      </w:r>
+      <w:r>
+        <w:t>needed to compute</w:t>
+      </w:r>
+      <w:r>
+        <w:t xml:space="preserve"> motion dynamics</w:t>
+      </w:r>
+      <w:r>
+        <w:t xml:space="preserve">, and the </w:t>
+      </w:r>
+      <w:r>
+        <w:t>time</w:t>
+      </w:r>
+      <w:r>
+        <w:t>-</w:t>
+      </w:r>
+      <w:r>
+        <w:t xml:space="preserve">delta variable </w:t>
+      </w:r>
+      <w:r>
+        <w:t>measures</w:t>
+      </w:r>
+      <w:r>
+        <w:t xml:space="preserve"> the interval between consecutive samples. </w:t>
+      </w:r>
+      <w:r>
+        <w:t>Although</w:t>
+      </w:r>
+      <w:r>
+        <w:t xml:space="preserve"> GPS devices often attempt to record at a fixed sampling rate</w:t>
+      </w:r>
+      <w:r>
+        <w:t xml:space="preserve">, </w:t>
+      </w:r>
+      <w:r>
+        <w:t>commonly one sample per second</w:t>
+      </w:r>
+      <w:r>
+        <w:t xml:space="preserve">, </w:t>
+      </w:r>
+      <w:r>
+        <w:t>real</w:t>
+      </w:r>
+      <w:r>
+        <w:t>-</w:t>
+      </w:r>
+      <w:r>
+        <w:t xml:space="preserve">world conditions such as signal obstruction or device latency </w:t>
+      </w:r>
+      <w:r>
+        <w:t>can</w:t>
+      </w:r>
+      <w:r>
+        <w:t xml:space="preserve"> introduce </w:t>
+      </w:r>
+      <w:r>
+        <w:t>irregular intervals</w:t>
+      </w:r>
+      <w:r>
+        <w:t xml:space="preserve"> (Zandbergen &amp; Barbeau, 2011). These irregularities directly </w:t>
+      </w:r>
+      <w:r>
+        <w:t>affect</w:t>
+      </w:r>
+      <w:r>
+        <w:t xml:space="preserve"> the stability of derived motion variables.</w:t>
+      </w:r>
+    </w:p>
+    <w:p>
+      <w:pPr>
+        <w:rPr>
+          <w:kern w:val="2"/>
+          <w14:ligatures w14:val="standardContextual"/>
+        </w:rPr>
+      </w:pPr>
+      <w:r>
+        <w:t xml:space="preserve">Spatial coordinates were converted from latitude and longitude into a local East-North-Up (ENU) reference frame, a standard Cartesian coordinate system that expresses positions in meters relative to a fixed origin (Teunissen &amp; </w:t>
+      </w:r>
+      <w:proofErr w:type="spellStart"/>
+      <w:r>
+        <w:t>Montenbruck</w:t>
+      </w:r>
+      <w:proofErr w:type="spellEnd"/>
+      <w:r>
+        <w:t>, 2017). This conversion makes distance, speed, and acceleration calculations more interpretable because the coordinates are measured in linear units rather than degrees. Instantaneous speed was computed as the change in position over time, and acceleration was derived from changes in speed across consecutive samples. Heading, expressed in radians, represents the direction of travel relative to true north, while turn rate captures how quickly that heading changes. Because heading is an angular quantity, it wraps around at ±π, which can create artificial discontinuities unless it is unwrapped before turn rate is calculated (Sola, 2017). Together, these variables describe the vehicle’s motion state at each point in the trajectory.</w:t>
+      </w:r>
+    </w:p>
+    <w:p>
+      <w:r>
+        <w:t xml:space="preserve">Exploratory analysis revealed several data quality issues that could affect model stability. The most prominent issue was irregular timestamp intervals, where the expected one-second sampling rate occasionally deviated. Because speed, acceleration, and turn rate all depend on the time </w:t>
+      </w:r>
+      <w:r>
+        <w:t xml:space="preserve">delta between samples, these deviations produced spikes in derived variables that may reflect sampling noise rather than true motion. Heading values also exhibited discontinuities near ±π, a known artifact of angular wraparound that can artificially inflate turn rate calculations. In addition, a small number of trajectories contained extremely short sequences that were not suitable for meaningful temporal modeling. To address these issues, the dataset was regularized by computing explicit time deltas, identifying outliers, and validating that most samples adhered to the expected sampling interval. </w:t>
+      </w:r>
+    </w:p>
+    <w:p>
+      <w:pPr>
+        <w:rPr>
+          <w:kern w:val="2"/>
+          <w14:ligatures w14:val="standardContextual"/>
+        </w:rPr>
+      </w:pPr>
+      <w:r>
+        <w:t>Derived variables were inspected for physically implausible values, such as speeds exceeding 50 meters per second or accelerations greater than 10 meters per second squared, which typically indicate noise rather than true vehicle behavior. A fully developed machine learning pipeline would require more robust preprocessing, including smoothing filters, interpolation for missing timestamps, heading unwrapping, and automated outlier removal to ensure stable model inputs.</w:t>
+      </w:r>
+    </w:p>
+    <w:p>
+      <w:pPr>
+        <w:rPr>
+          <w:kern w:val="2"/>
+          <w14:ligatures w14:val="standardContextual"/>
+        </w:rPr>
+      </w:pPr>
+      <w:r>
+        <w:t xml:space="preserve">The variables in this dataset align directly with the project’s goal of forecasting short-term vehicle motion. Speed, acceleration, and turn rate provide complementary signals about how a vehicle is likely to move </w:t>
+      </w:r>
+      <w:proofErr w:type="gramStart"/>
+      <w:r>
+        <w:t>in the near future</w:t>
+      </w:r>
+      <w:proofErr w:type="gramEnd"/>
+      <w:r>
+        <w:t xml:space="preserve">: speed captures current motion intensity, acceleration captures changes in that motion, and turn rate captures directional change. Exploratory analysis suggests that these variables contain meaningful temporal structure. Speed tends to vary smoothly over time except when timestamp irregularities introduce artifacts, indicating that short-term forecasting models should be able to learn predictable trends. Acceleration is more volatile but still reflects recognizable driving behaviors such as gradual acceleration, steady cruising, and braking. Heading and turn rate reveal directional stability during straight segments and distinct rotational </w:t>
       </w:r>
       <w:r>
         <w:lastRenderedPageBreak/>
-        <w:t>rate reveal directional stability during straight segments and distinct rotational patterns during turns, both of which are essential for predicting future position. Although noise is present in these variables, the underlying patterns remain strong enough to support predictive modeling.</w:t>
-      </w:r>
-    </w:p>
-    <w:p/>
-    <w:p>
-      <w:r>
-        <w:t>Relationships among variables further inform how the machine learning model should be constructed. Speed and acceleration are naturally correlated, as acceleration represents the rate of change of speed. Turn rate is closely tied to heading, with large heading changes producing correspondingly large turn rates. These correlations suggest that the model will benefit from using multiple motion variables together, but they also indicate potential redundancy that must be considered during feature engineering. For example, acceleration and speed may contribute overlapping information, and heading may need to be unwrapped to avoid artificial discontinuities. Understanding these relationships helps ensure that the final model architecture is designed to capture meaningful dynamics without being misled by noise or multicollinearity.</w:t>
-      </w:r>
-    </w:p>
-    <w:p/>
-    <w:p>
-      <w:r>
-        <w:t>Overall, the dataset provides a rich and detailed representation of vehicle motion, and the exploratory analysis confirms that the engineered variables are appropriate for short‑term trajectory forecasting. While data irregularities introduce challenges, they are well understood and can be addressed through established preprocessing techniques. The patterns observed across variables support the feasibility of building a predictive model that leverages both linear and rotational motion cues to anticipate future vehicle behavior.</w:t>
+        <w:t>patterns during turns, both of which are essential for predicting future position. Although noise is present in these variables, the underlying patterns remain strong enough to support predictive modeling.</w:t>
       </w:r>
     </w:p>
     <w:p>
       <w:pPr>
         <w:pStyle w:val="Heading1"/>
+      </w:pPr>
+      <w:r>
+        <w:t>3 Literature Review</w:t>
+      </w:r>
+      <w:r>
+        <w:t xml:space="preserve"> </w:t>
+      </w:r>
+    </w:p>
+    <w:p>
+      <w:r>
+        <w:t xml:space="preserve">Short‑horizon trajectory forecasting has been explored extensively across transportation analytics, mobility modeling, and geospatial prediction, with numerous methods designed to estimate near‑term motion from positional data. Early approaches relied on classical kinematic models that assume constant velocity or constant acceleration. These models propagate future positions by integrating estimated speed and heading over short horizons and have been widely used in navigation and robotics applications due to their simplicity and low computational cost (Teunissen &amp; </w:t>
+      </w:r>
+      <w:proofErr w:type="spellStart"/>
+      <w:r>
+        <w:t>Montenbruck</w:t>
+      </w:r>
+      <w:proofErr w:type="spellEnd"/>
+      <w:r>
+        <w:t>, 2017). Although effective in stable motion regimes, these approaches struggle with nonlinear trajectories, sharp turns, and GPS noise, limiting their accuracy in real‑world environments.</w:t>
+      </w:r>
+    </w:p>
+    <w:p>
+      <w:r>
+        <w:t>More sophisticated forecasting systems incorporate Bayesian filtering techniques such as the Kalman filter and its variants. These methods model motion as a dynamical system with latent velocity and acceleration states, enabling smoother estimates of position and heading and reducing the impact of GPS jitter. Kalman‑based approaches have been applied extensively in vehicle tracking, pedestrian localization, and sensor fusion tasks, demonstrating improved stability over purely kinematic models (Sola, 2017). However, these methods often assume linear dynamics or require additional sensors such as IMUs to achieve high accuracy, making them less suitable for GPS‑only scenarios.</w:t>
+      </w:r>
+    </w:p>
+    <w:p>
+      <w:pPr>
         <w:rPr>
-          <w:rFonts w:asciiTheme="majorBidi" w:eastAsia="Linux Libertine" w:hAnsiTheme="majorBidi"/>
-          <w:sz w:val="24"/>
-          <w:szCs w:val="24"/>
+          <w:kern w:val="2"/>
+          <w14:ligatures w14:val="standardContextual"/>
         </w:rPr>
       </w:pPr>
       <w:r>
-        <w:t>3 Literature Review</w:t>
-      </w:r>
-    </w:p>
-    <w:p>
-      <w:pPr>
-        <w:spacing w:before="20"/>
+        <w:t>Commercial mobility platforms also address short</w:t>
+      </w:r>
+      <w:r>
+        <w:noBreakHyphen/>
+        <w:t>term motion prediction using map</w:t>
+      </w:r>
+      <w:r>
+        <w:noBreakHyphen/>
+        <w:t>matching algorithms and route</w:t>
+      </w:r>
+      <w:r>
+        <w:noBreakHyphen/>
+        <w:t>constrained forecasting. Ride</w:t>
+      </w:r>
+      <w:r>
+        <w:noBreakHyphen/>
+        <w:t>sharing and navigation systems frequently combine GPS traces with road</w:t>
+      </w:r>
+      <w:r>
+        <w:noBreakHyphen/>
+        <w:t>network information to infer likely paths and estimate near</w:t>
+      </w:r>
+      <w:r>
+        <w:noBreakHyphen/>
+        <w:t>term movement (Zandbergen &amp; Barbeau, 2011). Large</w:t>
+      </w:r>
+      <w:r>
+        <w:noBreakHyphen/>
+        <w:t>scale navigation systems such as Google Maps use learned motion models to predict driver arrival times and detect deviations from expected behavior, demonstrating the practical importance of short</w:t>
+      </w:r>
+      <w:r>
+        <w:noBreakHyphen/>
+        <w:t>horizon forecasting in operational environments (Derrow-Pinion et al., 2021).</w:t>
+      </w:r>
+    </w:p>
+    <w:p>
+      <w:r>
+        <w:t xml:space="preserve">Recent advances in machine learning have led to the adoption of sequence‑based neural models for trajectory prediction. Recurrent neural networks, particularly long short‑term memory (LSTM) networks and gated recurrent units (GRUs), were originally developed to capture long‑range temporal dependencies in sequential data (Hochreiter &amp; </w:t>
+      </w:r>
+      <w:proofErr w:type="spellStart"/>
+      <w:r>
+        <w:t>Schmidhuber</w:t>
+      </w:r>
+      <w:proofErr w:type="spellEnd"/>
+      <w:r>
+        <w:t>, 1997; Cho et al., 2014). These architectures have since been adapted for mobility forecasting, where they learn nonlinear relationships between displacement, speed, heading, and future motion. Studies applying LSTMs and GRUs to pedestrian and vehicle trajectories have shown substantial improvements over classical baselines, especially in settings with irregular motion patterns or noisy sensor inputs (Zheng et al., 2008).</w:t>
+      </w:r>
+    </w:p>
+    <w:p>
+      <w:r>
+        <w:t xml:space="preserve">Temporal convolutional networks (TCNs) represent another major development in sequence modeling. By using dilated causal convolutions, TCNs can model long temporal contexts efficiently while maintaining stable gradients and low inference latency. Bai et al. (2018) demonstrated that TCNs outperform many recurrent architectures on sequence‑prediction tasks, making them well‑suited for real‑time </w:t>
+      </w:r>
+      <w:r>
+        <w:lastRenderedPageBreak/>
+        <w:t>forecasting applications. Their ability to process sequences in parallel also makes them attractive for deployment in systems requiring rapid inference.</w:t>
+      </w:r>
+    </w:p>
+    <w:p>
+      <w:r>
+        <w:t>The suitability of these machine learning methods for GPS‑only forecasting is supported by extensive prior work using the Microsoft GeoLife GPS Trajectory Dataset. GeoLife contains more than 17,000 trajectories recorded by 182 users, with 91% of trajectories sampled every one to five seconds (Microsoft Research Asia, 2012). This dense sampling enables accurate derivation of kinematic features such as speed, acceleration, heading, and turn rate, which have been shown to improve the stability and accuracy of short‑horizon prediction models (Zheng et al., 2010). Research using GeoLife has demonstrated its effectiveness for mobility pattern mining, transportation mode classification, and location prediction, establishing it as a widely used benchmark for GPS‑based forecasting tasks.</w:t>
+      </w:r>
+    </w:p>
+    <w:p>
+      <w:r>
+        <w:t xml:space="preserve">Several academic and commercial projects illustrate the application of these methods to problems </w:t>
+      </w:r>
+      <w:proofErr w:type="gramStart"/>
+      <w:r>
+        <w:t>similar to</w:t>
+      </w:r>
+      <w:proofErr w:type="gramEnd"/>
+      <w:r>
+        <w:t xml:space="preserve"> the one addressed in this capstone. LSTM‑based models have been used to predict pedestrian trajectories in crowded environments, vehicle motion in urban traffic, and multimodal mobility patterns across large‑scale GPS datasets (Zheng et al., 2008). GRU‑based encoder–decoder architectures have been applied to short‑term motion prediction in transportation networks, while TCNs have been used in real‑time mobility analytics where low latency and temporal stability are critical (Bai et al., 2018). Commercial navigation systems employ variants of kinematic and learned motion models to estimate driver arrival times and detect anomalous movement. Collectively, these examples demonstrate that sequence‑based neural architectures and derived kinematic features are well‑suited for </w:t>
+      </w:r>
+      <w:r>
+        <w:t>short‑horizon trajectory forecasting using GPS‑only inputs.</w:t>
+      </w:r>
+    </w:p>
+    <w:p>
+      <w:pPr>
+        <w:pStyle w:val="Heading1"/>
+      </w:pPr>
+      <w:r>
+        <w:t>4 Methodology</w:t>
+      </w:r>
+    </w:p>
+    <w:p>
+      <w:r>
+        <w:t xml:space="preserve">The forecasting system developed for this project uses engineered kinematic features, sliding‑window sequence extraction, and three deep learning architectures—GRU, LSTM, and a Temporal Convolutional Network (TCN)—to predict short‑horizon motion from GPS‑derived inputs. A classical constant‑velocity baseline model is included to contextualize the performance of the learned models. This section describes the final model </w:t>
+      </w:r>
+      <w:proofErr w:type="gramStart"/>
+      <w:r>
+        <w:t>architectures</w:t>
+      </w:r>
+      <w:proofErr w:type="gramEnd"/>
+      <w:r>
+        <w:t>, preprocessing pipeline, training procedures, and optimization strategy used in the project. All performance outcomes are reserved for the Results section.</w:t>
+      </w:r>
+    </w:p>
+    <w:p>
+      <w:r>
+        <w:t xml:space="preserve">The forecasting problem is formulated as a supervised sequence‑to‑sequence task. Each model receives a fixed‑length input window of twenty consecutive motion states and predicts the two‑dimensional displacement for the next five timesteps. Each motion state includes six engineered features derived from raw GPS coordinates: projected x and y position, instantaneous speed, heading, linear acceleration, and turn rate. These variables capture both translational and rotational motion dynamics and are commonly used in mobility modeling and navigation systems (Teunissen &amp; </w:t>
+      </w:r>
+      <w:proofErr w:type="spellStart"/>
+      <w:r>
+        <w:t>Montenbruck</w:t>
+      </w:r>
+      <w:proofErr w:type="spellEnd"/>
+      <w:r>
+        <w:t>, 2017; Sola, 2017). Their inclusion allows the models to learn short‑term motion patterns that influence future displacement.</w:t>
+      </w:r>
+    </w:p>
+    <w:p>
+      <w:r>
+        <w:t xml:space="preserve">A simple kinematic baseline model was implemented to provide a lower‑bound reference for evaluating the learned architectures. The baseline assumes constant velocity over the prediction horizon by extrapolating the most recent observed displacement. Specifically, it computes the difference between the final two </w:t>
+      </w:r>
+      <w:r>
+        <w:lastRenderedPageBreak/>
+        <w:t xml:space="preserve">positions in the input window and repeats this displacement for each of the five future timesteps. Constant‑velocity models are widely used in navigation and tracking applications due to their simplicity and low computational cost (Teunissen &amp; </w:t>
+      </w:r>
+      <w:proofErr w:type="spellStart"/>
+      <w:r>
+        <w:t>Montenbruck</w:t>
+      </w:r>
+      <w:proofErr w:type="spellEnd"/>
+      <w:r>
+        <w:t>, 2017). Using the same window generator and evaluation metrics as the learned models ensures a fair comparison.</w:t>
+      </w:r>
+    </w:p>
+    <w:p>
+      <w:r>
+        <w:t xml:space="preserve">Three neural architectures were developed to explore different approaches to temporal modeling. The GRU model consists of a single gated recurrent unit layer with 64 hidden units, followed by a fully connected layer that maps the final hidden state to the ten displacement outputs. GRUs are designed to capture temporal dependencies efficiently through gating mechanisms that regulate information flow (Cho et al., 2014). The LSTM model mirrors this structure, replacing the GRU layer with a </w:t>
+      </w:r>
+      <w:proofErr w:type="gramStart"/>
+      <w:r>
+        <w:t>long short</w:t>
+      </w:r>
+      <w:proofErr w:type="gramEnd"/>
+      <w:r>
+        <w:t xml:space="preserve">‑term memory layer of the same width. LSTMs incorporate additional gating structures that help preserve long‑range temporal information and have been widely used in sequential prediction tasks (Hochreiter &amp; </w:t>
+      </w:r>
+      <w:proofErr w:type="spellStart"/>
+      <w:r>
+        <w:t>Schmidhuber</w:t>
+      </w:r>
+      <w:proofErr w:type="spellEnd"/>
+      <w:r>
+        <w:t>, 1997).</w:t>
+      </w:r>
+    </w:p>
+    <w:p>
+      <w:r>
+        <w:t xml:space="preserve">The TCN model incorporates </w:t>
+      </w:r>
+      <w:proofErr w:type="gramStart"/>
+      <w:r>
+        <w:t>a deeper</w:t>
+      </w:r>
+      <w:proofErr w:type="gramEnd"/>
+      <w:r>
+        <w:t xml:space="preserve"> and more expressive architecture. It uses five temporal convolutional blocks with dilation factors of 1, 2, 4, 8, and 16, enabling the receptive field to span and exceed the twenty‑step input window. Each block includes a dilated convolution, batch normalization, </w:t>
+      </w:r>
+      <w:proofErr w:type="spellStart"/>
+      <w:r>
+        <w:t>ReLU</w:t>
+      </w:r>
+      <w:proofErr w:type="spellEnd"/>
+      <w:r>
+        <w:t xml:space="preserve"> activation, dropout, and a residual connection. Dilated convolutions allow the model to capture long‑range temporal structure while maintaining stable gradients (Bai et al., 2018). To provide positional awareness, sinusoidal positional encodings are added to the input sequence, following techniques used in transformer‑based architectures (Vaswani et al., 2017). After the convolutional stack, a multi‑head </w:t>
+      </w:r>
+      <w:r>
+        <w:t>self‑attention layer with four heads processes the temporal features, enabling the model to emphasize the most informative timesteps. A final fully connected layer maps the attended representation to the displacement outputs. This architecture was selected to evaluate whether convolutional temporal modeling and attention mechanisms can outperform recurrent baselines in short‑horizon forecasting.</w:t>
+      </w:r>
+    </w:p>
+    <w:p>
+      <w:r>
+        <w:t>Training follows a unified pipeline across all models. The GeoLife dataset is split at the trajectory level into 60% training, 20% validation, and 20% test sets to prevent leakage between segments of the same trajectory (Microsoft Research Asia, 2012). Global normalization parameters are computed across all training trajectories, and each sliding window is additionally normalized on a per‑window basis to stabilize training. A streaming window generator produces batches of input windows and future displacement targets without loading all windows into memory simultaneously. Because some GeoLife trajectories contain tens of thousands of samples, adaptive caps are applied to limit the number of windows extracted from any single trajectory, ensuring consistent batch sizes and preventing memory exhaustion.</w:t>
+      </w:r>
+    </w:p>
+    <w:p>
+      <w:r>
+        <w:t>All models are trained using the Adam optimizer with a learning rate of 1×10⁻³ and mean squared error loss. Training proceeds for twenty epochs, with progress and system‑resource heartbeats logged periodically. The batch size is implicitly determined by the number of windows generated per trajectory, which varies depending on trajectory length and the adaptive caps. This approach maintains computational feasibility while preserving the temporal diversity of the dataset.</w:t>
+      </w:r>
+    </w:p>
+    <w:p>
+      <w:r>
+        <w:t xml:space="preserve">Model optimization involved iterative adjustments to architectural and training hyperparameters. </w:t>
+      </w:r>
+      <w:r>
         <w:rPr>
-          <w:rFonts w:eastAsia="Times New Roman" w:cs="Times New Roman"/>
-        </w:rPr>
-      </w:pPr>
-      <w:r>
-        <w:rPr>
-          <w:rFonts w:eastAsia="Times New Roman" w:cs="Times New Roman"/>
-        </w:rPr>
-        <w:t>This section of your final report should give background information about your project application/research question and the machine learning method(s) that you have chosen to use. This section should be completely focused on existing work, rather than on your own methods and choices. For example, instead of writing “</w:t>
-      </w:r>
-      <w:r>
-        <w:rPr>
-          <w:rFonts w:eastAsia="Times New Roman" w:cs="Times New Roman"/>
-          <w:i/>
-          <w:iCs/>
-        </w:rPr>
-        <w:t>We chose method x for application y because it has benefit z</w:t>
-      </w:r>
-      <w:r>
-        <w:rPr>
-          <w:rFonts w:eastAsia="Times New Roman" w:cs="Times New Roman"/>
-        </w:rPr>
-        <w:t>”, you would write “</w:t>
-      </w:r>
-      <w:r>
-        <w:rPr>
-          <w:rFonts w:eastAsia="Times New Roman" w:cs="Times New Roman"/>
-          <w:i/>
-          <w:iCs/>
-        </w:rPr>
-        <w:t>(Citation) developed method x for application y and found that it had benefit z</w:t>
-      </w:r>
-      <w:r>
-        <w:rPr>
-          <w:rFonts w:eastAsia="Times New Roman" w:cs="Times New Roman"/>
-        </w:rPr>
-        <w:t xml:space="preserve">”. Then, you can reference this shown benefit when you introduce your own methods in the next section. </w:t>
-      </w:r>
-    </w:p>
-    <w:p>
-      <w:pPr>
-        <w:spacing w:before="20"/>
-        <w:rPr>
-          <w:rFonts w:eastAsia="Times New Roman" w:cs="Times New Roman"/>
-        </w:rPr>
-      </w:pPr>
-      <w:r>
-        <w:rPr>
-          <w:rFonts w:eastAsia="Times New Roman" w:cs="Times New Roman"/>
-        </w:rPr>
-        <w:t>The reader should be able to answer the following questions:</w:t>
-      </w:r>
-    </w:p>
-    <w:p>
-      <w:pPr>
-        <w:pStyle w:val="ListParagraph"/>
-        <w:numPr>
-          <w:ilvl w:val="0"/>
-          <w:numId w:val="5"/>
-        </w:numPr>
-        <w:spacing w:before="240" w:after="240"/>
-      </w:pPr>
-      <w:r>
-        <w:rPr>
-          <w:rFonts w:eastAsia="Times New Roman"/>
-        </w:rPr>
-        <w:t xml:space="preserve">What other methods/technologies exist that attempt to solve the same problem/answer the same question that your project will address? This can include academic research or commercial projects. </w:t>
-      </w:r>
-    </w:p>
-    <w:p>
-      <w:pPr>
-        <w:pStyle w:val="ListParagraph"/>
-        <w:numPr>
-          <w:ilvl w:val="0"/>
-          <w:numId w:val="5"/>
-        </w:numPr>
-        <w:spacing w:before="240" w:after="240"/>
-      </w:pPr>
-      <w:r>
-        <w:rPr>
-          <w:rFonts w:eastAsia="Times New Roman"/>
-        </w:rPr>
-        <w:t xml:space="preserve">How was your machine learning method/system developed and what are its benefits (especially those relevant to your project)? </w:t>
-      </w:r>
-    </w:p>
-    <w:p>
-      <w:pPr>
-        <w:pStyle w:val="ListParagraph"/>
-        <w:numPr>
-          <w:ilvl w:val="0"/>
-          <w:numId w:val="5"/>
-        </w:numPr>
-        <w:spacing w:before="240" w:after="240"/>
-      </w:pPr>
-      <w:r>
-        <w:rPr>
-          <w:rFonts w:eastAsia="Times New Roman"/>
-        </w:rPr>
-        <w:t xml:space="preserve">What existing work demonstrates that these method(s) are appropriate (or particularly well-suited) to use in your project? </w:t>
-      </w:r>
-    </w:p>
-    <w:p>
-      <w:pPr>
-        <w:pStyle w:val="ListParagraph"/>
-        <w:numPr>
-          <w:ilvl w:val="0"/>
-          <w:numId w:val="5"/>
-        </w:numPr>
-        <w:spacing w:before="240" w:after="240"/>
-        <w:rPr>
-          <w:rFonts w:eastAsia="Times New Roman"/>
-          <w:color w:val="000000"/>
-        </w:rPr>
-      </w:pPr>
-      <w:r>
-        <w:rPr>
-          <w:rFonts w:eastAsia="Times New Roman"/>
-        </w:rPr>
-        <w:t>What are some examples of similar projects that use the method(s) that you have chosen? Again, you can include either academic research or commercial projects.</w:t>
-      </w:r>
-    </w:p>
-    <w:p>
-      <w:pPr>
-        <w:pStyle w:val="Heading1"/>
-      </w:pPr>
-      <w:r>
-        <w:t>4 Methodology</w:t>
-      </w:r>
-    </w:p>
-    <w:p>
-      <w:pPr>
-        <w:rPr>
-          <w:rFonts w:eastAsia="Times New Roman" w:cs="Times New Roman"/>
-        </w:rPr>
-      </w:pPr>
-      <w:r>
-        <w:rPr>
-          <w:rFonts w:eastAsia="Times New Roman" w:cs="Times New Roman"/>
-        </w:rPr>
-        <w:t xml:space="preserve">This section of your final report should describe the final model architecture or pipeline choices </w:t>
-      </w:r>
-      <w:r>
-        <w:rPr>
-          <w:rFonts w:eastAsia="Times New Roman" w:cs="Times New Roman"/>
+          <w:rFonts w:cstheme="majorBidi"/>
         </w:rPr>
         <w:lastRenderedPageBreak/>
-        <w:t>that you have made, as well as the training and optimization procedures that you follow. Training results should be saved for the Results section of the paper—any discussion of modeling iterations and optimization should be brief, without any mention of the resulting performance. For example: “</w:t>
-      </w:r>
-      <w:r>
-        <w:rPr>
-          <w:rFonts w:eastAsia="Times New Roman" w:cs="Times New Roman"/>
-          <w:i/>
-          <w:iCs/>
-        </w:rPr>
-        <w:t>During model optimization, we explored hyperparameters a, b, and c with values [d,e,f], [g,h,i], and [j,k,l</w:t>
-      </w:r>
-      <w:r>
-        <w:rPr>
-          <w:rFonts w:eastAsia="Times New Roman" w:cs="Times New Roman"/>
-          <w:i/>
-          <w:iCs/>
-        </w:rPr>
-        <w:t>], respectively. Our final model architecture was...</w:t>
-      </w:r>
-      <w:r>
-        <w:rPr>
-          <w:rFonts w:eastAsia="Times New Roman" w:cs="Times New Roman"/>
-        </w:rPr>
-        <w:t xml:space="preserve">” If the comparative results over your hyperparameter search are interesting enough to be included, these should be discussed in the results section. </w:t>
-      </w:r>
-    </w:p>
-    <w:p>
-      <w:pPr>
-        <w:rPr>
-          <w:rFonts w:eastAsia="Times New Roman" w:cs="Times New Roman"/>
-        </w:rPr>
-      </w:pPr>
-      <w:r>
-        <w:rPr>
-          <w:rFonts w:eastAsia="Times New Roman" w:cs="Times New Roman"/>
-        </w:rPr>
-        <w:t xml:space="preserve">The reader should be able to answer the following questions after reading your methodology: </w:t>
-      </w:r>
-    </w:p>
-    <w:p>
-      <w:pPr>
-        <w:pStyle w:val="ListParagraph"/>
-        <w:numPr>
-          <w:ilvl w:val="0"/>
-          <w:numId w:val="6"/>
-        </w:numPr>
-        <w:spacing w:before="240" w:after="240"/>
-      </w:pPr>
-      <w:r>
-        <w:rPr>
-          <w:rFonts w:eastAsia="Times New Roman"/>
-        </w:rPr>
-        <w:t xml:space="preserve">What type of machine learning model(s) are you using? </w:t>
-      </w:r>
-    </w:p>
-    <w:p>
-      <w:pPr>
-        <w:pStyle w:val="ListParagraph"/>
-        <w:numPr>
-          <w:ilvl w:val="0"/>
-          <w:numId w:val="6"/>
-        </w:numPr>
-        <w:spacing w:before="240" w:after="240"/>
-      </w:pPr>
-      <w:r>
-        <w:rPr>
-          <w:rFonts w:eastAsia="Times New Roman"/>
-        </w:rPr>
-        <w:t xml:space="preserve">What are the notable architectural or system design choices that you have made and why? E.g., number of nodes, hidden layers, activation functions, etc. </w:t>
-      </w:r>
-    </w:p>
-    <w:p>
-      <w:pPr>
-        <w:pStyle w:val="ListParagraph"/>
-        <w:numPr>
-          <w:ilvl w:val="0"/>
-          <w:numId w:val="6"/>
-        </w:numPr>
-        <w:spacing w:before="240" w:after="240"/>
-      </w:pPr>
-      <w:r>
-        <w:rPr>
-          <w:rFonts w:eastAsia="Times New Roman"/>
-        </w:rPr>
-        <w:t xml:space="preserve">What is your model training procedure or machine learning pipeline? E.g., How did you split your data? How many epochs/iterations did you use during training? What was your batch size? What loss function/training metrics were used? </w:t>
-      </w:r>
-    </w:p>
-    <w:p>
-      <w:pPr>
-        <w:pStyle w:val="ListParagraph"/>
-        <w:numPr>
-          <w:ilvl w:val="0"/>
-          <w:numId w:val="6"/>
-        </w:numPr>
-        <w:spacing w:before="240" w:after="240"/>
-        <w:rPr>
-          <w:rFonts w:eastAsia="Times New Roman"/>
-          <w:color w:val="000000"/>
-        </w:rPr>
-      </w:pPr>
-      <w:r>
-        <w:rPr>
-          <w:rFonts w:eastAsia="Times New Roman"/>
-        </w:rPr>
-        <w:t>How did you optimize your model? E.g., Which hyperparameters and/or architectural elements did you adjust?</w:t>
+        <w:t>Hidden sizes of 32, 64, and 128 were evaluated for the recurrent models, along with variations in dropout rates and learning rates. For the TCN, the number of convolutional layers, dilation schedule, and attention‑head count were explored. Window caps were tuned to balance memory constraints with training diversity. These optimization experiments informed the final architecture selections described above; comparative performance outcomes are presented in the Results section.</w:t>
       </w:r>
     </w:p>
     <w:p>
@@ -951,16 +960,22 @@
       <w:pPr>
         <w:pStyle w:val="Heading1"/>
         <w:rPr>
-          <w:rFonts w:asciiTheme="majorBidi" w:hAnsiTheme="majorBidi"/>
-          <w:sz w:val="24"/>
-          <w:szCs w:val="24"/>
+          <w:rFonts w:cs="Linux Libertine"/>
         </w:rPr>
       </w:pPr>
       <w:r>
+        <w:rPr>
+          <w:rFonts w:cs="Linux Libertine"/>
+        </w:rPr>
         <w:t>6</w:t>
       </w:r>
       <w:r>
         <w:tab/>
+      </w:r>
+      <w:r>
+        <w:rPr>
+          <w:rFonts w:cs="Linux Libertine"/>
+        </w:rPr>
         <w:t>Conclusion</w:t>
       </w:r>
     </w:p>
@@ -975,7 +990,21 @@
         <w:rPr>
           <w:rFonts w:cstheme="majorBidi"/>
         </w:rPr>
-        <w:t>This section of your final report should provide a very brief summary of your entire project. It should highlight the most interesting or significant results and discuss any future work that you or another researcher might do. The reader should be able to answer the following questions:</w:t>
+        <w:t xml:space="preserve">This section of your final report should provide a very </w:t>
+      </w:r>
+      <w:proofErr w:type="gramStart"/>
+      <w:r>
+        <w:rPr>
+          <w:rFonts w:cstheme="majorBidi"/>
+        </w:rPr>
+        <w:t>brief summary</w:t>
+      </w:r>
+      <w:proofErr w:type="gramEnd"/>
+      <w:r>
+        <w:rPr>
+          <w:rFonts w:cstheme="majorBidi"/>
+        </w:rPr>
+        <w:t xml:space="preserve"> of your entire project. It should highlight the most interesting or significant results and discuss any future work that you or another researcher might do. The reader should be able to answer the following questions:</w:t>
       </w:r>
     </w:p>
     <w:p>
@@ -985,12 +1014,8 @@
           <w:ilvl w:val="0"/>
           <w:numId w:val="8"/>
         </w:numPr>
-        <w:spacing w:before="240" w:after="240" w:line="240" w:lineRule="auto"/>
-      </w:pPr>
-      <w:r>
-        <w:rPr>
-          <w:rFonts w:eastAsia="Times New Roman"/>
-        </w:rPr>
+      </w:pPr>
+      <w:r>
         <w:t>What was the main hypothesis or goal of the project, and how did your models perform in relation to this hypothesis/goal?</w:t>
       </w:r>
     </w:p>
@@ -1001,12 +1026,8 @@
           <w:ilvl w:val="0"/>
           <w:numId w:val="8"/>
         </w:numPr>
-        <w:spacing w:before="240" w:after="240" w:line="240" w:lineRule="auto"/>
-      </w:pPr>
-      <w:r>
-        <w:rPr>
-          <w:rFonts w:eastAsia="Times New Roman"/>
-        </w:rPr>
+      </w:pPr>
+      <w:r>
         <w:t>What was the most interesting or significant result of your project?</w:t>
       </w:r>
     </w:p>
@@ -1017,12 +1038,8 @@
           <w:ilvl w:val="0"/>
           <w:numId w:val="8"/>
         </w:numPr>
-        <w:spacing w:before="240" w:after="240" w:line="240" w:lineRule="auto"/>
-      </w:pPr>
-      <w:r>
-        <w:rPr>
-          <w:rFonts w:eastAsia="Times New Roman"/>
-        </w:rPr>
+      </w:pPr>
+      <w:r>
         <w:t>Did your model training or performance bring about any unexpected results?</w:t>
       </w:r>
     </w:p>
@@ -1033,32 +1050,16 @@
           <w:ilvl w:val="0"/>
           <w:numId w:val="8"/>
         </w:numPr>
-        <w:spacing w:before="240" w:after="240" w:line="240" w:lineRule="auto"/>
-        <w:rPr>
-          <w:rFonts w:eastAsia="Times New Roman"/>
-          <w:color w:val="000000"/>
-          <w:shd w:val="clear" w:color="auto" w:fill="CFE2F3"/>
-        </w:rPr>
-      </w:pPr>
-      <w:r>
-        <w:rPr>
-          <w:rFonts w:eastAsia="Times New Roman"/>
-        </w:rPr>
-        <w:t xml:space="preserve">If you were to continue this project, what would your next steps be? For example, would you continue to optimize your model or try other model architectures? </w:t>
-      </w:r>
-      <w:r>
-        <w:rPr>
-          <w:rFonts w:eastAsia="Times New Roman"/>
-        </w:rPr>
-        <w:lastRenderedPageBreak/>
-        <w:t>Would you change or expand the data used in your model? What steps need to be taken to “productionize” your model?</w:t>
+      </w:pPr>
+      <w:r>
+        <w:t>If you were to continue this project, what would your next steps be? For example, would you continue to optimize your model or try other model architectures? Would you change or expand the data used in your model? What steps need to be taken to “productionize” your model?</w:t>
       </w:r>
     </w:p>
     <w:p>
       <w:pPr>
         <w:pStyle w:val="Heading1"/>
         <w:rPr>
-          <w:highlight w:val="yellow"/>
+          <w:rFonts w:cs="Linux Libertine"/>
         </w:rPr>
       </w:pPr>
       <w:r>
@@ -1112,8 +1113,30 @@
         <w:rPr>
           <w:rFonts w:eastAsia="Times New Roman" w:cs="Times New Roman"/>
         </w:rPr>
-        <w:t>A formal report of this type should be primarily in paragraph form, with minimal subheadings, bullet points, or numbered lists. For most of your required report sections, no subheadings will be necessary, and the information can be presented as a single, cohesive discussion of the content relevant to that section. As a general rule of thumb, bulleted</w:t>
-      </w:r>
+        <w:t xml:space="preserve">A formal report of this type should be primarily in paragraph form, with minimal subheadings, bullet points, or numbered lists. For most of your required report sections, no subheadings will be necessary, and the information can be presented as a single, cohesive discussion of the content relevant to that section. </w:t>
+      </w:r>
+      <w:proofErr w:type="gramStart"/>
+      <w:r>
+        <w:rPr>
+          <w:rFonts w:eastAsia="Times New Roman" w:cs="Times New Roman"/>
+        </w:rPr>
+        <w:t>As a general rule</w:t>
+      </w:r>
+      <w:proofErr w:type="gramEnd"/>
+      <w:r>
+        <w:rPr>
+          <w:rFonts w:eastAsia="Times New Roman" w:cs="Times New Roman"/>
+        </w:rPr>
+        <w:t xml:space="preserve"> of thumb, </w:t>
+      </w:r>
+      <w:proofErr w:type="gramStart"/>
+      <w:r>
+        <w:rPr>
+          <w:rFonts w:eastAsia="Times New Roman" w:cs="Times New Roman"/>
+        </w:rPr>
+        <w:t>bulleted</w:t>
+      </w:r>
+      <w:proofErr w:type="gramEnd"/>
       <w:r>
         <w:rPr>
           <w:rFonts w:eastAsia="Times New Roman" w:cs="Times New Roman"/>
@@ -1123,7 +1146,19 @@
     </w:p>
     <w:p>
       <w:r>
-        <w:t>If you feel strongly that your content would benefit from subheadings or bulleted/numbered lists, they should follow the formatting examples used in this section.</w:t>
+        <w:t xml:space="preserve">If you feel strongly that your content would benefit from subheadings or </w:t>
+      </w:r>
+      <w:proofErr w:type="gramStart"/>
+      <w:r>
+        <w:t>bulleted</w:t>
+      </w:r>
+      <w:proofErr w:type="gramEnd"/>
+      <w:r>
+        <w:t xml:space="preserve">/numbered lists, they </w:t>
+      </w:r>
+      <w:r>
+        <w:lastRenderedPageBreak/>
+        <w:t>should follow the formatting examples used in this section.</w:t>
       </w:r>
     </w:p>
     <w:p>
@@ -1164,7 +1199,21 @@
         <w:rPr>
           <w:rFonts w:eastAsia="Times New Roman"/>
         </w:rPr>
-        <w:t>The first time that you mention a specific code library or dataset,</w:t>
+        <w:t xml:space="preserve">The first time that you mention a specific </w:t>
+      </w:r>
+      <w:proofErr w:type="gramStart"/>
+      <w:r>
+        <w:rPr>
+          <w:rFonts w:eastAsia="Times New Roman"/>
+        </w:rPr>
+        <w:t>code library</w:t>
+      </w:r>
+      <w:proofErr w:type="gramEnd"/>
+      <w:r>
+        <w:rPr>
+          <w:rFonts w:eastAsia="Times New Roman"/>
+        </w:rPr>
+        <w:t xml:space="preserve"> or dataset,</w:t>
       </w:r>
     </w:p>
     <w:p>
@@ -1234,7 +1283,13 @@
         <w:t>Parenthetical citations at the end of a sentence</w:t>
       </w:r>
       <w:r>
-        <w:t xml:space="preserve"> should be used when the information from the entire sentence comes from the cited source (American Psychological Association, 2025).</w:t>
+        <w:t xml:space="preserve"> should be used when the information from the entire sentence comes from the cited source (American Psychological Association, </w:t>
+      </w:r>
+      <w:r>
+        <w:t>2024</w:t>
+      </w:r>
+      <w:r>
+        <w:t>).</w:t>
       </w:r>
     </w:p>
     <w:p>
@@ -1258,7 +1313,10 @@
         </w:numPr>
       </w:pPr>
       <w:r>
-        <w:t>The transformer model was introduced in 2017 for the application of machine translation (Vaswani et al., 2017) and quickly became the most common backbone for today’s large language models (Devlin et al., 2019; Radford et al., 2019).</w:t>
+        <w:t xml:space="preserve">The transformer model was introduced in 2017 for the application of machine translation (Vaswani et al., 2017) and quickly became the most common backbone for today’s large language </w:t>
+      </w:r>
+      <w:r>
+        <w:t>models (Devlin et al., 2019; Radford et al., 2019).</w:t>
       </w:r>
     </w:p>
     <w:p>
@@ -1317,7 +1375,6 @@
     </w:p>
     <w:p>
       <w:r>
-        <w:lastRenderedPageBreak/>
         <w:t>Most of your supporting content should be included in the main text of the report, rather than at the end. While the in-line formatting can be a headache, this makes it easier for your reader to reference your figures and tables while reading, without having to scroll back and forth too much. See Section 7.5 for more details about how to properly use appendices for supplemental information.</w:t>
       </w:r>
     </w:p>
@@ -1361,6 +1418,7 @@
         <w:rPr>
           <w:noProof/>
         </w:rPr>
+        <w:lastRenderedPageBreak/>
         <w:drawing>
           <wp:inline distT="0" distB="0" distL="0" distR="0" wp14:anchorId="09E97ADB" wp14:editId="5D1ACF3E">
             <wp:extent cx="3048000" cy="1781175"/>
@@ -1430,10 +1488,19 @@
     </w:p>
     <w:p>
       <w:r>
-        <w:t>Feel free to improve the default MS Word table formatting shown here for aesthetic appeal (e.g. change cell size, border width, font size, etc.). If you have a favorite table formatting tool (e.g. LaTeX, Pandas pretty print, etc.), feel free to use that and include the output as an image. However, please ensure that the image quality is legible and the formatting generally matches the rest of the report, and DO NOT include screenshots of raw code output—it is not professional to include dark mode or Courier</w:t>
-      </w:r>
-      <w:r>
-        <w:t xml:space="preserve"> New code output, or screenshots of your console window.</w:t>
+        <w:t>Feel free to improve the default MS Word table formatting shown here for aesthetic appeal (e.g. change cell size, border width, font size, etc.). If you have a favorite table formatting tool (e.g. LaTeX, Pandas pretty print, etc.), feel free to use that and include the output as an image. However, please ensure that the image quality is legible and the formatting generally matches the rest of the report</w:t>
+      </w:r>
+      <w:r>
+        <w:t xml:space="preserve">. Do not </w:t>
+      </w:r>
+      <w:r>
+        <w:t>include screenshots of raw code output</w:t>
+      </w:r>
+      <w:r>
+        <w:t xml:space="preserve">; </w:t>
+      </w:r>
+      <w:r>
+        <w:t>it is not professional to include dark mode or Courier New code output, or screenshots of your console window.</w:t>
       </w:r>
     </w:p>
     <w:p>
@@ -1620,10 +1687,18 @@
     <w:p/>
     <w:p>
       <w:r>
-        <w:t>A table is often a better alternative to a bulleted</w:t>
-      </w:r>
-      <w:r>
-        <w:t xml:space="preserve"> list for communicating information that may otherwise seem redundant (e.g. variable details or model hyperparameter choices), or to make information easier to compare across categories (e.g. model performance). If you have a very complex table, think about how you might use bold or italic font to highlight notable cells, such as the best performing model.</w:t>
+        <w:t xml:space="preserve">A table is often a better alternative to a </w:t>
+      </w:r>
+      <w:proofErr w:type="gramStart"/>
+      <w:r>
+        <w:t>bulleted</w:t>
+      </w:r>
+      <w:proofErr w:type="gramEnd"/>
+      <w:r>
+        <w:t xml:space="preserve"> list for communicating information that may </w:t>
+      </w:r>
+      <w:r>
+        <w:t>otherwise seem redundant (e.g. variable details or model hyperparameter choices), or to make information easier to compare across categories (e.g. model performance). If you have a very complex table, think about how you might use bold or italic font to highlight notable cells, such as the best performing model.</w:t>
       </w:r>
     </w:p>
     <w:p>
@@ -1640,16 +1715,26 @@
     </w:p>
     <w:p>
       <w:r>
-        <w:t>Think carefully about whether including an equation is appropriate for your semi-technical stakeholder audience—most of the time that level of detail will be too technical, and equations should either be left out or included in a separate appendix.</w:t>
-      </w:r>
-    </w:p>
-    <w:p>
-      <w:r>
-        <w:t xml:space="preserve">If you decide that you do want to include an equation, they should be on a separate line, indented, and numbered sequentially to the right </w:t>
-      </w:r>
-      <w:r>
-        <w:lastRenderedPageBreak/>
-        <w:t xml:space="preserve">of the equation. As with figures and tables, equations should be referenced directly in your text with a short description (e.g. “Equation 7.1 shows the basic linear regression equation, where </w:t>
+        <w:t>Think carefully about whether including an equation is appropriate for your semi-technical stakeholder audience</w:t>
+      </w:r>
+      <w:r>
+        <w:t>. Most</w:t>
+      </w:r>
+      <w:r>
+        <w:t xml:space="preserve"> of the time that level of detail will be too technical, and equations should either be left out or included in a separate appendix.</w:t>
+      </w:r>
+    </w:p>
+    <w:p>
+      <w:r>
+        <w:t xml:space="preserve">If you decide that you do want to include an equation, they should be on a separate line, </w:t>
+      </w:r>
+      <w:proofErr w:type="gramStart"/>
+      <w:r>
+        <w:t>indented</w:t>
+      </w:r>
+      <w:proofErr w:type="gramEnd"/>
+      <w:r>
+        <w:t xml:space="preserve">, and numbered sequentially to the right of the equation. As with figures and tables, equations should be referenced directly in your text with a short description (e.g. “Equation 7.1 shows the basic linear regression equation, where </w:t>
       </w:r>
       <w:r>
         <w:rPr>
@@ -1679,7 +1764,15 @@
         <w:t>a</w:t>
       </w:r>
       <w:r>
-        <w:t xml:space="preserve"> is the learned coefficent, and </w:t>
+        <w:t xml:space="preserve"> is the learned </w:t>
+      </w:r>
+      <w:proofErr w:type="spellStart"/>
+      <w:r>
+        <w:t>coefficent</w:t>
+      </w:r>
+      <w:proofErr w:type="spellEnd"/>
+      <w:r>
+        <w:t xml:space="preserve">, and </w:t>
       </w:r>
       <w:r>
         <w:rPr>
@@ -1689,7 +1782,15 @@
         <w:t>b</w:t>
       </w:r>
       <w:r>
-        <w:t xml:space="preserve"> is the model intercept.”) You DO NOT need to include a separate caption for your equations. </w:t>
+        <w:t xml:space="preserve"> is the model intercept.”) You DO NOT need to include </w:t>
+      </w:r>
+      <w:proofErr w:type="gramStart"/>
+      <w:r>
+        <w:t>a separate caption</w:t>
+      </w:r>
+      <w:proofErr w:type="gramEnd"/>
+      <w:r>
+        <w:t xml:space="preserve"> for your equations. </w:t>
       </w:r>
     </w:p>
     <w:p>
@@ -1704,31 +1805,7 @@
           <w:rPr>
             <w:rFonts w:ascii="Cambria Math" w:hAnsi="Cambria Math"/>
           </w:rPr>
-          <m:t>y</m:t>
-        </m:r>
-        <m:r>
-          <w:rPr>
-            <w:rFonts w:ascii="Cambria Math" w:hAnsi="Cambria Math"/>
-          </w:rPr>
-          <m:t>=</m:t>
-        </m:r>
-        <m:r>
-          <w:rPr>
-            <w:rFonts w:ascii="Cambria Math" w:hAnsi="Cambria Math"/>
-          </w:rPr>
-          <m:t>ax</m:t>
-        </m:r>
-        <m:r>
-          <w:rPr>
-            <w:rFonts w:ascii="Cambria Math" w:hAnsi="Cambria Math"/>
-          </w:rPr>
-          <m:t>+</m:t>
-        </m:r>
-        <m:r>
-          <w:rPr>
-            <w:rFonts w:ascii="Cambria Math" w:hAnsi="Cambria Math"/>
-          </w:rPr>
-          <m:t>b</m:t>
+          <m:t>y=ax+b</m:t>
         </m:r>
       </m:oMath>
       <w:r>
@@ -1744,7 +1821,15 @@
     </w:p>
     <w:p>
       <w:r>
-        <w:t>As with tables, if you have a favorite tool for formatting your equations, feel free to include the formatted equation as an image, as long as it matches the formatting shown in the example above.</w:t>
+        <w:t xml:space="preserve">As with tables, if you have a favorite tool for formatting your equations, feel free to include the formatted equation as an image, </w:t>
+      </w:r>
+      <w:proofErr w:type="gramStart"/>
+      <w:r>
+        <w:t>as long as</w:t>
+      </w:r>
+      <w:proofErr w:type="gramEnd"/>
+      <w:r>
+        <w:t xml:space="preserve"> it matches the formatting shown in the example above.</w:t>
       </w:r>
     </w:p>
     <w:p>
@@ -1772,10 +1857,13 @@
         </w:r>
       </w:hyperlink>
       <w:r>
-        <w:t xml:space="preserve"> on how to format citations from different types of sources. There are also online tools that can be used to create citations for you, though these will occasionally produce errors, so be sure to double check these. If you are citing an academic paper, the Google Scholar listing for the paper will also have a properly formatted APA citation that you can copy into your report. Several example citations are shown in the works cited included in this template.</w:t>
-      </w:r>
-    </w:p>
-    <w:p/>
+        <w:t xml:space="preserve"> on how to format citations from different types of sources. There are also online tools that can be used to create citations for you, though these will occasionally produce errors, so be sure to double check these. If you are citing an </w:t>
+      </w:r>
+      <w:r>
+        <w:lastRenderedPageBreak/>
+        <w:t>academic paper, the Google Scholar listing for the paper will also have a properly formatted APA citation that you can copy into your report. Several example citations are shown in the works cited included in this template.</w:t>
+      </w:r>
+    </w:p>
     <w:p>
       <w:pPr>
         <w:pStyle w:val="Heading2"/>
@@ -1790,10 +1878,7 @@
     </w:p>
     <w:p>
       <w:r>
-        <w:t xml:space="preserve">Appendices can be used to include information that you feel is important to the communication of your project but may be too technical or too detailed for the intended semi-technical stakeholder audience. This may include items like a detailed description of data transformations, feature engineering, or architectural choices, or complete results over a </w:t>
-      </w:r>
-      <w:r>
-        <w:t>hyperparameter grid search or a series of experimental architectures.</w:t>
+        <w:t>Appendices can be used to include information that you feel is important to the communication of your project but may be too technical or too detailed for the intended semi-technical stakeholder audience. This may include items like a detailed description of data transformations, feature engineering, or architectural choices, or complete results over a hyperparameter grid search or a series of experimental architectures.</w:t>
       </w:r>
     </w:p>
     <w:p>
@@ -1830,12 +1915,18 @@
         <w:rPr>
           <w:rFonts w:eastAsia="Linux Libertine" w:cstheme="majorBidi"/>
         </w:rPr>
-        <w:t>These are optional, but might mention any external contributors to your project, such as professors or mentors who provided data or consultation.</w:t>
-      </w:r>
-    </w:p>
-    <w:p>
-      <w:pPr>
-        <w:spacing w:before="200" w:after="40" w:line="240" w:lineRule="auto"/>
+        <w:t xml:space="preserve">These are optional, but might mention any external contributors to your project, such as </w:t>
+      </w:r>
+      <w:r>
+        <w:rPr>
+          <w:rFonts w:eastAsia="Linux Libertine" w:cstheme="majorBidi"/>
+        </w:rPr>
+        <w:t>professors or mentors who provided data or consultation.</w:t>
+      </w:r>
+    </w:p>
+    <w:p>
+      <w:pPr>
+        <w:spacing w:before="200" w:after="60"/>
         <w:jc w:val="left"/>
       </w:pPr>
       <w:r>
@@ -1847,46 +1938,27 @@
     </w:p>
     <w:p>
       <w:pPr>
-        <w:spacing w:before="200" w:after="40" w:line="240" w:lineRule="auto"/>
+        <w:spacing w:before="60" w:after="60"/>
         <w:ind w:left="300" w:hanging="300"/>
+        <w:jc w:val="left"/>
+      </w:pPr>
+      <w:r>
+        <w:t xml:space="preserve">American Psychological Association. (2024, June). </w:t>
+      </w:r>
+      <w:r>
         <w:rPr>
-          <w:rFonts w:eastAsia="Linux Libertine" w:cstheme="majorBidi"/>
-        </w:rPr>
-      </w:pPr>
-      <w:r>
-        <w:rPr>
-          <w:rFonts w:eastAsia="Linux Libertine" w:cstheme="majorBidi"/>
-        </w:rPr>
-        <w:t xml:space="preserve">American Psychological Association. (2025). </w:t>
-      </w:r>
-      <w:r>
-        <w:rPr>
-          <w:rFonts w:eastAsia="Linux Libertine" w:cstheme="majorBidi"/>
           <w:i/>
           <w:iCs/>
         </w:rPr>
-        <w:t>In</w:t>
-      </w:r>
-      <w:r>
-        <w:rPr>
-          <w:rFonts w:eastAsia="Linux Libertine" w:cstheme="majorBidi"/>
-          <w:i/>
-          <w:iCs/>
-        </w:rPr>
-        <w:noBreakHyphen/>
-        <w:t>text citations.</w:t>
-      </w:r>
-      <w:r>
-        <w:rPr>
-          <w:rFonts w:eastAsia="Linux Libertine" w:cstheme="majorBidi"/>
-        </w:rPr>
-        <w:t xml:space="preserve"> </w:t>
+        <w:t>In-text citations</w:t>
+      </w:r>
+      <w:r>
+        <w:t xml:space="preserve">. </w:t>
       </w:r>
       <w:hyperlink r:id="rId18" w:history="1">
         <w:r>
           <w:rPr>
             <w:rStyle w:val="Hyperlink"/>
-            <w:rFonts w:eastAsia="Linux Libertine" w:cstheme="majorBidi"/>
           </w:rPr>
           <w:t>https://apastyle.apa.org/style-grammar-guidelines/citations</w:t>
         </w:r>
@@ -1894,90 +1966,260 @@
     </w:p>
     <w:p>
       <w:pPr>
-        <w:spacing w:before="200" w:after="40" w:line="240" w:lineRule="auto"/>
+        <w:spacing w:before="60" w:after="60"/>
         <w:ind w:left="300" w:hanging="300"/>
+        <w:jc w:val="left"/>
+      </w:pPr>
+      <w:r>
+        <w:t xml:space="preserve">Bai, S., Kolter, J. Z., &amp; Koltun, V. (2018). An empirical evaluation of generic convolutional and recurrent networks for sequence modeling. </w:t>
+      </w:r>
+      <w:proofErr w:type="spellStart"/>
+      <w:r>
         <w:rPr>
-          <w:rFonts w:eastAsia="Linux Libertine" w:cstheme="majorBidi"/>
-        </w:rPr>
-      </w:pPr>
-      <w:r>
-        <w:rPr>
-          <w:rFonts w:eastAsia="Linux Libertine" w:cstheme="majorBidi"/>
-        </w:rPr>
-        <w:t>Devlin, J., Chang, M.</w:t>
-      </w:r>
-      <w:r>
-        <w:rPr>
-          <w:rFonts w:eastAsia="Linux Libertine" w:cstheme="majorBidi"/>
-        </w:rPr>
-        <w:noBreakHyphen/>
-        <w:t>W., Lee, K., &amp; Toutanova, K. (2019). BERT: Pre</w:t>
-      </w:r>
-      <w:r>
-        <w:rPr>
-          <w:rFonts w:eastAsia="Linux Libertine" w:cstheme="majorBidi"/>
-        </w:rPr>
-        <w:noBreakHyphen/>
-        <w:t xml:space="preserve">training of deep bidirectional transformers for language understanding. </w:t>
-      </w:r>
-      <w:r>
-        <w:rPr>
-          <w:rFonts w:eastAsia="Linux Libertine" w:cstheme="majorBidi"/>
           <w:i/>
           <w:iCs/>
         </w:rPr>
-        <w:t>Proceedings of NAACL</w:t>
-      </w:r>
-      <w:r>
-        <w:rPr>
-          <w:rFonts w:eastAsia="Linux Libertine" w:cstheme="majorBidi"/>
-          <w:i/>
-          <w:iCs/>
-        </w:rPr>
-        <w:noBreakHyphen/>
-        <w:t>HLT</w:t>
-      </w:r>
-      <w:r>
-        <w:rPr>
-          <w:rFonts w:eastAsia="Linux Libertine" w:cstheme="majorBidi"/>
-        </w:rPr>
-        <w:t>, 4171–4186. https://doi.org/10.18653/v1/N19-1423</w:t>
-      </w:r>
-    </w:p>
-    <w:p>
-      <w:pPr>
-        <w:spacing w:before="200" w:after="40" w:line="240" w:lineRule="auto"/>
-        <w:ind w:left="300" w:hanging="300"/>
-        <w:rPr>
-          <w:rFonts w:eastAsia="Linux Libertine" w:cstheme="majorBidi"/>
-        </w:rPr>
-      </w:pPr>
-      <w:r>
-        <w:rPr>
-          <w:rFonts w:eastAsia="Linux Libertine" w:cstheme="majorBidi"/>
-        </w:rPr>
-        <w:lastRenderedPageBreak/>
-        <w:t xml:space="preserve">Microsoft Research Asia. (2012). </w:t>
-      </w:r>
-      <w:r>
-        <w:rPr>
-          <w:rFonts w:eastAsia="Linux Libertine" w:cstheme="majorBidi"/>
-          <w:i/>
-          <w:iCs/>
-        </w:rPr>
-        <w:t>GeoLife GPS Trajectory Dataset (Version 1.3).</w:t>
-      </w:r>
-      <w:r>
-        <w:rPr>
-          <w:rFonts w:eastAsia="Linux Libertine" w:cstheme="majorBidi"/>
-        </w:rPr>
-        <w:t xml:space="preserve"> </w:t>
+        <w:t>arXiv</w:t>
+      </w:r>
+      <w:proofErr w:type="spellEnd"/>
+      <w:r>
+        <w:t xml:space="preserve">. </w:t>
       </w:r>
       <w:hyperlink r:id="rId19" w:history="1">
         <w:r>
           <w:rPr>
             <w:rStyle w:val="Hyperlink"/>
-            <w:rFonts w:eastAsia="Linux Libertine" w:cstheme="majorBidi"/>
+          </w:rPr>
+          <w:t>https://doi.org/10.48550/arXiv.1803.01271</w:t>
+        </w:r>
+      </w:hyperlink>
+    </w:p>
+    <w:p>
+      <w:pPr>
+        <w:spacing w:before="60" w:after="60"/>
+        <w:ind w:left="300" w:hanging="300"/>
+        <w:jc w:val="left"/>
+      </w:pPr>
+      <w:r>
+        <w:t xml:space="preserve">Cho, K., van </w:t>
+      </w:r>
+      <w:proofErr w:type="spellStart"/>
+      <w:r>
+        <w:t>Merriënboer</w:t>
+      </w:r>
+      <w:proofErr w:type="spellEnd"/>
+      <w:r>
+        <w:t xml:space="preserve">, B., </w:t>
+      </w:r>
+      <w:proofErr w:type="spellStart"/>
+      <w:r>
+        <w:t>Gulcehre</w:t>
+      </w:r>
+      <w:proofErr w:type="spellEnd"/>
+      <w:r>
+        <w:t xml:space="preserve">, C., </w:t>
+      </w:r>
+      <w:proofErr w:type="spellStart"/>
+      <w:r>
+        <w:t>Bahdanau</w:t>
+      </w:r>
+      <w:proofErr w:type="spellEnd"/>
+      <w:r>
+        <w:t xml:space="preserve">, D., </w:t>
+      </w:r>
+      <w:proofErr w:type="spellStart"/>
+      <w:r>
+        <w:t>Bougares</w:t>
+      </w:r>
+      <w:proofErr w:type="spellEnd"/>
+      <w:r>
+        <w:t xml:space="preserve">, F., Schwenk, H., &amp; Bengio, Y. (2014). Learning phrase representations using RNN encoder–decoder for statistical machine translation. </w:t>
+      </w:r>
+      <w:proofErr w:type="spellStart"/>
+      <w:r>
+        <w:rPr>
+          <w:i/>
+          <w:iCs/>
+        </w:rPr>
+        <w:t>arXiv</w:t>
+      </w:r>
+      <w:proofErr w:type="spellEnd"/>
+      <w:r>
+        <w:t xml:space="preserve">. </w:t>
+      </w:r>
+      <w:hyperlink r:id="rId20" w:history="1">
+        <w:r>
+          <w:rPr>
+            <w:rStyle w:val="Hyperlink"/>
+          </w:rPr>
+          <w:t>https://doi.org/10.48550/arXiv.1406.1078</w:t>
+        </w:r>
+      </w:hyperlink>
+    </w:p>
+    <w:p>
+      <w:pPr>
+        <w:spacing w:before="60" w:after="60"/>
+        <w:ind w:left="300" w:hanging="300"/>
+        <w:jc w:val="left"/>
+      </w:pPr>
+      <w:r>
+        <w:t>Devlin, J., Chang, M.-W., Lee, K., &amp; Toutanova, K. (2019). BERT: Pre-</w:t>
+      </w:r>
+      <w:proofErr w:type="gramStart"/>
+      <w:r>
+        <w:t>training of</w:t>
+      </w:r>
+      <w:proofErr w:type="gramEnd"/>
+      <w:r>
+        <w:t xml:space="preserve"> deep bidirectional transformers for language understanding. In </w:t>
+      </w:r>
+      <w:r>
+        <w:rPr>
+          <w:i/>
+          <w:iCs/>
+        </w:rPr>
+        <w:t>Proceedings of NAACL-HLT 2019</w:t>
+      </w:r>
+      <w:r>
+        <w:t xml:space="preserve"> (pp. 4171–4186). </w:t>
+      </w:r>
+      <w:hyperlink r:id="rId21" w:history="1">
+        <w:r>
+          <w:rPr>
+            <w:rStyle w:val="Hyperlink"/>
+          </w:rPr>
+          <w:t>https://doi.org/10.18653/v1/N19-1423</w:t>
+        </w:r>
+      </w:hyperlink>
+    </w:p>
+    <w:p>
+      <w:pPr>
+        <w:spacing w:before="60" w:after="60"/>
+        <w:ind w:left="300" w:hanging="300"/>
+        <w:jc w:val="left"/>
+        <w:rPr>
+          <w:kern w:val="2"/>
+          <w14:ligatures w14:val="standardContextual"/>
+        </w:rPr>
+      </w:pPr>
+      <w:r>
+        <w:t xml:space="preserve">Derrow-Pinion, A., She, J., Wong, D., Lange, O., Hester, T., Perez, L., </w:t>
+      </w:r>
+      <w:proofErr w:type="spellStart"/>
+      <w:r>
+        <w:t>Nunkesser</w:t>
+      </w:r>
+      <w:proofErr w:type="spellEnd"/>
+      <w:r>
+        <w:t xml:space="preserve">, M., Lee, S., Guo, X., Wiltshire, B., Battaglia, P. W., Gupta, V., Li, A., Xu, Z., Sanchez-Gonzalez, A., Li, Y., &amp; </w:t>
+      </w:r>
+      <w:proofErr w:type="spellStart"/>
+      <w:r>
+        <w:t>Veličković</w:t>
+      </w:r>
+      <w:proofErr w:type="spellEnd"/>
+      <w:r>
+        <w:t xml:space="preserve">, P. (2021). ETA prediction with graph neural networks in Google Maps. In </w:t>
+      </w:r>
+      <w:r>
+        <w:rPr>
+          <w:i/>
+          <w:iCs/>
+        </w:rPr>
+        <w:t>Proceedings of the 30th ACM International Conference on Information and Knowledge Management</w:t>
+      </w:r>
+      <w:r>
+        <w:t xml:space="preserve"> (pp. 3767–3776). https://doi.org/10.1145/3459637.3481916</w:t>
+      </w:r>
+    </w:p>
+    <w:p>
+      <w:pPr>
+        <w:spacing w:before="60" w:after="60"/>
+        <w:ind w:left="300" w:hanging="300"/>
+        <w:jc w:val="left"/>
+      </w:pPr>
+      <w:r>
+        <w:t xml:space="preserve">Hochreiter, S., &amp; </w:t>
+      </w:r>
+      <w:proofErr w:type="spellStart"/>
+      <w:r>
+        <w:t>Schmidhuber</w:t>
+      </w:r>
+      <w:proofErr w:type="spellEnd"/>
+      <w:r>
+        <w:t xml:space="preserve">, J. (1997). Long short-term memory. </w:t>
+      </w:r>
+      <w:r>
+        <w:rPr>
+          <w:i/>
+          <w:iCs/>
+        </w:rPr>
+        <w:t>Neural Computation, 9</w:t>
+      </w:r>
+      <w:r>
+        <w:t xml:space="preserve">(8), 1735–1780. </w:t>
+      </w:r>
+      <w:hyperlink r:id="rId22" w:history="1">
+        <w:r>
+          <w:rPr>
+            <w:rStyle w:val="Hyperlink"/>
+          </w:rPr>
+          <w:t>https://doi.org/10.1162/neco.1997.9.8.1735</w:t>
+        </w:r>
+      </w:hyperlink>
+    </w:p>
+    <w:p>
+      <w:pPr>
+        <w:spacing w:before="60" w:after="60"/>
+        <w:ind w:left="300" w:hanging="300"/>
+        <w:jc w:val="left"/>
+      </w:pPr>
+      <w:r>
+        <w:lastRenderedPageBreak/>
+        <w:t xml:space="preserve">Kingma, D. P., &amp; Ba, J. (2015). Adam: A method for stochastic optimization. </w:t>
+      </w:r>
+      <w:r>
+        <w:rPr>
+          <w:i/>
+          <w:iCs/>
+        </w:rPr>
+        <w:t>International Conference on Learning Representations (ICLR)</w:t>
+      </w:r>
+      <w:r>
+        <w:t xml:space="preserve">. </w:t>
+      </w:r>
+      <w:hyperlink r:id="rId23" w:history="1">
+        <w:r>
+          <w:rPr>
+            <w:rStyle w:val="Hyperlink"/>
+          </w:rPr>
+          <w:t>https://doi.org/10.48550/arXiv.1412.6980</w:t>
+        </w:r>
+      </w:hyperlink>
+    </w:p>
+    <w:p>
+      <w:pPr>
+        <w:spacing w:before="60" w:after="60"/>
+        <w:ind w:left="300" w:hanging="300"/>
+        <w:jc w:val="left"/>
+      </w:pPr>
+      <w:r>
+        <w:t xml:space="preserve">Microsoft Research Asia. (2012). </w:t>
+      </w:r>
+      <w:r>
+        <w:rPr>
+          <w:i/>
+          <w:iCs/>
+        </w:rPr>
+        <w:t>GeoLife GPS trajectories</w:t>
+      </w:r>
+      <w:r>
+        <w:t xml:space="preserve"> (Version 1.3) [Data set]. Microsoft. </w:t>
+      </w:r>
+      <w:hyperlink r:id="rId24" w:history="1">
+        <w:r>
+          <w:rPr>
+            <w:rStyle w:val="Hyperlink"/>
           </w:rPr>
           <w:t>https://www.microsoft.com/en-us/research/project/geolife-building-social-networks-using-human-location-history/</w:t>
         </w:r>
@@ -1985,203 +2227,211 @@
     </w:p>
     <w:p>
       <w:pPr>
-        <w:spacing w:before="200" w:after="40" w:line="240" w:lineRule="auto"/>
+        <w:spacing w:before="60" w:after="60"/>
         <w:ind w:left="300" w:hanging="300"/>
+        <w:jc w:val="left"/>
+      </w:pPr>
+      <w:r>
+        <w:t xml:space="preserve">Radford, A., Wu, J., Child, R., Luan, D., Amodei, D., &amp; </w:t>
+      </w:r>
+      <w:proofErr w:type="spellStart"/>
+      <w:r>
+        <w:t>Sutskever</w:t>
+      </w:r>
+      <w:proofErr w:type="spellEnd"/>
+      <w:r>
+        <w:t xml:space="preserve">, D. (2019). </w:t>
+      </w:r>
+      <w:r>
         <w:rPr>
-          <w:rFonts w:eastAsia="Linux Libertine" w:cstheme="majorBidi"/>
-        </w:rPr>
-      </w:pPr>
-      <w:r>
-        <w:rPr>
-          <w:rFonts w:eastAsia="Linux Libertine" w:cstheme="majorBidi"/>
-        </w:rPr>
-        <w:t xml:space="preserve">Radford, A., Wu, J., Child, R., Luan, D., Amodei, D., &amp; Sutskever, I. (2019). Language models are unsupervised multitask learners. </w:t>
-      </w:r>
-      <w:r>
-        <w:rPr>
-          <w:rFonts w:eastAsia="Linux Libertine" w:cstheme="majorBidi"/>
           <w:i/>
           <w:iCs/>
         </w:rPr>
-        <w:t>OpenAI Blog</w:t>
-      </w:r>
+        <w:t>Language models are unsupervised multitask learners</w:t>
+      </w:r>
+      <w:r>
+        <w:t xml:space="preserve">. OpenAI. </w:t>
+      </w:r>
+      <w:hyperlink r:id="rId25" w:history="1">
+        <w:r>
+          <w:rPr>
+            <w:rStyle w:val="Hyperlink"/>
+          </w:rPr>
+          <w:t>https://cdn.openai.com/better-language-models/language_models_are_unsupervised_multitask_learners.pdf</w:t>
+        </w:r>
+      </w:hyperlink>
+    </w:p>
+    <w:p>
+      <w:pPr>
+        <w:spacing w:before="60" w:after="60"/>
+        <w:ind w:left="300" w:hanging="300"/>
+        <w:jc w:val="left"/>
+      </w:pPr>
+      <w:r>
+        <w:t xml:space="preserve">Sola, J. (2017). Quaternion kinematics for the error-state Kalman filter. </w:t>
+      </w:r>
+      <w:proofErr w:type="spellStart"/>
       <w:r>
         <w:rPr>
-          <w:rFonts w:eastAsia="Linux Libertine" w:cstheme="majorBidi"/>
-        </w:rPr>
-        <w:t>, 1(8), 9.</w:t>
-      </w:r>
-    </w:p>
-    <w:p>
-      <w:pPr>
-        <w:spacing w:before="200" w:after="40" w:line="240" w:lineRule="auto"/>
-        <w:ind w:left="300" w:hanging="300"/>
-        <w:rPr>
-          <w:rFonts w:eastAsia="Linux Libertine" w:cstheme="majorBidi"/>
-        </w:rPr>
-      </w:pPr>
-      <w:r>
-        <w:rPr>
-          <w:rFonts w:eastAsia="Linux Libertine" w:cstheme="majorBidi"/>
-        </w:rPr>
-        <w:t>Sola, J. (2017). Quaternion kinematics for the error</w:t>
-      </w:r>
-      <w:r>
-        <w:rPr>
-          <w:rFonts w:eastAsia="Linux Libertine" w:cstheme="majorBidi"/>
-        </w:rPr>
-        <w:noBreakHyphen/>
-        <w:t xml:space="preserve">state Kalman filter. </w:t>
-      </w:r>
-      <w:r>
-        <w:rPr>
-          <w:rFonts w:eastAsia="Linux Libertine" w:cstheme="majorBidi"/>
           <w:i/>
           <w:iCs/>
         </w:rPr>
-        <w:t>arXiv preprint arXiv:1711.02508.</w:t>
+        <w:t>arXiv</w:t>
+      </w:r>
+      <w:proofErr w:type="spellEnd"/>
+      <w:r>
+        <w:t xml:space="preserve">. </w:t>
+      </w:r>
+      <w:hyperlink r:id="rId26" w:history="1">
+        <w:r>
+          <w:rPr>
+            <w:rStyle w:val="Hyperlink"/>
+          </w:rPr>
+          <w:t>https://doi.org/10.48550/arXiv.1711.02508</w:t>
+        </w:r>
+      </w:hyperlink>
+    </w:p>
+    <w:p>
+      <w:pPr>
+        <w:spacing w:before="60" w:after="60"/>
+        <w:ind w:left="300" w:hanging="300"/>
+        <w:jc w:val="left"/>
+      </w:pPr>
+      <w:r>
+        <w:t xml:space="preserve">Teunissen, P. J., &amp; </w:t>
+      </w:r>
+      <w:proofErr w:type="spellStart"/>
+      <w:r>
+        <w:t>Montenbruck</w:t>
+      </w:r>
+      <w:proofErr w:type="spellEnd"/>
+      <w:r>
+        <w:t xml:space="preserve">, O. (Eds.). (2017). </w:t>
       </w:r>
       <w:r>
         <w:rPr>
-          <w:rFonts w:eastAsia="Linux Libertine" w:cstheme="majorBidi"/>
-        </w:rPr>
-        <w:t xml:space="preserve"> https://doi.org/10.48550/arXiv.1711.02508 </w:t>
-      </w:r>
-    </w:p>
-    <w:p>
-      <w:pPr>
-        <w:spacing w:before="200" w:after="40" w:line="240" w:lineRule="auto"/>
-        <w:ind w:left="300" w:hanging="300"/>
-        <w:rPr>
-          <w:rFonts w:eastAsia="Linux Libertine" w:cstheme="majorBidi"/>
-        </w:rPr>
-      </w:pPr>
-      <w:r>
-        <w:rPr>
-          <w:rFonts w:eastAsia="Linux Libertine" w:cstheme="majorBidi"/>
-        </w:rPr>
-        <w:t xml:space="preserve">Teunissen, P. J., &amp; Montenbruck, O. (2017). </w:t>
-      </w:r>
-      <w:r>
-        <w:rPr>
-          <w:rFonts w:eastAsia="Linux Libertine" w:cstheme="majorBidi"/>
           <w:i/>
           <w:iCs/>
         </w:rPr>
-        <w:t>Springer handbook of global navigation satellite systems.</w:t>
-      </w:r>
+        <w:t>Springer handbook of global navigation satellite systems</w:t>
+      </w:r>
+      <w:r>
+        <w:t xml:space="preserve">. Springer. </w:t>
+      </w:r>
+      <w:hyperlink r:id="rId27" w:history="1">
+        <w:r>
+          <w:rPr>
+            <w:rStyle w:val="Hyperlink"/>
+          </w:rPr>
+          <w:t>https://doi.org/10.1007/978-3-319-42928-1</w:t>
+        </w:r>
+      </w:hyperlink>
+    </w:p>
+    <w:p>
+      <w:pPr>
+        <w:spacing w:before="60" w:after="60"/>
+        <w:ind w:left="300" w:hanging="300"/>
+        <w:jc w:val="left"/>
+      </w:pPr>
+      <w:r>
+        <w:t xml:space="preserve">Vaswani, A., </w:t>
+      </w:r>
+      <w:proofErr w:type="spellStart"/>
+      <w:r>
+        <w:t>Shazeer</w:t>
+      </w:r>
+      <w:proofErr w:type="spellEnd"/>
+      <w:r>
+        <w:t xml:space="preserve">, N., Parmar, N., </w:t>
+      </w:r>
+      <w:proofErr w:type="spellStart"/>
+      <w:r>
+        <w:t>Uszkoreit</w:t>
+      </w:r>
+      <w:proofErr w:type="spellEnd"/>
+      <w:r>
+        <w:t xml:space="preserve">, J., Jones, L., Gomez, A. N., Kaiser, Ł., &amp; </w:t>
+      </w:r>
+      <w:proofErr w:type="spellStart"/>
+      <w:r>
+        <w:t>Polosukhin</w:t>
+      </w:r>
+      <w:proofErr w:type="spellEnd"/>
+      <w:r>
+        <w:t xml:space="preserve">, I. (2017). Attention is all you need. </w:t>
+      </w:r>
+      <w:proofErr w:type="spellStart"/>
       <w:r>
         <w:rPr>
-          <w:rFonts w:eastAsia="Linux Libertine" w:cstheme="majorBidi"/>
-        </w:rPr>
-        <w:t xml:space="preserve"> Springer. https://doi.org/10.1007/978-3-319-42928-1 </w:t>
-      </w:r>
-    </w:p>
-    <w:p>
-      <w:pPr>
-        <w:spacing w:before="200" w:after="40" w:line="240" w:lineRule="auto"/>
-        <w:ind w:left="300" w:hanging="300"/>
-        <w:rPr>
-          <w:rFonts w:eastAsia="Linux Libertine" w:cstheme="majorBidi"/>
-        </w:rPr>
-      </w:pPr>
-      <w:r>
-        <w:rPr>
-          <w:rFonts w:eastAsia="Linux Libertine" w:cstheme="majorBidi"/>
-        </w:rPr>
-        <w:t xml:space="preserve">Vaswani, A., Shazeer, N., Parmar, N., Uszkoreit, J., Jones, L., Gomez, A. N., … Polosukhin, I. (2017). Attention is all you need. </w:t>
-      </w:r>
-      <w:r>
-        <w:rPr>
-          <w:rFonts w:eastAsia="Linux Libertine" w:cstheme="majorBidi"/>
           <w:i/>
           <w:iCs/>
         </w:rPr>
-        <w:t>Advances in Neural Information Processing Systems, 30.</w:t>
+        <w:t>arXiv</w:t>
+      </w:r>
+      <w:proofErr w:type="spellEnd"/>
+      <w:r>
+        <w:t xml:space="preserve">. </w:t>
+      </w:r>
+      <w:hyperlink r:id="rId28" w:history="1">
+        <w:r>
+          <w:rPr>
+            <w:rStyle w:val="Hyperlink"/>
+          </w:rPr>
+          <w:t>https://doi.org/10.48550/arXiv.1706.03762</w:t>
+        </w:r>
+      </w:hyperlink>
+    </w:p>
+    <w:p>
+      <w:pPr>
+        <w:spacing w:before="60" w:after="60"/>
+        <w:ind w:left="300" w:hanging="300"/>
+        <w:jc w:val="left"/>
+      </w:pPr>
+      <w:r>
+        <w:t xml:space="preserve">Zandbergen, P. A., &amp; Barbeau, S. J. (2011). Positional accuracy of assisted GPS data from high-sensitivity GPS-enabled mobile phones. </w:t>
       </w:r>
       <w:r>
         <w:rPr>
-          <w:rFonts w:eastAsia="Linux Libertine" w:cstheme="majorBidi"/>
-        </w:rPr>
-        <w:t xml:space="preserve"> https://doi.org/10.48550/arXiv.1706.03762 </w:t>
-      </w:r>
-    </w:p>
-    <w:p>
-      <w:pPr>
-        <w:spacing w:before="200" w:after="40" w:line="240" w:lineRule="auto"/>
-        <w:ind w:left="300" w:hanging="300"/>
-        <w:rPr>
-          <w:rFonts w:eastAsia="Linux Libertine" w:cstheme="majorBidi"/>
-        </w:rPr>
-      </w:pPr>
-      <w:r>
-        <w:rPr>
-          <w:rFonts w:eastAsia="Linux Libertine" w:cstheme="majorBidi"/>
-        </w:rPr>
-        <w:t>Zandbergen, P. A., &amp; Barbeau, S. J. (2011). Positional accuracy of assisted GPS data from high</w:t>
-      </w:r>
-      <w:r>
-        <w:rPr>
-          <w:rFonts w:eastAsia="Linux Libertine" w:cstheme="majorBidi"/>
-        </w:rPr>
-        <w:noBreakHyphen/>
-        <w:t>sensitivity GPS</w:t>
-      </w:r>
-      <w:r>
-        <w:rPr>
-          <w:rFonts w:eastAsia="Linux Libertine" w:cstheme="majorBidi"/>
-        </w:rPr>
-        <w:noBreakHyphen/>
-        <w:t xml:space="preserve">enabled mobile phones. </w:t>
-      </w:r>
-      <w:r>
-        <w:rPr>
-          <w:rFonts w:eastAsia="Linux Libertine" w:cstheme="majorBidi"/>
           <w:i/>
           <w:iCs/>
         </w:rPr>
         <w:t>Journal of Navigation, 64</w:t>
       </w:r>
       <w:r>
+        <w:t xml:space="preserve">(3), 381–399. </w:t>
+      </w:r>
+      <w:hyperlink r:id="rId29" w:history="1">
+        <w:r>
+          <w:rPr>
+            <w:rStyle w:val="Hyperlink"/>
+          </w:rPr>
+          <w:t>https://doi.org/10.1017/S0373463311000051</w:t>
+        </w:r>
+      </w:hyperlink>
+    </w:p>
+    <w:p>
+      <w:pPr>
+        <w:spacing w:before="60" w:after="60"/>
+        <w:ind w:left="300" w:hanging="300"/>
+        <w:jc w:val="left"/>
+      </w:pPr>
+      <w:r>
+        <w:t xml:space="preserve">Zheng, Y., Li, Q., Chen, Y., Xie, X., &amp; Ma, W.-Y. (2008). Understanding mobility based on GPS data. In </w:t>
+      </w:r>
+      <w:r>
         <w:rPr>
-          <w:rFonts w:eastAsia="Linux Libertine" w:cstheme="majorBidi"/>
-        </w:rPr>
-        <w:t xml:space="preserve">(3), 381–399. https://doi.org/10.1017/S0373463311000051 </w:t>
-      </w:r>
-    </w:p>
-    <w:p>
-      <w:pPr>
-        <w:spacing w:before="200" w:after="40" w:line="240" w:lineRule="auto"/>
-        <w:ind w:left="300" w:hanging="300"/>
-        <w:rPr>
-          <w:rFonts w:eastAsia="Linux Libertine" w:cstheme="majorBidi"/>
-        </w:rPr>
-      </w:pPr>
-      <w:r>
-        <w:rPr>
-          <w:rFonts w:eastAsia="Linux Libertine" w:cstheme="majorBidi"/>
-        </w:rPr>
-        <w:t xml:space="preserve">Zheng, Y., Li, Q., Chen, Y., Xie, X., &amp; Ma, W. Y. (2008). Understanding mobility based on GPS data. </w:t>
-      </w:r>
-      <w:r>
-        <w:rPr>
-          <w:rFonts w:eastAsia="Linux Libertine" w:cstheme="majorBidi"/>
           <w:i/>
           <w:iCs/>
         </w:rPr>
         <w:t>Proceedings of the 10th International Conference on Ubiquitous Computing</w:t>
       </w:r>
       <w:r>
-        <w:rPr>
-          <w:rFonts w:eastAsia="Linux Libertine" w:cstheme="majorBidi"/>
-        </w:rPr>
-        <w:t xml:space="preserve">, 312–321. </w:t>
-      </w:r>
-      <w:hyperlink r:id="rId20" w:history="1">
+        <w:t xml:space="preserve"> (pp. 312–321). </w:t>
+      </w:r>
+      <w:hyperlink r:id="rId30" w:history="1">
         <w:r>
           <w:rPr>
             <w:rStyle w:val="Hyperlink"/>
-            <w:rFonts w:eastAsia="Linux Libertine" w:cstheme="majorBidi"/>
           </w:rPr>
           <w:t>https://doi.org/10.1145/1409635.1409677</w:t>
         </w:r>
@@ -2189,37 +2439,29 @@
     </w:p>
     <w:p>
       <w:pPr>
-        <w:spacing w:before="200" w:after="40" w:line="240" w:lineRule="auto"/>
+        <w:spacing w:before="60" w:after="60"/>
         <w:ind w:left="300" w:hanging="300"/>
+        <w:jc w:val="left"/>
+      </w:pPr>
+      <w:r>
+        <w:t xml:space="preserve">Zheng, Y., Xie, X., &amp; Ma, W.-Y. (2010). GeoLife: A collaborative social networking service among user, location and trajectory. </w:t>
+      </w:r>
+      <w:r>
         <w:rPr>
-          <w:rFonts w:eastAsia="Linux Libertine" w:cstheme="majorBidi"/>
-        </w:rPr>
-      </w:pPr>
-      <w:r>
-        <w:rPr>
-          <w:rFonts w:eastAsia="Linux Libertine" w:cstheme="majorBidi"/>
-        </w:rPr>
-        <w:t xml:space="preserve">Zheng, Y., Xie, X., &amp; Ma, W. Y. (2010). GeoLife: A collaborative social networking service among user, location and trajectory. </w:t>
-      </w:r>
-      <w:r>
-        <w:rPr>
-          <w:rFonts w:eastAsia="Linux Libertine" w:cstheme="majorBidi"/>
           <w:i/>
           <w:iCs/>
         </w:rPr>
         <w:t>IEEE Data Engineering Bulletin, 33</w:t>
       </w:r>
       <w:r>
-        <w:rPr>
-          <w:rFonts w:eastAsia="Linux Libertine" w:cstheme="majorBidi"/>
-        </w:rPr>
         <w:t>(2), 32–39.</w:t>
       </w:r>
     </w:p>
     <w:p>
       <w:pPr>
-        <w:spacing w:before="200" w:after="40" w:line="240" w:lineRule="auto"/>
+        <w:spacing w:before="60" w:after="60"/>
         <w:ind w:left="300" w:hanging="300"/>
+        <w:jc w:val="left"/>
       </w:pPr>
     </w:p>
     <w:sectPr>
@@ -2873,6 +3115,304 @@
     </w:lvl>
   </w:abstractNum>
   <w:abstractNum w:abstractNumId="3" w15:restartNumberingAfterBreak="0">
+    <w:nsid w:val="27B4572C"/>
+    <w:multiLevelType w:val="multilevel"/>
+    <w:tmpl w:val="D54659EA"/>
+    <w:lvl w:ilvl="0">
+      <w:start w:val="1"/>
+      <w:numFmt w:val="bullet"/>
+      <w:lvlText w:val=""/>
+      <w:lvlJc w:val="left"/>
+      <w:pPr>
+        <w:tabs>
+          <w:tab w:val="num" w:pos="720"/>
+        </w:tabs>
+        <w:ind w:left="720" w:hanging="360"/>
+      </w:pPr>
+      <w:rPr>
+        <w:rFonts w:ascii="Symbol" w:hAnsi="Symbol" w:hint="default"/>
+        <w:sz w:val="20"/>
+      </w:rPr>
+    </w:lvl>
+    <w:lvl w:ilvl="1" w:tentative="1">
+      <w:start w:val="1"/>
+      <w:numFmt w:val="bullet"/>
+      <w:lvlText w:val="o"/>
+      <w:lvlJc w:val="left"/>
+      <w:pPr>
+        <w:tabs>
+          <w:tab w:val="num" w:pos="1440"/>
+        </w:tabs>
+        <w:ind w:left="1440" w:hanging="360"/>
+      </w:pPr>
+      <w:rPr>
+        <w:rFonts w:ascii="Courier New" w:hAnsi="Courier New" w:hint="default"/>
+        <w:sz w:val="20"/>
+      </w:rPr>
+    </w:lvl>
+    <w:lvl w:ilvl="2" w:tentative="1">
+      <w:start w:val="1"/>
+      <w:numFmt w:val="bullet"/>
+      <w:lvlText w:val=""/>
+      <w:lvlJc w:val="left"/>
+      <w:pPr>
+        <w:tabs>
+          <w:tab w:val="num" w:pos="2160"/>
+        </w:tabs>
+        <w:ind w:left="2160" w:hanging="360"/>
+      </w:pPr>
+      <w:rPr>
+        <w:rFonts w:ascii="Wingdings" w:hAnsi="Wingdings" w:hint="default"/>
+        <w:sz w:val="20"/>
+      </w:rPr>
+    </w:lvl>
+    <w:lvl w:ilvl="3" w:tentative="1">
+      <w:start w:val="1"/>
+      <w:numFmt w:val="bullet"/>
+      <w:lvlText w:val=""/>
+      <w:lvlJc w:val="left"/>
+      <w:pPr>
+        <w:tabs>
+          <w:tab w:val="num" w:pos="2880"/>
+        </w:tabs>
+        <w:ind w:left="2880" w:hanging="360"/>
+      </w:pPr>
+      <w:rPr>
+        <w:rFonts w:ascii="Wingdings" w:hAnsi="Wingdings" w:hint="default"/>
+        <w:sz w:val="20"/>
+      </w:rPr>
+    </w:lvl>
+    <w:lvl w:ilvl="4" w:tentative="1">
+      <w:start w:val="1"/>
+      <w:numFmt w:val="bullet"/>
+      <w:lvlText w:val=""/>
+      <w:lvlJc w:val="left"/>
+      <w:pPr>
+        <w:tabs>
+          <w:tab w:val="num" w:pos="3600"/>
+        </w:tabs>
+        <w:ind w:left="3600" w:hanging="360"/>
+      </w:pPr>
+      <w:rPr>
+        <w:rFonts w:ascii="Wingdings" w:hAnsi="Wingdings" w:hint="default"/>
+        <w:sz w:val="20"/>
+      </w:rPr>
+    </w:lvl>
+    <w:lvl w:ilvl="5" w:tentative="1">
+      <w:start w:val="1"/>
+      <w:numFmt w:val="bullet"/>
+      <w:lvlText w:val=""/>
+      <w:lvlJc w:val="left"/>
+      <w:pPr>
+        <w:tabs>
+          <w:tab w:val="num" w:pos="4320"/>
+        </w:tabs>
+        <w:ind w:left="4320" w:hanging="360"/>
+      </w:pPr>
+      <w:rPr>
+        <w:rFonts w:ascii="Wingdings" w:hAnsi="Wingdings" w:hint="default"/>
+        <w:sz w:val="20"/>
+      </w:rPr>
+    </w:lvl>
+    <w:lvl w:ilvl="6" w:tentative="1">
+      <w:start w:val="1"/>
+      <w:numFmt w:val="bullet"/>
+      <w:lvlText w:val=""/>
+      <w:lvlJc w:val="left"/>
+      <w:pPr>
+        <w:tabs>
+          <w:tab w:val="num" w:pos="5040"/>
+        </w:tabs>
+        <w:ind w:left="5040" w:hanging="360"/>
+      </w:pPr>
+      <w:rPr>
+        <w:rFonts w:ascii="Wingdings" w:hAnsi="Wingdings" w:hint="default"/>
+        <w:sz w:val="20"/>
+      </w:rPr>
+    </w:lvl>
+    <w:lvl w:ilvl="7" w:tentative="1">
+      <w:start w:val="1"/>
+      <w:numFmt w:val="bullet"/>
+      <w:lvlText w:val=""/>
+      <w:lvlJc w:val="left"/>
+      <w:pPr>
+        <w:tabs>
+          <w:tab w:val="num" w:pos="5760"/>
+        </w:tabs>
+        <w:ind w:left="5760" w:hanging="360"/>
+      </w:pPr>
+      <w:rPr>
+        <w:rFonts w:ascii="Wingdings" w:hAnsi="Wingdings" w:hint="default"/>
+        <w:sz w:val="20"/>
+      </w:rPr>
+    </w:lvl>
+    <w:lvl w:ilvl="8" w:tentative="1">
+      <w:start w:val="1"/>
+      <w:numFmt w:val="bullet"/>
+      <w:lvlText w:val=""/>
+      <w:lvlJc w:val="left"/>
+      <w:pPr>
+        <w:tabs>
+          <w:tab w:val="num" w:pos="6480"/>
+        </w:tabs>
+        <w:ind w:left="6480" w:hanging="360"/>
+      </w:pPr>
+      <w:rPr>
+        <w:rFonts w:ascii="Wingdings" w:hAnsi="Wingdings" w:hint="default"/>
+        <w:sz w:val="20"/>
+      </w:rPr>
+    </w:lvl>
+  </w:abstractNum>
+  <w:abstractNum w:abstractNumId="4" w15:restartNumberingAfterBreak="0">
+    <w:nsid w:val="29666D0C"/>
+    <w:multiLevelType w:val="multilevel"/>
+    <w:tmpl w:val="4DCCDDD8"/>
+    <w:lvl w:ilvl="0">
+      <w:start w:val="1"/>
+      <w:numFmt w:val="bullet"/>
+      <w:lvlText w:val=""/>
+      <w:lvlJc w:val="left"/>
+      <w:pPr>
+        <w:tabs>
+          <w:tab w:val="num" w:pos="720"/>
+        </w:tabs>
+        <w:ind w:left="720" w:hanging="360"/>
+      </w:pPr>
+      <w:rPr>
+        <w:rFonts w:ascii="Symbol" w:hAnsi="Symbol" w:hint="default"/>
+        <w:sz w:val="20"/>
+      </w:rPr>
+    </w:lvl>
+    <w:lvl w:ilvl="1" w:tentative="1">
+      <w:start w:val="1"/>
+      <w:numFmt w:val="bullet"/>
+      <w:lvlText w:val="o"/>
+      <w:lvlJc w:val="left"/>
+      <w:pPr>
+        <w:tabs>
+          <w:tab w:val="num" w:pos="1440"/>
+        </w:tabs>
+        <w:ind w:left="1440" w:hanging="360"/>
+      </w:pPr>
+      <w:rPr>
+        <w:rFonts w:ascii="Courier New" w:hAnsi="Courier New" w:hint="default"/>
+        <w:sz w:val="20"/>
+      </w:rPr>
+    </w:lvl>
+    <w:lvl w:ilvl="2" w:tentative="1">
+      <w:start w:val="1"/>
+      <w:numFmt w:val="bullet"/>
+      <w:lvlText w:val=""/>
+      <w:lvlJc w:val="left"/>
+      <w:pPr>
+        <w:tabs>
+          <w:tab w:val="num" w:pos="2160"/>
+        </w:tabs>
+        <w:ind w:left="2160" w:hanging="360"/>
+      </w:pPr>
+      <w:rPr>
+        <w:rFonts w:ascii="Wingdings" w:hAnsi="Wingdings" w:hint="default"/>
+        <w:sz w:val="20"/>
+      </w:rPr>
+    </w:lvl>
+    <w:lvl w:ilvl="3" w:tentative="1">
+      <w:start w:val="1"/>
+      <w:numFmt w:val="bullet"/>
+      <w:lvlText w:val=""/>
+      <w:lvlJc w:val="left"/>
+      <w:pPr>
+        <w:tabs>
+          <w:tab w:val="num" w:pos="2880"/>
+        </w:tabs>
+        <w:ind w:left="2880" w:hanging="360"/>
+      </w:pPr>
+      <w:rPr>
+        <w:rFonts w:ascii="Wingdings" w:hAnsi="Wingdings" w:hint="default"/>
+        <w:sz w:val="20"/>
+      </w:rPr>
+    </w:lvl>
+    <w:lvl w:ilvl="4" w:tentative="1">
+      <w:start w:val="1"/>
+      <w:numFmt w:val="bullet"/>
+      <w:lvlText w:val=""/>
+      <w:lvlJc w:val="left"/>
+      <w:pPr>
+        <w:tabs>
+          <w:tab w:val="num" w:pos="3600"/>
+        </w:tabs>
+        <w:ind w:left="3600" w:hanging="360"/>
+      </w:pPr>
+      <w:rPr>
+        <w:rFonts w:ascii="Wingdings" w:hAnsi="Wingdings" w:hint="default"/>
+        <w:sz w:val="20"/>
+      </w:rPr>
+    </w:lvl>
+    <w:lvl w:ilvl="5" w:tentative="1">
+      <w:start w:val="1"/>
+      <w:numFmt w:val="bullet"/>
+      <w:lvlText w:val=""/>
+      <w:lvlJc w:val="left"/>
+      <w:pPr>
+        <w:tabs>
+          <w:tab w:val="num" w:pos="4320"/>
+        </w:tabs>
+        <w:ind w:left="4320" w:hanging="360"/>
+      </w:pPr>
+      <w:rPr>
+        <w:rFonts w:ascii="Wingdings" w:hAnsi="Wingdings" w:hint="default"/>
+        <w:sz w:val="20"/>
+      </w:rPr>
+    </w:lvl>
+    <w:lvl w:ilvl="6" w:tentative="1">
+      <w:start w:val="1"/>
+      <w:numFmt w:val="bullet"/>
+      <w:lvlText w:val=""/>
+      <w:lvlJc w:val="left"/>
+      <w:pPr>
+        <w:tabs>
+          <w:tab w:val="num" w:pos="5040"/>
+        </w:tabs>
+        <w:ind w:left="5040" w:hanging="360"/>
+      </w:pPr>
+      <w:rPr>
+        <w:rFonts w:ascii="Wingdings" w:hAnsi="Wingdings" w:hint="default"/>
+        <w:sz w:val="20"/>
+      </w:rPr>
+    </w:lvl>
+    <w:lvl w:ilvl="7" w:tentative="1">
+      <w:start w:val="1"/>
+      <w:numFmt w:val="bullet"/>
+      <w:lvlText w:val=""/>
+      <w:lvlJc w:val="left"/>
+      <w:pPr>
+        <w:tabs>
+          <w:tab w:val="num" w:pos="5760"/>
+        </w:tabs>
+        <w:ind w:left="5760" w:hanging="360"/>
+      </w:pPr>
+      <w:rPr>
+        <w:rFonts w:ascii="Wingdings" w:hAnsi="Wingdings" w:hint="default"/>
+        <w:sz w:val="20"/>
+      </w:rPr>
+    </w:lvl>
+    <w:lvl w:ilvl="8" w:tentative="1">
+      <w:start w:val="1"/>
+      <w:numFmt w:val="bullet"/>
+      <w:lvlText w:val=""/>
+      <w:lvlJc w:val="left"/>
+      <w:pPr>
+        <w:tabs>
+          <w:tab w:val="num" w:pos="6480"/>
+        </w:tabs>
+        <w:ind w:left="6480" w:hanging="360"/>
+      </w:pPr>
+      <w:rPr>
+        <w:rFonts w:ascii="Wingdings" w:hAnsi="Wingdings" w:hint="default"/>
+        <w:sz w:val="20"/>
+      </w:rPr>
+    </w:lvl>
+  </w:abstractNum>
+  <w:abstractNum w:abstractNumId="5" w15:restartNumberingAfterBreak="0">
     <w:nsid w:val="2A054F6E"/>
     <w:multiLevelType w:val="multilevel"/>
     <w:tmpl w:val="C7766D22"/>
@@ -3012,7 +3552,156 @@
       </w:rPr>
     </w:lvl>
   </w:abstractNum>
-  <w:abstractNum w:abstractNumId="4" w15:restartNumberingAfterBreak="0">
+  <w:abstractNum w:abstractNumId="6" w15:restartNumberingAfterBreak="0">
+    <w:nsid w:val="2B6A3B25"/>
+    <w:multiLevelType w:val="multilevel"/>
+    <w:tmpl w:val="98127638"/>
+    <w:lvl w:ilvl="0">
+      <w:start w:val="1"/>
+      <w:numFmt w:val="bullet"/>
+      <w:lvlText w:val=""/>
+      <w:lvlJc w:val="left"/>
+      <w:pPr>
+        <w:tabs>
+          <w:tab w:val="num" w:pos="720"/>
+        </w:tabs>
+        <w:ind w:left="720" w:hanging="360"/>
+      </w:pPr>
+      <w:rPr>
+        <w:rFonts w:ascii="Symbol" w:hAnsi="Symbol" w:hint="default"/>
+        <w:sz w:val="20"/>
+      </w:rPr>
+    </w:lvl>
+    <w:lvl w:ilvl="1" w:tentative="1">
+      <w:start w:val="1"/>
+      <w:numFmt w:val="bullet"/>
+      <w:lvlText w:val="o"/>
+      <w:lvlJc w:val="left"/>
+      <w:pPr>
+        <w:tabs>
+          <w:tab w:val="num" w:pos="1440"/>
+        </w:tabs>
+        <w:ind w:left="1440" w:hanging="360"/>
+      </w:pPr>
+      <w:rPr>
+        <w:rFonts w:ascii="Courier New" w:hAnsi="Courier New" w:hint="default"/>
+        <w:sz w:val="20"/>
+      </w:rPr>
+    </w:lvl>
+    <w:lvl w:ilvl="2" w:tentative="1">
+      <w:start w:val="1"/>
+      <w:numFmt w:val="bullet"/>
+      <w:lvlText w:val=""/>
+      <w:lvlJc w:val="left"/>
+      <w:pPr>
+        <w:tabs>
+          <w:tab w:val="num" w:pos="2160"/>
+        </w:tabs>
+        <w:ind w:left="2160" w:hanging="360"/>
+      </w:pPr>
+      <w:rPr>
+        <w:rFonts w:ascii="Wingdings" w:hAnsi="Wingdings" w:hint="default"/>
+        <w:sz w:val="20"/>
+      </w:rPr>
+    </w:lvl>
+    <w:lvl w:ilvl="3" w:tentative="1">
+      <w:start w:val="1"/>
+      <w:numFmt w:val="bullet"/>
+      <w:lvlText w:val=""/>
+      <w:lvlJc w:val="left"/>
+      <w:pPr>
+        <w:tabs>
+          <w:tab w:val="num" w:pos="2880"/>
+        </w:tabs>
+        <w:ind w:left="2880" w:hanging="360"/>
+      </w:pPr>
+      <w:rPr>
+        <w:rFonts w:ascii="Wingdings" w:hAnsi="Wingdings" w:hint="default"/>
+        <w:sz w:val="20"/>
+      </w:rPr>
+    </w:lvl>
+    <w:lvl w:ilvl="4" w:tentative="1">
+      <w:start w:val="1"/>
+      <w:numFmt w:val="bullet"/>
+      <w:lvlText w:val=""/>
+      <w:lvlJc w:val="left"/>
+      <w:pPr>
+        <w:tabs>
+          <w:tab w:val="num" w:pos="3600"/>
+        </w:tabs>
+        <w:ind w:left="3600" w:hanging="360"/>
+      </w:pPr>
+      <w:rPr>
+        <w:rFonts w:ascii="Wingdings" w:hAnsi="Wingdings" w:hint="default"/>
+        <w:sz w:val="20"/>
+      </w:rPr>
+    </w:lvl>
+    <w:lvl w:ilvl="5" w:tentative="1">
+      <w:start w:val="1"/>
+      <w:numFmt w:val="bullet"/>
+      <w:lvlText w:val=""/>
+      <w:lvlJc w:val="left"/>
+      <w:pPr>
+        <w:tabs>
+          <w:tab w:val="num" w:pos="4320"/>
+        </w:tabs>
+        <w:ind w:left="4320" w:hanging="360"/>
+      </w:pPr>
+      <w:rPr>
+        <w:rFonts w:ascii="Wingdings" w:hAnsi="Wingdings" w:hint="default"/>
+        <w:sz w:val="20"/>
+      </w:rPr>
+    </w:lvl>
+    <w:lvl w:ilvl="6" w:tentative="1">
+      <w:start w:val="1"/>
+      <w:numFmt w:val="bullet"/>
+      <w:lvlText w:val=""/>
+      <w:lvlJc w:val="left"/>
+      <w:pPr>
+        <w:tabs>
+          <w:tab w:val="num" w:pos="5040"/>
+        </w:tabs>
+        <w:ind w:left="5040" w:hanging="360"/>
+      </w:pPr>
+      <w:rPr>
+        <w:rFonts w:ascii="Wingdings" w:hAnsi="Wingdings" w:hint="default"/>
+        <w:sz w:val="20"/>
+      </w:rPr>
+    </w:lvl>
+    <w:lvl w:ilvl="7" w:tentative="1">
+      <w:start w:val="1"/>
+      <w:numFmt w:val="bullet"/>
+      <w:lvlText w:val=""/>
+      <w:lvlJc w:val="left"/>
+      <w:pPr>
+        <w:tabs>
+          <w:tab w:val="num" w:pos="5760"/>
+        </w:tabs>
+        <w:ind w:left="5760" w:hanging="360"/>
+      </w:pPr>
+      <w:rPr>
+        <w:rFonts w:ascii="Wingdings" w:hAnsi="Wingdings" w:hint="default"/>
+        <w:sz w:val="20"/>
+      </w:rPr>
+    </w:lvl>
+    <w:lvl w:ilvl="8" w:tentative="1">
+      <w:start w:val="1"/>
+      <w:numFmt w:val="bullet"/>
+      <w:lvlText w:val=""/>
+      <w:lvlJc w:val="left"/>
+      <w:pPr>
+        <w:tabs>
+          <w:tab w:val="num" w:pos="6480"/>
+        </w:tabs>
+        <w:ind w:left="6480" w:hanging="360"/>
+      </w:pPr>
+      <w:rPr>
+        <w:rFonts w:ascii="Wingdings" w:hAnsi="Wingdings" w:hint="default"/>
+        <w:sz w:val="20"/>
+      </w:rPr>
+    </w:lvl>
+  </w:abstractNum>
+  <w:abstractNum w:abstractNumId="7" w15:restartNumberingAfterBreak="0">
     <w:nsid w:val="317E61BF"/>
     <w:multiLevelType w:val="multilevel"/>
     <w:tmpl w:val="45F656FC"/>
@@ -3152,7 +3841,305 @@
       </w:rPr>
     </w:lvl>
   </w:abstractNum>
-  <w:abstractNum w:abstractNumId="5" w15:restartNumberingAfterBreak="0">
+  <w:abstractNum w:abstractNumId="8" w15:restartNumberingAfterBreak="0">
+    <w:nsid w:val="31E613EE"/>
+    <w:multiLevelType w:val="multilevel"/>
+    <w:tmpl w:val="86C26032"/>
+    <w:lvl w:ilvl="0">
+      <w:start w:val="1"/>
+      <w:numFmt w:val="bullet"/>
+      <w:lvlText w:val=""/>
+      <w:lvlJc w:val="left"/>
+      <w:pPr>
+        <w:tabs>
+          <w:tab w:val="num" w:pos="720"/>
+        </w:tabs>
+        <w:ind w:left="720" w:hanging="360"/>
+      </w:pPr>
+      <w:rPr>
+        <w:rFonts w:ascii="Symbol" w:hAnsi="Symbol" w:hint="default"/>
+        <w:sz w:val="20"/>
+      </w:rPr>
+    </w:lvl>
+    <w:lvl w:ilvl="1" w:tentative="1">
+      <w:start w:val="1"/>
+      <w:numFmt w:val="bullet"/>
+      <w:lvlText w:val="o"/>
+      <w:lvlJc w:val="left"/>
+      <w:pPr>
+        <w:tabs>
+          <w:tab w:val="num" w:pos="1440"/>
+        </w:tabs>
+        <w:ind w:left="1440" w:hanging="360"/>
+      </w:pPr>
+      <w:rPr>
+        <w:rFonts w:ascii="Courier New" w:hAnsi="Courier New" w:hint="default"/>
+        <w:sz w:val="20"/>
+      </w:rPr>
+    </w:lvl>
+    <w:lvl w:ilvl="2" w:tentative="1">
+      <w:start w:val="1"/>
+      <w:numFmt w:val="bullet"/>
+      <w:lvlText w:val=""/>
+      <w:lvlJc w:val="left"/>
+      <w:pPr>
+        <w:tabs>
+          <w:tab w:val="num" w:pos="2160"/>
+        </w:tabs>
+        <w:ind w:left="2160" w:hanging="360"/>
+      </w:pPr>
+      <w:rPr>
+        <w:rFonts w:ascii="Wingdings" w:hAnsi="Wingdings" w:hint="default"/>
+        <w:sz w:val="20"/>
+      </w:rPr>
+    </w:lvl>
+    <w:lvl w:ilvl="3" w:tentative="1">
+      <w:start w:val="1"/>
+      <w:numFmt w:val="bullet"/>
+      <w:lvlText w:val=""/>
+      <w:lvlJc w:val="left"/>
+      <w:pPr>
+        <w:tabs>
+          <w:tab w:val="num" w:pos="2880"/>
+        </w:tabs>
+        <w:ind w:left="2880" w:hanging="360"/>
+      </w:pPr>
+      <w:rPr>
+        <w:rFonts w:ascii="Wingdings" w:hAnsi="Wingdings" w:hint="default"/>
+        <w:sz w:val="20"/>
+      </w:rPr>
+    </w:lvl>
+    <w:lvl w:ilvl="4" w:tentative="1">
+      <w:start w:val="1"/>
+      <w:numFmt w:val="bullet"/>
+      <w:lvlText w:val=""/>
+      <w:lvlJc w:val="left"/>
+      <w:pPr>
+        <w:tabs>
+          <w:tab w:val="num" w:pos="3600"/>
+        </w:tabs>
+        <w:ind w:left="3600" w:hanging="360"/>
+      </w:pPr>
+      <w:rPr>
+        <w:rFonts w:ascii="Wingdings" w:hAnsi="Wingdings" w:hint="default"/>
+        <w:sz w:val="20"/>
+      </w:rPr>
+    </w:lvl>
+    <w:lvl w:ilvl="5" w:tentative="1">
+      <w:start w:val="1"/>
+      <w:numFmt w:val="bullet"/>
+      <w:lvlText w:val=""/>
+      <w:lvlJc w:val="left"/>
+      <w:pPr>
+        <w:tabs>
+          <w:tab w:val="num" w:pos="4320"/>
+        </w:tabs>
+        <w:ind w:left="4320" w:hanging="360"/>
+      </w:pPr>
+      <w:rPr>
+        <w:rFonts w:ascii="Wingdings" w:hAnsi="Wingdings" w:hint="default"/>
+        <w:sz w:val="20"/>
+      </w:rPr>
+    </w:lvl>
+    <w:lvl w:ilvl="6" w:tentative="1">
+      <w:start w:val="1"/>
+      <w:numFmt w:val="bullet"/>
+      <w:lvlText w:val=""/>
+      <w:lvlJc w:val="left"/>
+      <w:pPr>
+        <w:tabs>
+          <w:tab w:val="num" w:pos="5040"/>
+        </w:tabs>
+        <w:ind w:left="5040" w:hanging="360"/>
+      </w:pPr>
+      <w:rPr>
+        <w:rFonts w:ascii="Wingdings" w:hAnsi="Wingdings" w:hint="default"/>
+        <w:sz w:val="20"/>
+      </w:rPr>
+    </w:lvl>
+    <w:lvl w:ilvl="7" w:tentative="1">
+      <w:start w:val="1"/>
+      <w:numFmt w:val="bullet"/>
+      <w:lvlText w:val=""/>
+      <w:lvlJc w:val="left"/>
+      <w:pPr>
+        <w:tabs>
+          <w:tab w:val="num" w:pos="5760"/>
+        </w:tabs>
+        <w:ind w:left="5760" w:hanging="360"/>
+      </w:pPr>
+      <w:rPr>
+        <w:rFonts w:ascii="Wingdings" w:hAnsi="Wingdings" w:hint="default"/>
+        <w:sz w:val="20"/>
+      </w:rPr>
+    </w:lvl>
+    <w:lvl w:ilvl="8" w:tentative="1">
+      <w:start w:val="1"/>
+      <w:numFmt w:val="bullet"/>
+      <w:lvlText w:val=""/>
+      <w:lvlJc w:val="left"/>
+      <w:pPr>
+        <w:tabs>
+          <w:tab w:val="num" w:pos="6480"/>
+        </w:tabs>
+        <w:ind w:left="6480" w:hanging="360"/>
+      </w:pPr>
+      <w:rPr>
+        <w:rFonts w:ascii="Wingdings" w:hAnsi="Wingdings" w:hint="default"/>
+        <w:sz w:val="20"/>
+      </w:rPr>
+    </w:lvl>
+  </w:abstractNum>
+  <w:abstractNum w:abstractNumId="9" w15:restartNumberingAfterBreak="0">
+    <w:nsid w:val="3F7657C3"/>
+    <w:multiLevelType w:val="multilevel"/>
+    <w:tmpl w:val="2E1C2EB4"/>
+    <w:lvl w:ilvl="0">
+      <w:start w:val="1"/>
+      <w:numFmt w:val="bullet"/>
+      <w:lvlText w:val=""/>
+      <w:lvlJc w:val="left"/>
+      <w:pPr>
+        <w:tabs>
+          <w:tab w:val="num" w:pos="720"/>
+        </w:tabs>
+        <w:ind w:left="720" w:hanging="360"/>
+      </w:pPr>
+      <w:rPr>
+        <w:rFonts w:ascii="Symbol" w:hAnsi="Symbol" w:hint="default"/>
+        <w:sz w:val="20"/>
+      </w:rPr>
+    </w:lvl>
+    <w:lvl w:ilvl="1" w:tentative="1">
+      <w:start w:val="1"/>
+      <w:numFmt w:val="bullet"/>
+      <w:lvlText w:val="o"/>
+      <w:lvlJc w:val="left"/>
+      <w:pPr>
+        <w:tabs>
+          <w:tab w:val="num" w:pos="1440"/>
+        </w:tabs>
+        <w:ind w:left="1440" w:hanging="360"/>
+      </w:pPr>
+      <w:rPr>
+        <w:rFonts w:ascii="Courier New" w:hAnsi="Courier New" w:hint="default"/>
+        <w:sz w:val="20"/>
+      </w:rPr>
+    </w:lvl>
+    <w:lvl w:ilvl="2" w:tentative="1">
+      <w:start w:val="1"/>
+      <w:numFmt w:val="bullet"/>
+      <w:lvlText w:val=""/>
+      <w:lvlJc w:val="left"/>
+      <w:pPr>
+        <w:tabs>
+          <w:tab w:val="num" w:pos="2160"/>
+        </w:tabs>
+        <w:ind w:left="2160" w:hanging="360"/>
+      </w:pPr>
+      <w:rPr>
+        <w:rFonts w:ascii="Wingdings" w:hAnsi="Wingdings" w:hint="default"/>
+        <w:sz w:val="20"/>
+      </w:rPr>
+    </w:lvl>
+    <w:lvl w:ilvl="3" w:tentative="1">
+      <w:start w:val="1"/>
+      <w:numFmt w:val="bullet"/>
+      <w:lvlText w:val=""/>
+      <w:lvlJc w:val="left"/>
+      <w:pPr>
+        <w:tabs>
+          <w:tab w:val="num" w:pos="2880"/>
+        </w:tabs>
+        <w:ind w:left="2880" w:hanging="360"/>
+      </w:pPr>
+      <w:rPr>
+        <w:rFonts w:ascii="Wingdings" w:hAnsi="Wingdings" w:hint="default"/>
+        <w:sz w:val="20"/>
+      </w:rPr>
+    </w:lvl>
+    <w:lvl w:ilvl="4" w:tentative="1">
+      <w:start w:val="1"/>
+      <w:numFmt w:val="bullet"/>
+      <w:lvlText w:val=""/>
+      <w:lvlJc w:val="left"/>
+      <w:pPr>
+        <w:tabs>
+          <w:tab w:val="num" w:pos="3600"/>
+        </w:tabs>
+        <w:ind w:left="3600" w:hanging="360"/>
+      </w:pPr>
+      <w:rPr>
+        <w:rFonts w:ascii="Wingdings" w:hAnsi="Wingdings" w:hint="default"/>
+        <w:sz w:val="20"/>
+      </w:rPr>
+    </w:lvl>
+    <w:lvl w:ilvl="5" w:tentative="1">
+      <w:start w:val="1"/>
+      <w:numFmt w:val="bullet"/>
+      <w:lvlText w:val=""/>
+      <w:lvlJc w:val="left"/>
+      <w:pPr>
+        <w:tabs>
+          <w:tab w:val="num" w:pos="4320"/>
+        </w:tabs>
+        <w:ind w:left="4320" w:hanging="360"/>
+      </w:pPr>
+      <w:rPr>
+        <w:rFonts w:ascii="Wingdings" w:hAnsi="Wingdings" w:hint="default"/>
+        <w:sz w:val="20"/>
+      </w:rPr>
+    </w:lvl>
+    <w:lvl w:ilvl="6" w:tentative="1">
+      <w:start w:val="1"/>
+      <w:numFmt w:val="bullet"/>
+      <w:lvlText w:val=""/>
+      <w:lvlJc w:val="left"/>
+      <w:pPr>
+        <w:tabs>
+          <w:tab w:val="num" w:pos="5040"/>
+        </w:tabs>
+        <w:ind w:left="5040" w:hanging="360"/>
+      </w:pPr>
+      <w:rPr>
+        <w:rFonts w:ascii="Wingdings" w:hAnsi="Wingdings" w:hint="default"/>
+        <w:sz w:val="20"/>
+      </w:rPr>
+    </w:lvl>
+    <w:lvl w:ilvl="7" w:tentative="1">
+      <w:start w:val="1"/>
+      <w:numFmt w:val="bullet"/>
+      <w:lvlText w:val=""/>
+      <w:lvlJc w:val="left"/>
+      <w:pPr>
+        <w:tabs>
+          <w:tab w:val="num" w:pos="5760"/>
+        </w:tabs>
+        <w:ind w:left="5760" w:hanging="360"/>
+      </w:pPr>
+      <w:rPr>
+        <w:rFonts w:ascii="Wingdings" w:hAnsi="Wingdings" w:hint="default"/>
+        <w:sz w:val="20"/>
+      </w:rPr>
+    </w:lvl>
+    <w:lvl w:ilvl="8" w:tentative="1">
+      <w:start w:val="1"/>
+      <w:numFmt w:val="bullet"/>
+      <w:lvlText w:val=""/>
+      <w:lvlJc w:val="left"/>
+      <w:pPr>
+        <w:tabs>
+          <w:tab w:val="num" w:pos="6480"/>
+        </w:tabs>
+        <w:ind w:left="6480" w:hanging="360"/>
+      </w:pPr>
+      <w:rPr>
+        <w:rFonts w:ascii="Wingdings" w:hAnsi="Wingdings" w:hint="default"/>
+        <w:sz w:val="20"/>
+      </w:rPr>
+    </w:lvl>
+  </w:abstractNum>
+  <w:abstractNum w:abstractNumId="10" w15:restartNumberingAfterBreak="0">
     <w:nsid w:val="495F74BD"/>
     <w:multiLevelType w:val="multilevel"/>
     <w:tmpl w:val="9F94911A"/>
@@ -3292,7 +4279,156 @@
       </w:rPr>
     </w:lvl>
   </w:abstractNum>
-  <w:abstractNum w:abstractNumId="6" w15:restartNumberingAfterBreak="0">
+  <w:abstractNum w:abstractNumId="11" w15:restartNumberingAfterBreak="0">
+    <w:nsid w:val="4BE42FDF"/>
+    <w:multiLevelType w:val="multilevel"/>
+    <w:tmpl w:val="9836DCEE"/>
+    <w:lvl w:ilvl="0">
+      <w:start w:val="1"/>
+      <w:numFmt w:val="bullet"/>
+      <w:lvlText w:val=""/>
+      <w:lvlJc w:val="left"/>
+      <w:pPr>
+        <w:tabs>
+          <w:tab w:val="num" w:pos="720"/>
+        </w:tabs>
+        <w:ind w:left="720" w:hanging="360"/>
+      </w:pPr>
+      <w:rPr>
+        <w:rFonts w:ascii="Symbol" w:hAnsi="Symbol" w:hint="default"/>
+        <w:sz w:val="20"/>
+      </w:rPr>
+    </w:lvl>
+    <w:lvl w:ilvl="1" w:tentative="1">
+      <w:start w:val="1"/>
+      <w:numFmt w:val="bullet"/>
+      <w:lvlText w:val="o"/>
+      <w:lvlJc w:val="left"/>
+      <w:pPr>
+        <w:tabs>
+          <w:tab w:val="num" w:pos="1440"/>
+        </w:tabs>
+        <w:ind w:left="1440" w:hanging="360"/>
+      </w:pPr>
+      <w:rPr>
+        <w:rFonts w:ascii="Courier New" w:hAnsi="Courier New" w:hint="default"/>
+        <w:sz w:val="20"/>
+      </w:rPr>
+    </w:lvl>
+    <w:lvl w:ilvl="2" w:tentative="1">
+      <w:start w:val="1"/>
+      <w:numFmt w:val="bullet"/>
+      <w:lvlText w:val=""/>
+      <w:lvlJc w:val="left"/>
+      <w:pPr>
+        <w:tabs>
+          <w:tab w:val="num" w:pos="2160"/>
+        </w:tabs>
+        <w:ind w:left="2160" w:hanging="360"/>
+      </w:pPr>
+      <w:rPr>
+        <w:rFonts w:ascii="Wingdings" w:hAnsi="Wingdings" w:hint="default"/>
+        <w:sz w:val="20"/>
+      </w:rPr>
+    </w:lvl>
+    <w:lvl w:ilvl="3" w:tentative="1">
+      <w:start w:val="1"/>
+      <w:numFmt w:val="bullet"/>
+      <w:lvlText w:val=""/>
+      <w:lvlJc w:val="left"/>
+      <w:pPr>
+        <w:tabs>
+          <w:tab w:val="num" w:pos="2880"/>
+        </w:tabs>
+        <w:ind w:left="2880" w:hanging="360"/>
+      </w:pPr>
+      <w:rPr>
+        <w:rFonts w:ascii="Wingdings" w:hAnsi="Wingdings" w:hint="default"/>
+        <w:sz w:val="20"/>
+      </w:rPr>
+    </w:lvl>
+    <w:lvl w:ilvl="4" w:tentative="1">
+      <w:start w:val="1"/>
+      <w:numFmt w:val="bullet"/>
+      <w:lvlText w:val=""/>
+      <w:lvlJc w:val="left"/>
+      <w:pPr>
+        <w:tabs>
+          <w:tab w:val="num" w:pos="3600"/>
+        </w:tabs>
+        <w:ind w:left="3600" w:hanging="360"/>
+      </w:pPr>
+      <w:rPr>
+        <w:rFonts w:ascii="Wingdings" w:hAnsi="Wingdings" w:hint="default"/>
+        <w:sz w:val="20"/>
+      </w:rPr>
+    </w:lvl>
+    <w:lvl w:ilvl="5" w:tentative="1">
+      <w:start w:val="1"/>
+      <w:numFmt w:val="bullet"/>
+      <w:lvlText w:val=""/>
+      <w:lvlJc w:val="left"/>
+      <w:pPr>
+        <w:tabs>
+          <w:tab w:val="num" w:pos="4320"/>
+        </w:tabs>
+        <w:ind w:left="4320" w:hanging="360"/>
+      </w:pPr>
+      <w:rPr>
+        <w:rFonts w:ascii="Wingdings" w:hAnsi="Wingdings" w:hint="default"/>
+        <w:sz w:val="20"/>
+      </w:rPr>
+    </w:lvl>
+    <w:lvl w:ilvl="6" w:tentative="1">
+      <w:start w:val="1"/>
+      <w:numFmt w:val="bullet"/>
+      <w:lvlText w:val=""/>
+      <w:lvlJc w:val="left"/>
+      <w:pPr>
+        <w:tabs>
+          <w:tab w:val="num" w:pos="5040"/>
+        </w:tabs>
+        <w:ind w:left="5040" w:hanging="360"/>
+      </w:pPr>
+      <w:rPr>
+        <w:rFonts w:ascii="Wingdings" w:hAnsi="Wingdings" w:hint="default"/>
+        <w:sz w:val="20"/>
+      </w:rPr>
+    </w:lvl>
+    <w:lvl w:ilvl="7" w:tentative="1">
+      <w:start w:val="1"/>
+      <w:numFmt w:val="bullet"/>
+      <w:lvlText w:val=""/>
+      <w:lvlJc w:val="left"/>
+      <w:pPr>
+        <w:tabs>
+          <w:tab w:val="num" w:pos="5760"/>
+        </w:tabs>
+        <w:ind w:left="5760" w:hanging="360"/>
+      </w:pPr>
+      <w:rPr>
+        <w:rFonts w:ascii="Wingdings" w:hAnsi="Wingdings" w:hint="default"/>
+        <w:sz w:val="20"/>
+      </w:rPr>
+    </w:lvl>
+    <w:lvl w:ilvl="8" w:tentative="1">
+      <w:start w:val="1"/>
+      <w:numFmt w:val="bullet"/>
+      <w:lvlText w:val=""/>
+      <w:lvlJc w:val="left"/>
+      <w:pPr>
+        <w:tabs>
+          <w:tab w:val="num" w:pos="6480"/>
+        </w:tabs>
+        <w:ind w:left="6480" w:hanging="360"/>
+      </w:pPr>
+      <w:rPr>
+        <w:rFonts w:ascii="Wingdings" w:hAnsi="Wingdings" w:hint="default"/>
+        <w:sz w:val="20"/>
+      </w:rPr>
+    </w:lvl>
+  </w:abstractNum>
+  <w:abstractNum w:abstractNumId="12" w15:restartNumberingAfterBreak="0">
     <w:nsid w:val="4EDB6C5E"/>
     <w:multiLevelType w:val="multilevel"/>
     <w:tmpl w:val="5B6EFD4A"/>
@@ -3432,7 +4568,156 @@
       </w:rPr>
     </w:lvl>
   </w:abstractNum>
-  <w:abstractNum w:abstractNumId="7" w15:restartNumberingAfterBreak="0">
+  <w:abstractNum w:abstractNumId="13" w15:restartNumberingAfterBreak="0">
+    <w:nsid w:val="584D58D3"/>
+    <w:multiLevelType w:val="multilevel"/>
+    <w:tmpl w:val="A2644A76"/>
+    <w:lvl w:ilvl="0">
+      <w:start w:val="1"/>
+      <w:numFmt w:val="bullet"/>
+      <w:lvlText w:val=""/>
+      <w:lvlJc w:val="left"/>
+      <w:pPr>
+        <w:tabs>
+          <w:tab w:val="num" w:pos="720"/>
+        </w:tabs>
+        <w:ind w:left="720" w:hanging="360"/>
+      </w:pPr>
+      <w:rPr>
+        <w:rFonts w:ascii="Symbol" w:hAnsi="Symbol" w:hint="default"/>
+        <w:sz w:val="20"/>
+      </w:rPr>
+    </w:lvl>
+    <w:lvl w:ilvl="1" w:tentative="1">
+      <w:start w:val="1"/>
+      <w:numFmt w:val="bullet"/>
+      <w:lvlText w:val="o"/>
+      <w:lvlJc w:val="left"/>
+      <w:pPr>
+        <w:tabs>
+          <w:tab w:val="num" w:pos="1440"/>
+        </w:tabs>
+        <w:ind w:left="1440" w:hanging="360"/>
+      </w:pPr>
+      <w:rPr>
+        <w:rFonts w:ascii="Courier New" w:hAnsi="Courier New" w:hint="default"/>
+        <w:sz w:val="20"/>
+      </w:rPr>
+    </w:lvl>
+    <w:lvl w:ilvl="2" w:tentative="1">
+      <w:start w:val="1"/>
+      <w:numFmt w:val="bullet"/>
+      <w:lvlText w:val=""/>
+      <w:lvlJc w:val="left"/>
+      <w:pPr>
+        <w:tabs>
+          <w:tab w:val="num" w:pos="2160"/>
+        </w:tabs>
+        <w:ind w:left="2160" w:hanging="360"/>
+      </w:pPr>
+      <w:rPr>
+        <w:rFonts w:ascii="Wingdings" w:hAnsi="Wingdings" w:hint="default"/>
+        <w:sz w:val="20"/>
+      </w:rPr>
+    </w:lvl>
+    <w:lvl w:ilvl="3" w:tentative="1">
+      <w:start w:val="1"/>
+      <w:numFmt w:val="bullet"/>
+      <w:lvlText w:val=""/>
+      <w:lvlJc w:val="left"/>
+      <w:pPr>
+        <w:tabs>
+          <w:tab w:val="num" w:pos="2880"/>
+        </w:tabs>
+        <w:ind w:left="2880" w:hanging="360"/>
+      </w:pPr>
+      <w:rPr>
+        <w:rFonts w:ascii="Wingdings" w:hAnsi="Wingdings" w:hint="default"/>
+        <w:sz w:val="20"/>
+      </w:rPr>
+    </w:lvl>
+    <w:lvl w:ilvl="4" w:tentative="1">
+      <w:start w:val="1"/>
+      <w:numFmt w:val="bullet"/>
+      <w:lvlText w:val=""/>
+      <w:lvlJc w:val="left"/>
+      <w:pPr>
+        <w:tabs>
+          <w:tab w:val="num" w:pos="3600"/>
+        </w:tabs>
+        <w:ind w:left="3600" w:hanging="360"/>
+      </w:pPr>
+      <w:rPr>
+        <w:rFonts w:ascii="Wingdings" w:hAnsi="Wingdings" w:hint="default"/>
+        <w:sz w:val="20"/>
+      </w:rPr>
+    </w:lvl>
+    <w:lvl w:ilvl="5" w:tentative="1">
+      <w:start w:val="1"/>
+      <w:numFmt w:val="bullet"/>
+      <w:lvlText w:val=""/>
+      <w:lvlJc w:val="left"/>
+      <w:pPr>
+        <w:tabs>
+          <w:tab w:val="num" w:pos="4320"/>
+        </w:tabs>
+        <w:ind w:left="4320" w:hanging="360"/>
+      </w:pPr>
+      <w:rPr>
+        <w:rFonts w:ascii="Wingdings" w:hAnsi="Wingdings" w:hint="default"/>
+        <w:sz w:val="20"/>
+      </w:rPr>
+    </w:lvl>
+    <w:lvl w:ilvl="6" w:tentative="1">
+      <w:start w:val="1"/>
+      <w:numFmt w:val="bullet"/>
+      <w:lvlText w:val=""/>
+      <w:lvlJc w:val="left"/>
+      <w:pPr>
+        <w:tabs>
+          <w:tab w:val="num" w:pos="5040"/>
+        </w:tabs>
+        <w:ind w:left="5040" w:hanging="360"/>
+      </w:pPr>
+      <w:rPr>
+        <w:rFonts w:ascii="Wingdings" w:hAnsi="Wingdings" w:hint="default"/>
+        <w:sz w:val="20"/>
+      </w:rPr>
+    </w:lvl>
+    <w:lvl w:ilvl="7" w:tentative="1">
+      <w:start w:val="1"/>
+      <w:numFmt w:val="bullet"/>
+      <w:lvlText w:val=""/>
+      <w:lvlJc w:val="left"/>
+      <w:pPr>
+        <w:tabs>
+          <w:tab w:val="num" w:pos="5760"/>
+        </w:tabs>
+        <w:ind w:left="5760" w:hanging="360"/>
+      </w:pPr>
+      <w:rPr>
+        <w:rFonts w:ascii="Wingdings" w:hAnsi="Wingdings" w:hint="default"/>
+        <w:sz w:val="20"/>
+      </w:rPr>
+    </w:lvl>
+    <w:lvl w:ilvl="8" w:tentative="1">
+      <w:start w:val="1"/>
+      <w:numFmt w:val="bullet"/>
+      <w:lvlText w:val=""/>
+      <w:lvlJc w:val="left"/>
+      <w:pPr>
+        <w:tabs>
+          <w:tab w:val="num" w:pos="6480"/>
+        </w:tabs>
+        <w:ind w:left="6480" w:hanging="360"/>
+      </w:pPr>
+      <w:rPr>
+        <w:rFonts w:ascii="Wingdings" w:hAnsi="Wingdings" w:hint="default"/>
+        <w:sz w:val="20"/>
+      </w:rPr>
+    </w:lvl>
+  </w:abstractNum>
+  <w:abstractNum w:abstractNumId="14" w15:restartNumberingAfterBreak="0">
     <w:nsid w:val="61B06065"/>
     <w:multiLevelType w:val="multilevel"/>
     <w:tmpl w:val="B9EC2E54"/>
@@ -3572,7 +4857,156 @@
       </w:rPr>
     </w:lvl>
   </w:abstractNum>
-  <w:abstractNum w:abstractNumId="8" w15:restartNumberingAfterBreak="0">
+  <w:abstractNum w:abstractNumId="15" w15:restartNumberingAfterBreak="0">
+    <w:nsid w:val="729E7696"/>
+    <w:multiLevelType w:val="multilevel"/>
+    <w:tmpl w:val="7A989CB0"/>
+    <w:lvl w:ilvl="0">
+      <w:start w:val="1"/>
+      <w:numFmt w:val="bullet"/>
+      <w:lvlText w:val=""/>
+      <w:lvlJc w:val="left"/>
+      <w:pPr>
+        <w:tabs>
+          <w:tab w:val="num" w:pos="720"/>
+        </w:tabs>
+        <w:ind w:left="720" w:hanging="360"/>
+      </w:pPr>
+      <w:rPr>
+        <w:rFonts w:ascii="Symbol" w:hAnsi="Symbol" w:hint="default"/>
+        <w:sz w:val="20"/>
+      </w:rPr>
+    </w:lvl>
+    <w:lvl w:ilvl="1" w:tentative="1">
+      <w:start w:val="1"/>
+      <w:numFmt w:val="bullet"/>
+      <w:lvlText w:val="o"/>
+      <w:lvlJc w:val="left"/>
+      <w:pPr>
+        <w:tabs>
+          <w:tab w:val="num" w:pos="1440"/>
+        </w:tabs>
+        <w:ind w:left="1440" w:hanging="360"/>
+      </w:pPr>
+      <w:rPr>
+        <w:rFonts w:ascii="Courier New" w:hAnsi="Courier New" w:hint="default"/>
+        <w:sz w:val="20"/>
+      </w:rPr>
+    </w:lvl>
+    <w:lvl w:ilvl="2" w:tentative="1">
+      <w:start w:val="1"/>
+      <w:numFmt w:val="bullet"/>
+      <w:lvlText w:val=""/>
+      <w:lvlJc w:val="left"/>
+      <w:pPr>
+        <w:tabs>
+          <w:tab w:val="num" w:pos="2160"/>
+        </w:tabs>
+        <w:ind w:left="2160" w:hanging="360"/>
+      </w:pPr>
+      <w:rPr>
+        <w:rFonts w:ascii="Wingdings" w:hAnsi="Wingdings" w:hint="default"/>
+        <w:sz w:val="20"/>
+      </w:rPr>
+    </w:lvl>
+    <w:lvl w:ilvl="3" w:tentative="1">
+      <w:start w:val="1"/>
+      <w:numFmt w:val="bullet"/>
+      <w:lvlText w:val=""/>
+      <w:lvlJc w:val="left"/>
+      <w:pPr>
+        <w:tabs>
+          <w:tab w:val="num" w:pos="2880"/>
+        </w:tabs>
+        <w:ind w:left="2880" w:hanging="360"/>
+      </w:pPr>
+      <w:rPr>
+        <w:rFonts w:ascii="Wingdings" w:hAnsi="Wingdings" w:hint="default"/>
+        <w:sz w:val="20"/>
+      </w:rPr>
+    </w:lvl>
+    <w:lvl w:ilvl="4" w:tentative="1">
+      <w:start w:val="1"/>
+      <w:numFmt w:val="bullet"/>
+      <w:lvlText w:val=""/>
+      <w:lvlJc w:val="left"/>
+      <w:pPr>
+        <w:tabs>
+          <w:tab w:val="num" w:pos="3600"/>
+        </w:tabs>
+        <w:ind w:left="3600" w:hanging="360"/>
+      </w:pPr>
+      <w:rPr>
+        <w:rFonts w:ascii="Wingdings" w:hAnsi="Wingdings" w:hint="default"/>
+        <w:sz w:val="20"/>
+      </w:rPr>
+    </w:lvl>
+    <w:lvl w:ilvl="5" w:tentative="1">
+      <w:start w:val="1"/>
+      <w:numFmt w:val="bullet"/>
+      <w:lvlText w:val=""/>
+      <w:lvlJc w:val="left"/>
+      <w:pPr>
+        <w:tabs>
+          <w:tab w:val="num" w:pos="4320"/>
+        </w:tabs>
+        <w:ind w:left="4320" w:hanging="360"/>
+      </w:pPr>
+      <w:rPr>
+        <w:rFonts w:ascii="Wingdings" w:hAnsi="Wingdings" w:hint="default"/>
+        <w:sz w:val="20"/>
+      </w:rPr>
+    </w:lvl>
+    <w:lvl w:ilvl="6" w:tentative="1">
+      <w:start w:val="1"/>
+      <w:numFmt w:val="bullet"/>
+      <w:lvlText w:val=""/>
+      <w:lvlJc w:val="left"/>
+      <w:pPr>
+        <w:tabs>
+          <w:tab w:val="num" w:pos="5040"/>
+        </w:tabs>
+        <w:ind w:left="5040" w:hanging="360"/>
+      </w:pPr>
+      <w:rPr>
+        <w:rFonts w:ascii="Wingdings" w:hAnsi="Wingdings" w:hint="default"/>
+        <w:sz w:val="20"/>
+      </w:rPr>
+    </w:lvl>
+    <w:lvl w:ilvl="7" w:tentative="1">
+      <w:start w:val="1"/>
+      <w:numFmt w:val="bullet"/>
+      <w:lvlText w:val=""/>
+      <w:lvlJc w:val="left"/>
+      <w:pPr>
+        <w:tabs>
+          <w:tab w:val="num" w:pos="5760"/>
+        </w:tabs>
+        <w:ind w:left="5760" w:hanging="360"/>
+      </w:pPr>
+      <w:rPr>
+        <w:rFonts w:ascii="Wingdings" w:hAnsi="Wingdings" w:hint="default"/>
+        <w:sz w:val="20"/>
+      </w:rPr>
+    </w:lvl>
+    <w:lvl w:ilvl="8" w:tentative="1">
+      <w:start w:val="1"/>
+      <w:numFmt w:val="bullet"/>
+      <w:lvlText w:val=""/>
+      <w:lvlJc w:val="left"/>
+      <w:pPr>
+        <w:tabs>
+          <w:tab w:val="num" w:pos="6480"/>
+        </w:tabs>
+        <w:ind w:left="6480" w:hanging="360"/>
+      </w:pPr>
+      <w:rPr>
+        <w:rFonts w:ascii="Wingdings" w:hAnsi="Wingdings" w:hint="default"/>
+        <w:sz w:val="20"/>
+      </w:rPr>
+    </w:lvl>
+  </w:abstractNum>
+  <w:abstractNum w:abstractNumId="16" w15:restartNumberingAfterBreak="0">
     <w:nsid w:val="79952714"/>
     <w:multiLevelType w:val="multilevel"/>
     <w:tmpl w:val="C5C21DA6"/>
@@ -3719,25 +5153,49 @@
     <w:abstractNumId w:val="2"/>
   </w:num>
   <w:num w:numId="3" w16cid:durableId="1492942228">
-    <w:abstractNumId w:val="8"/>
+    <w:abstractNumId w:val="16"/>
   </w:num>
   <w:num w:numId="4" w16cid:durableId="517429286">
-    <w:abstractNumId w:val="3"/>
+    <w:abstractNumId w:val="5"/>
   </w:num>
   <w:num w:numId="5" w16cid:durableId="1718040607">
-    <w:abstractNumId w:val="6"/>
+    <w:abstractNumId w:val="12"/>
   </w:num>
   <w:num w:numId="6" w16cid:durableId="710611117">
-    <w:abstractNumId w:val="5"/>
+    <w:abstractNumId w:val="10"/>
   </w:num>
   <w:num w:numId="7" w16cid:durableId="1117138578">
-    <w:abstractNumId w:val="4"/>
+    <w:abstractNumId w:val="7"/>
   </w:num>
   <w:num w:numId="8" w16cid:durableId="1648709583">
-    <w:abstractNumId w:val="7"/>
+    <w:abstractNumId w:val="14"/>
   </w:num>
   <w:num w:numId="9" w16cid:durableId="1602377560">
     <w:abstractNumId w:val="0"/>
+  </w:num>
+  <w:num w:numId="10" w16cid:durableId="1914001368">
+    <w:abstractNumId w:val="3"/>
+  </w:num>
+  <w:num w:numId="11" w16cid:durableId="298532910">
+    <w:abstractNumId w:val="9"/>
+  </w:num>
+  <w:num w:numId="12" w16cid:durableId="1491678714">
+    <w:abstractNumId w:val="8"/>
+  </w:num>
+  <w:num w:numId="13" w16cid:durableId="1486625624">
+    <w:abstractNumId w:val="6"/>
+  </w:num>
+  <w:num w:numId="14" w16cid:durableId="1265116789">
+    <w:abstractNumId w:val="15"/>
+  </w:num>
+  <w:num w:numId="15" w16cid:durableId="507330625">
+    <w:abstractNumId w:val="4"/>
+  </w:num>
+  <w:num w:numId="16" w16cid:durableId="321588768">
+    <w:abstractNumId w:val="13"/>
+  </w:num>
+  <w:num w:numId="17" w16cid:durableId="418065884">
+    <w:abstractNumId w:val="11"/>
   </w:num>
 </w:numbering>
 </file>
@@ -9773,6 +11231,69 @@
       </w:tblBorders>
     </w:tblPr>
   </w:style>
+  <w:style w:type="character" w:styleId="BookTitle0">
+    <w:name w:val="Book Title"/>
+    <w:basedOn w:val="DefaultParagraphFont"/>
+    <w:uiPriority w:val="33"/>
+    <w:qFormat/>
+    <w:rsid w:val="00DE69A8"/>
+    <w:rPr>
+      <w:b/>
+      <w:bCs/>
+      <w:i/>
+      <w:iCs/>
+      <w:spacing w:val="5"/>
+    </w:rPr>
+  </w:style>
+  <w:style w:type="character" w:styleId="IntenseEmphasis">
+    <w:name w:val="Intense Emphasis"/>
+    <w:basedOn w:val="DefaultParagraphFont"/>
+    <w:uiPriority w:val="21"/>
+    <w:qFormat/>
+    <w:rsid w:val="00DE69A8"/>
+    <w:rPr>
+      <w:i/>
+      <w:iCs/>
+      <w:color w:val="4F81BD" w:themeColor="accent1"/>
+    </w:rPr>
+  </w:style>
+  <w:style w:type="character" w:styleId="IntenseReference">
+    <w:name w:val="Intense Reference"/>
+    <w:basedOn w:val="DefaultParagraphFont"/>
+    <w:uiPriority w:val="32"/>
+    <w:qFormat/>
+    <w:rsid w:val="00DE69A8"/>
+    <w:rPr>
+      <w:b/>
+      <w:bCs/>
+      <w:smallCaps/>
+      <w:color w:val="4F81BD" w:themeColor="accent1"/>
+      <w:spacing w:val="5"/>
+    </w:rPr>
+  </w:style>
+  <w:style w:type="character" w:styleId="SubtleEmphasis">
+    <w:name w:val="Subtle Emphasis"/>
+    <w:basedOn w:val="DefaultParagraphFont"/>
+    <w:uiPriority w:val="19"/>
+    <w:qFormat/>
+    <w:rsid w:val="00DE69A8"/>
+    <w:rPr>
+      <w:i/>
+      <w:iCs/>
+      <w:color w:val="404040" w:themeColor="text1" w:themeTint="BF"/>
+    </w:rPr>
+  </w:style>
+  <w:style w:type="character" w:styleId="SubtleReference">
+    <w:name w:val="Subtle Reference"/>
+    <w:basedOn w:val="DefaultParagraphFont"/>
+    <w:uiPriority w:val="31"/>
+    <w:qFormat/>
+    <w:rsid w:val="00DE69A8"/>
+    <w:rPr>
+      <w:smallCaps/>
+      <w:color w:val="5A5A5A" w:themeColor="text1" w:themeTint="A5"/>
+    </w:rPr>
+  </w:style>
 </w:styles>
 </file>
 

</xml_diff>

<commit_message>
Update Capstone Project Template
</commit_message>
<xml_diff>
--- a/reports/AAI590 Capstone Project Template.docx
+++ b/reports/AAI590 Capstone Project Template.docx
@@ -1,6 +1,6 @@
 
 <file path=word/document.xml><?xml version="1.0" encoding="utf-8"?>
-<w:document xmlns:wpc="http://schemas.microsoft.com/office/word/2010/wordprocessingCanvas" xmlns:cx="http://schemas.microsoft.com/office/drawing/2014/chartex" xmlns:cx1="http://schemas.microsoft.com/office/drawing/2015/9/8/chartex" xmlns:cx2="http://schemas.microsoft.com/office/drawing/2015/10/21/chartex" xmlns:cx3="http://schemas.microsoft.com/office/drawing/2016/5/9/chartex" xmlns:cx4="http://schemas.microsoft.com/office/drawing/2016/5/10/chartex" xmlns:cx5="http://schemas.microsoft.com/office/drawing/2016/5/11/chartex" xmlns:cx6="http://schemas.microsoft.com/office/drawing/2016/5/12/chartex" xmlns:cx7="http://schemas.microsoft.com/office/drawing/2016/5/13/chartex" xmlns:cx8="http://schemas.microsoft.com/office/drawing/2016/5/14/chartex" xmlns:mc="http://schemas.openxmlformats.org/markup-compatibility/2006" xmlns:aink="http://schemas.microsoft.com/office/drawing/2016/ink" xmlns:am3d="http://schemas.microsoft.com/office/drawing/2017/model3d" xmlns:o="urn:schemas-microsoft-com:office:office" xmlns:oel="http://schemas.microsoft.com/office/2019/extlst" xmlns:r="http://schemas.openxmlformats.org/officeDocument/2006/relationships" xmlns:m="http://schemas.openxmlformats.org/officeDocument/2006/math" xmlns:v="urn:schemas-microsoft-com:vml" xmlns:wp14="http://schemas.microsoft.com/office/word/2010/wordprocessingDrawing" xmlns:wp="http://schemas.openxmlformats.org/drawingml/2006/wordprocessingDrawing" xmlns:w10="urn:schemas-microsoft-com:office:word" xmlns:w="http://schemas.openxmlformats.org/wordprocessingml/2006/main" xmlns:w14="http://schemas.microsoft.com/office/word/2010/wordml" xmlns:w15="http://schemas.microsoft.com/office/word/2012/wordml" xmlns:w16cex="http://schemas.microsoft.com/office/word/2018/wordml/cex" xmlns:w16cid="http://schemas.microsoft.com/office/word/2016/wordml/cid" xmlns:w16="http://schemas.microsoft.com/office/word/2018/wordml" xmlns:w16du="http://schemas.microsoft.com/office/word/2023/wordml/word16du" xmlns:w16sdtdh="http://schemas.microsoft.com/office/word/2020/wordml/sdtdatahash" xmlns:w16sdtfl="http://schemas.microsoft.com/office/word/2024/wordml/sdtformatlock" xmlns:w16se="http://schemas.microsoft.com/office/word/2015/wordml/symex" xmlns:wpg="http://schemas.microsoft.com/office/word/2010/wordprocessingGroup" xmlns:wpi="http://schemas.microsoft.com/office/word/2010/wordprocessingInk" xmlns:wne="http://schemas.microsoft.com/office/word/2006/wordml" xmlns:wps="http://schemas.microsoft.com/office/word/2010/wordprocessingShape" mc:Ignorable="w14 w15 w16se w16cid w16 w16cex w16sdtdh w16sdtfl w16du wp14">
+<w:document xmlns:wpc="http://schemas.microsoft.com/office/word/2010/wordprocessingCanvas" xmlns:cx="http://schemas.microsoft.com/office/drawing/2014/chartex" xmlns:cx1="http://schemas.microsoft.com/office/drawing/2015/9/8/chartex" xmlns:cx2="http://schemas.microsoft.com/office/drawing/2015/10/21/chartex" xmlns:cx3="http://schemas.microsoft.com/office/drawing/2016/5/9/chartex" xmlns:cx4="http://schemas.microsoft.com/office/drawing/2016/5/10/chartex" xmlns:cx5="http://schemas.microsoft.com/office/drawing/2016/5/11/chartex" xmlns:cx6="http://schemas.microsoft.com/office/drawing/2016/5/12/chartex" xmlns:cx7="http://schemas.microsoft.com/office/drawing/2016/5/13/chartex" xmlns:cx8="http://schemas.microsoft.com/office/drawing/2016/5/14/chartex" xmlns:mc="http://schemas.openxmlformats.org/markup-compatibility/2006" xmlns:aink="http://schemas.microsoft.com/office/drawing/2016/ink" xmlns:am3d="http://schemas.microsoft.com/office/drawing/2017/model3d" xmlns:o="urn:schemas-microsoft-com:office:office" xmlns:oel="http://schemas.microsoft.com/office/2019/extlst" xmlns:r="http://schemas.openxmlformats.org/officeDocument/2006/relationships" xmlns:m="http://schemas.openxmlformats.org/officeDocument/2006/math" xmlns:v="urn:schemas-microsoft-com:vml" xmlns:wp14="http://schemas.microsoft.com/office/word/2010/wordprocessingDrawing" xmlns:wp="http://schemas.openxmlformats.org/drawingml/2006/wordprocessingDrawing" xmlns:w10="urn:schemas-microsoft-com:office:word" xmlns:w="http://schemas.openxmlformats.org/wordprocessingml/2006/main" xmlns:w14="http://schemas.microsoft.com/office/word/2010/wordml" xmlns:w15="http://schemas.microsoft.com/office/word/2012/wordml" xmlns:w16cei="http://schemas.microsoft.com/office/word/2026/wordml/cei" xmlns:w16cex="http://schemas.microsoft.com/office/word/2018/wordml/cex" xmlns:w16cid="http://schemas.microsoft.com/office/word/2016/wordml/cid" xmlns:w16="http://schemas.microsoft.com/office/word/2018/wordml" xmlns:w16du="http://schemas.microsoft.com/office/word/2023/wordml/word16du" xmlns:w16sdtdh="http://schemas.microsoft.com/office/word/2020/wordml/sdtdatahash" xmlns:w16sdtfl="http://schemas.microsoft.com/office/word/2024/wordml/sdtformatlock" xmlns:w16se="http://schemas.microsoft.com/office/word/2015/wordml/symex" xmlns:wpg="http://schemas.microsoft.com/office/word/2010/wordprocessingGroup" xmlns:wpi="http://schemas.microsoft.com/office/word/2010/wordprocessingInk" xmlns:wne="http://schemas.microsoft.com/office/word/2006/wordml" xmlns:wps="http://schemas.microsoft.com/office/word/2010/wordprocessingShape" mc:Ignorable="w14 w15 w16se w16cid w16 w16cex w16sdtdh w16sdtfl w16du wp14">
   <w:body>
     <w:p>
       <w:pPr>
@@ -16,7 +16,29 @@
           <w:sz w:val="36"/>
           <w:szCs w:val="36"/>
         </w:rPr>
-        <w:t>Insert Your Capstone Article Title Here</w:t>
+        <w:t>Short</w:t>
+      </w:r>
+      <w:r>
+        <w:rPr>
+          <w:rFonts w:eastAsia="Linux Biolinum" w:cstheme="majorBidi"/>
+          <w:b/>
+          <w:bCs/>
+          <w:sz w:val="36"/>
+          <w:szCs w:val="36"/>
+        </w:rPr>
+        <w:noBreakHyphen/>
+        <w:t>Horizon Trajectory Forecasting from GPS</w:t>
+      </w:r>
+      <w:r>
+        <w:rPr>
+          <w:rFonts w:eastAsia="Linux Biolinum" w:cstheme="majorBidi"/>
+          <w:b/>
+          <w:bCs/>
+          <w:sz w:val="36"/>
+          <w:szCs w:val="36"/>
+        </w:rPr>
+        <w:noBreakHyphen/>
+        <w:t>Derived Motion Features Using Deep Sequence Models</w:t>
       </w:r>
     </w:p>
     <w:p>
@@ -30,7 +52,15 @@
           <w:sz w:val="28"/>
           <w:szCs w:val="28"/>
         </w:rPr>
-        <w:t xml:space="preserve">Insert Subtitle Here (if applicable) </w:t>
+        <w:t>A Comparative Evaluation of GRU, LSTM, and TCN Models for Short-Term Motion Prediction</w:t>
+      </w:r>
+      <w:r>
+        <w:rPr>
+          <w:rFonts w:asciiTheme="majorBidi" w:hAnsiTheme="majorBidi" w:cstheme="majorBidi"/>
+          <w:sz w:val="28"/>
+          <w:szCs w:val="28"/>
+        </w:rPr>
+        <w:t xml:space="preserve"> </w:t>
       </w:r>
     </w:p>
     <w:p/>
@@ -152,118 +182,119 @@
       <w:pPr>
         <w:pStyle w:val="Heading1"/>
         <w:rPr>
-          <w:highlight w:val="yellow"/>
+          <w:rFonts w:asciiTheme="majorBidi" w:eastAsia="Linux Libertine" w:hAnsiTheme="majorBidi"/>
         </w:rPr>
       </w:pPr>
       <w:r>
-        <w:rPr>
-          <w:highlight w:val="yellow"/>
-        </w:rPr>
-        <w:t>GENERAL WRITING GUIDELINES</w:t>
+        <w:t>ABSTRACT</w:t>
       </w:r>
     </w:p>
     <w:p>
-      <w:pPr>
-        <w:rPr>
-          <w:rFonts w:eastAsia="Times New Roman" w:cs="Times New Roman"/>
-          <w:highlight w:val="yellow"/>
-        </w:rPr>
-      </w:pPr>
-      <w:r>
-        <w:rPr>
-          <w:rFonts w:eastAsia="Times New Roman" w:cs="Times New Roman"/>
-          <w:highlight w:val="yellow"/>
-        </w:rPr>
-        <w:t>DELETE THIS SECTION BEFORE FINAL SUBMISSION</w:t>
+      <w:r>
+        <w:t>This project examines short</w:t>
+      </w:r>
+      <w:r>
+        <w:noBreakHyphen/>
+        <w:t>horizon trajectory forecasting using GPS</w:t>
+      </w:r>
+      <w:r>
+        <w:noBreakHyphen/>
+        <w:t>derived motion features from the Microsoft GeoLife dataset. The goal is to determine how accurately future position can be predicted over a one</w:t>
+      </w:r>
+      <w:r>
+        <w:noBreakHyphen/>
+        <w:t xml:space="preserve"> to five</w:t>
+      </w:r>
+      <w:r>
+        <w:noBreakHyphen/>
+        <w:t>second horizon in settings where richer sensor suites are not available. The forecasting pipeline uses engineered kinematic variables—including projected latitude/longitude deltas, speed, heading, acceleration, and turn rate—and evaluates three deep learning architectures: a GRU model, an LSTM model, and a Temporal Convolutional Network with dilated convolutions and multi</w:t>
+      </w:r>
+      <w:r>
+        <w:noBreakHyphen/>
+        <w:t>head attention. A constant</w:t>
+      </w:r>
+      <w:r>
+        <w:noBreakHyphen/>
+        <w:t>velocity baseline is included to contextualize the performance of the learned models.</w:t>
       </w:r>
     </w:p>
     <w:p>
       <w:r>
-        <w:t xml:space="preserve">This report should be written in a formal style, </w:t>
-      </w:r>
-      <w:proofErr w:type="gramStart"/>
-      <w:r>
-        <w:t>similar to</w:t>
-      </w:r>
-      <w:proofErr w:type="gramEnd"/>
-      <w:r>
-        <w:t xml:space="preserve"> an academic article or a professional white paper. You should write </w:t>
-      </w:r>
-      <w:proofErr w:type="gramStart"/>
-      <w:r>
-        <w:t>for</w:t>
-      </w:r>
-      <w:proofErr w:type="gramEnd"/>
-      <w:r>
-        <w:t xml:space="preserve"> an audience of semi-technical stakeholders, such as a VP of engineering or a CTO. You can </w:t>
-      </w:r>
-      <w:proofErr w:type="gramStart"/>
-      <w:r>
-        <w:t>assume</w:t>
-      </w:r>
-      <w:proofErr w:type="gramEnd"/>
-      <w:r>
-        <w:t xml:space="preserve"> some technical </w:t>
-      </w:r>
-      <w:bookmarkStart w:id="0" w:name="_Int_xnK9Yxka"/>
-      <w:proofErr w:type="gramStart"/>
-      <w:r>
-        <w:t>knowledge, but</w:t>
-      </w:r>
-      <w:bookmarkEnd w:id="0"/>
-      <w:proofErr w:type="gramEnd"/>
-      <w:r>
-        <w:t xml:space="preserve"> keep the details at a level that would be interesting to this group. For example, in describing your model architecture, you should give details about the number of hidden layers, nodes, and activation functions used, but not the specific lines of code or names of function calls used to build it.</w:t>
+        <w:t>The system incorporates global normalization, per</w:t>
+      </w:r>
+      <w:r>
+        <w:t>-</w:t>
+      </w:r>
+      <w:r>
+        <w:t>window normalization, adaptive window caps, and a streaming window generator to ensure stable training on long and heterogeneous trajectories. All models are trained and evaluated using displacement</w:t>
+      </w:r>
+      <w:r>
+        <w:t>-</w:t>
+      </w:r>
+      <w:r>
+        <w:t xml:space="preserve">based metrics computed </w:t>
+      </w:r>
+      <w:r>
+        <w:t>in normalized coordinate space. These metrics quantify short</w:t>
+      </w:r>
+      <w:r>
+        <w:t>-</w:t>
+      </w:r>
+      <w:r>
+        <w:t xml:space="preserve">term prediction accuracy across the </w:t>
+      </w:r>
+      <w:r>
+        <w:t>five</w:t>
+      </w:r>
+      <w:r>
+        <w:t>-</w:t>
+      </w:r>
+      <w:r>
+        <w:t>step forecast horizon</w:t>
+      </w:r>
+      <w:r>
+        <w:t xml:space="preserve"> but should not be interpreted as physical distance errors in meters</w:t>
+      </w:r>
+      <w:r>
+        <w:t>.</w:t>
       </w:r>
     </w:p>
     <w:p>
-      <w:pPr>
-        <w:rPr>
-          <w:rFonts w:eastAsia="Times New Roman" w:cs="Times New Roman"/>
-        </w:rPr>
-      </w:pPr>
-      <w:r>
-        <w:t xml:space="preserve">Under each section of this template, and in the weekly assignment instructions in Canvas, you will find a list of questions that are meant to guide you in terms of what information should be included in each section. </w:t>
-      </w:r>
-      <w:r>
-        <w:rPr>
-          <w:highlight w:val="yellow"/>
-        </w:rPr>
-        <w:t>DO NOT SUBMIT A LIST OF QUESTIONS AND ANSWERS</w:t>
-      </w:r>
-      <w:r>
-        <w:t>. A reader should be able to answer these questions after reading your text if they are relevant to your project; they do not need to be answered explicitly, and you should avoid repeating information in your report just for the sake of answering each question independently.</w:t>
-      </w:r>
-    </w:p>
-    <w:p>
-      <w:pPr>
-        <w:rPr>
-          <w:rFonts w:asciiTheme="majorBidi" w:eastAsia="Linux Libertine" w:hAnsiTheme="majorBidi" w:cstheme="majorBidi"/>
-        </w:rPr>
-      </w:pPr>
-      <w:r>
-        <w:t>A selection of formatting examples can be found in Section 7 of this document. Please refer to these examples for the proper way to include figures, tables, equations, and in-text citations, along with other general formatting guidelines.</w:t>
-      </w:r>
-    </w:p>
-    <w:p>
-      <w:pPr>
-        <w:pStyle w:val="Heading1"/>
-        <w:rPr>
-          <w:rFonts w:asciiTheme="majorBidi" w:eastAsia="Linux Libertine" w:hAnsiTheme="majorBidi"/>
-        </w:rPr>
-      </w:pPr>
-      <w:r>
-        <w:t>ABSTRACT</w:t>
-      </w:r>
-    </w:p>
-    <w:p>
-      <w:pPr>
-        <w:rPr>
-          <w:rFonts w:eastAsia="Times New Roman" w:cs="Times New Roman"/>
-        </w:rPr>
-      </w:pPr>
-      <w:r>
-        <w:t>The abstract should be the last piece of your report that you write and will be a 1-2 paragraph overview of your entire project. As a rough guide, you should expect to have 1-2 sentences introducing the problem and your chosen dataset, 3-4 sentences describing your chosen methods, and 1-2 sentences summarizing your project results.</w:t>
+      <w:r>
+        <w:t xml:space="preserve">Results show that all learned models outperform the </w:t>
+      </w:r>
+      <w:r>
+        <w:t xml:space="preserve">constant-velocity </w:t>
+      </w:r>
+      <w:r>
+        <w:t xml:space="preserve">baseline, with the tuned LSTM achieving the strongest overall displacement-error performance across </w:t>
+      </w:r>
+      <w:r>
+        <w:t xml:space="preserve">the </w:t>
+      </w:r>
+      <w:r>
+        <w:t xml:space="preserve">validation and test sets. After </w:t>
+      </w:r>
+      <w:r>
+        <w:t>memory and preprocessing constraints</w:t>
+      </w:r>
+      <w:r>
+        <w:t xml:space="preserve"> were addressed</w:t>
+      </w:r>
+      <w:r>
+        <w:t xml:space="preserve">, the TCN </w:t>
+      </w:r>
+      <w:r>
+        <w:t>achieved</w:t>
+      </w:r>
+      <w:r>
+        <w:t xml:space="preserve"> competitive ADE and FDE values but </w:t>
+      </w:r>
+      <w:r>
+        <w:t>retained</w:t>
+      </w:r>
+      <w:r>
+        <w:t xml:space="preserve"> higher maximum displacement errors than the LSTM. These findings demonstrate that accurate short-term motion forecasting is feasible using only GPS-derived features and that the final pipeline provides a strong foundation for future work in real-time mobility analytics.</w:t>
       </w:r>
     </w:p>
     <w:p>
@@ -282,16 +313,27 @@
     <w:p>
       <w:pPr>
         <w:spacing w:after="60"/>
-        <w:rPr>
-          <w:rFonts w:asciiTheme="majorBidi" w:eastAsia="Linux Libertine" w:hAnsiTheme="majorBidi" w:cstheme="majorBidi"/>
-          <w:color w:val="000000"/>
-        </w:rPr>
-      </w:pPr>
-      <w:r>
-        <w:rPr>
-          <w:rFonts w:eastAsia="Linux Libertine" w:cstheme="majorBidi"/>
-        </w:rPr>
-        <w:t xml:space="preserve">Insert Applicable Keywords Here. Insert Applicable Keywords Here.  </w:t>
+      </w:pPr>
+      <w:r>
+        <w:t>Short</w:t>
+      </w:r>
+      <w:r>
+        <w:t>-</w:t>
+      </w:r>
+      <w:r>
+        <w:t>horizon trajectory forecasting; GPS</w:t>
+      </w:r>
+      <w:r>
+        <w:t>-</w:t>
+      </w:r>
+      <w:r>
+        <w:t>derived motion features; GeoLife dataset; deep learning; GRU; LSTM; Temporal Convolutional Network; kinematic feature engineering; mobility analytics; real</w:t>
+      </w:r>
+      <w:r>
+        <w:t>-</w:t>
+      </w:r>
+      <w:r>
+        <w:t>time prediction.</w:t>
       </w:r>
     </w:p>
     <w:p>
@@ -309,73 +351,31 @@
     </w:p>
     <w:p>
       <w:r>
-        <w:t>Understanding and predicting short</w:t>
-      </w:r>
-      <w:r>
-        <w:noBreakHyphen/>
-        <w:t>term motion from minimal sensor data is a foundational capability in modern intelligent systems. Many real</w:t>
-      </w:r>
-      <w:r>
-        <w:noBreakHyphen/>
-        <w:t>world environments rely on GPS as the only consistently available signal, especially in transportation analytics, such as large</w:t>
-      </w:r>
-      <w:r>
-        <w:noBreakHyphen/>
-        <w:t xml:space="preserve">scale mobility studies that infer movement patterns from raw GPS traces (Zheng et al., 2008), </w:t>
+        <w:t>This project addresses the problem of short</w:t>
+      </w:r>
+      <w:r>
+        <w:t>-</w:t>
+      </w:r>
+      <w:r>
+        <w:t xml:space="preserve">horizon trajectory forecasting using only timestamps and GPS coordinates, with the goal of </w:t>
       </w:r>
       <w:r>
         <w:lastRenderedPageBreak/>
-        <w:t>mobility</w:t>
-      </w:r>
-      <w:r>
-        <w:noBreakHyphen/>
-        <w:t>as</w:t>
-      </w:r>
-      <w:r>
-        <w:noBreakHyphen/>
-        <w:t>a</w:t>
-      </w:r>
-      <w:r>
-        <w:noBreakHyphen/>
-        <w:t>service platforms that depend on smartphone GPS for real</w:t>
-      </w:r>
-      <w:r>
-        <w:noBreakHyphen/>
-        <w:t>time positioning (Zandbergen &amp; Barbeau, 2011), and safety</w:t>
-      </w:r>
-      <w:r>
-        <w:noBreakHyphen/>
-        <w:t>critical monitoring systems where continuous geolocation is required to detect abnormal or hazardous motion (Zheng et al., 2010). This project addresses the problem of short</w:t>
-      </w:r>
-      <w:r>
-        <w:noBreakHyphen/>
-        <w:t xml:space="preserve">horizon trajectory forecasting using only timestamps and GPS coordinates, with the goal of predicting an agent’s future position one to five seconds ahead. The central question guiding this work is: </w:t>
-      </w:r>
-      <w:r>
-        <w:rPr>
-          <w:i/>
-          <w:iCs/>
-        </w:rPr>
+        <w:t xml:space="preserve">predicting an agent’s future position one to five seconds ahead. The central question guiding this work is: </w:t>
+      </w:r>
+      <w:r>
         <w:t>How accurately can we forecast near</w:t>
       </w:r>
       <w:r>
-        <w:noBreakHyphen/>
-      </w:r>
-      <w:r>
-        <w:rPr>
-          <w:i/>
-          <w:iCs/>
-        </w:rPr>
+        <w:t>-</w:t>
+      </w:r>
+      <w:r>
         <w:t>term motion using only raw latitude, longitude, and time, without access to richer sensor suites such as IMUs, cameras, or wheel</w:t>
       </w:r>
       <w:r>
-        <w:noBreakHyphen/>
-      </w:r>
-      <w:r>
-        <w:rPr>
-          <w:i/>
-          <w:iCs/>
-        </w:rPr>
+        <w:t>-</w:t>
+      </w:r>
+      <w:r>
         <w:t>speed sensors?</w:t>
       </w:r>
     </w:p>
@@ -427,10 +427,7 @@
         <w:noBreakHyphen/>
       </w:r>
       <w:r>
-        <w:t xml:space="preserve">scale collection of </w:t>
-      </w:r>
-      <w:r>
-        <w:t>real</w:t>
+        <w:t>scale collection of real</w:t>
       </w:r>
       <w:r>
         <w:noBreakHyphen/>
@@ -442,7 +439,10 @@
         <w:noBreakHyphen/>
       </w:r>
       <w:r>
-        <w:t>year period (Zheng et al., 2008; Microsoft Research Asia, 2012). The dataset contains more than 17,000 trajectories covering over 1.2 million kilometers of movement, with 91% of trajectories sampled every 1-5 seconds (Zheng et al., 2010). Each trajectory provides latitude, longitude, altitude, and timestamp information, enabling the derivation of kinematic features such as speed, heading, and acceleration. The dataset includes walking, biking, and driving trajectories, offering rich behavioral diversity and realistic GPS noise. Its high sampling rate and clean geospatial structure make it well suited for short</w:t>
+        <w:t xml:space="preserve">year period (Zheng et al., 2008; Microsoft Research Asia, 2012). The dataset contains more than 17,000 trajectories covering over 1.2 million kilometers of movement, with 91% of trajectories sampled every 1-5 seconds (Zheng et al., 2010). Each trajectory provides latitude, longitude, altitude, and timestamp information, enabling the derivation of kinematic </w:t>
+      </w:r>
+      <w:r>
+        <w:t>features such as speed, heading, and acceleration. The dataset includes walking, biking, and driving trajectories, offering rich behavioral diversity and realistic GPS noise. Its high sampling rate and clean geospatial structure make it well suited for short</w:t>
       </w:r>
       <w:r>
         <w:noBreakHyphen/>
@@ -456,16 +456,37 @@
         <w:t>The overarching goal of this project is to build a lightweight, real</w:t>
       </w:r>
       <w:r>
-        <w:noBreakHyphen/>
+        <w:t>-</w:t>
       </w:r>
       <w:r>
         <w:t>time forecasting model capable of predicting future positions over short horizons. The working hypothesis is that even with limited inputs, a combination of derived kinematic features and sequence</w:t>
       </w:r>
       <w:r>
-        <w:noBreakHyphen/>
-      </w:r>
-      <w:r>
-        <w:t>based neural models—such as LSTMs or temporal convolutional networks—can achieve accurate and stable predictions. The final deliverable will be a small, deployable inference module that accepts a stream of GPS points and outputs predicted positions for the next several seconds. Model performance will be evaluated using geodesic displacement metrics, latency measurements, and visual comparisons between predicted and actual trajectories.</w:t>
+        <w:t>-</w:t>
+      </w:r>
+      <w:r>
+        <w:t xml:space="preserve">based neural models—such as LSTMs or temporal convolutional networks—can achieve accurate and stable predictions. The final deliverable </w:t>
+      </w:r>
+      <w:r>
+        <w:t>is</w:t>
+      </w:r>
+      <w:r>
+        <w:t xml:space="preserve"> a small, deployable inference module that accepts a stream of GPS points and outputs predicted positions for the next several seconds. Model performance </w:t>
+      </w:r>
+      <w:r>
+        <w:t>is</w:t>
+      </w:r>
+      <w:r>
+        <w:t xml:space="preserve"> evaluated using </w:t>
+      </w:r>
+      <w:r>
+        <w:t xml:space="preserve">displacement metrics, latency </w:t>
+      </w:r>
+      <w:r>
+        <w:t>considerations</w:t>
+      </w:r>
+      <w:r>
+        <w:t>, and visual comparisons between predicted and actual trajectories.</w:t>
       </w:r>
     </w:p>
     <w:p>
@@ -486,116 +507,158 @@
         <w:t>The dataset used in this project is the Microsoft GeoLife GPS Trajectory Dataset, a collection of time</w:t>
       </w:r>
       <w:r>
+        <w:noBreakHyphen/>
+        <w:t>ordered GPS traces recorded by 182 users over a five</w:t>
+      </w:r>
+      <w:r>
+        <w:noBreakHyphen/>
+        <w:t>year period (Microsoft Research Asia, 2012). Each record contains raw latitude, longitude, altitude, and timestamp information, and each trajectory represents a continuous sequence of these observations. From these raw positional variables, several motion</w:t>
+      </w:r>
+      <w:r>
+        <w:noBreakHyphen/>
+        <w:t>related features were derived to support short</w:t>
+      </w:r>
+      <w:r>
+        <w:noBreakHyphen/>
+        <w:t>horizon forecasting.</w:t>
+      </w:r>
+    </w:p>
+    <w:p>
+      <w:r>
+        <w:t>Although many GPS</w:t>
+      </w:r>
+      <w:r>
         <w:t>-</w:t>
       </w:r>
       <w:r>
-        <w:t xml:space="preserve">ordered GPS trajectory records released by Microsoft Research Asia (Microsoft Research Asia, 2012). </w:t>
-      </w:r>
-      <w:r>
-        <w:t>In this report, a record refers to one time</w:t>
+        <w:t>based forecasting systems convert latitude and longitude into a local Cartesian frame such as East</w:t>
       </w:r>
       <w:r>
         <w:t>-</w:t>
       </w:r>
       <w:r>
-        <w:t xml:space="preserve">stamped GPS observation within a trajectory, while a trajectory refers to the ordered sequence of observations that make up a trip segment. </w:t>
-      </w:r>
-      <w:r>
-        <w:t xml:space="preserve">Each </w:t>
+        <w:t>North</w:t>
+      </w:r>
+      <w:r>
+        <w:t>-</w:t>
+      </w:r>
+      <w:r>
+        <w:t xml:space="preserve">Up (ENU), the final pipeline for this project did </w:t>
+      </w:r>
+      <w:r>
+        <w:t>not</w:t>
+      </w:r>
+      <w:r>
+        <w:t xml:space="preserve"> apply an ENU transformation. Instead, all positional variables were processed directly in </w:t>
+      </w:r>
+      <w:r>
+        <w:t>normalized</w:t>
+      </w:r>
+      <w:r>
+        <w:t xml:space="preserve"> </w:t>
       </w:r>
       <w:r>
         <w:lastRenderedPageBreak/>
-        <w:t>record includes raw positional information</w:t>
-      </w:r>
-      <w:r>
-        <w:t>,</w:t>
-      </w:r>
-      <w:r>
-        <w:t xml:space="preserve"> and several engineered motion variables </w:t>
-      </w:r>
-      <w:r>
-        <w:t xml:space="preserve">were </w:t>
-      </w:r>
-      <w:r>
-        <w:t xml:space="preserve">derived from </w:t>
-      </w:r>
-      <w:r>
-        <w:t xml:space="preserve">consecutive </w:t>
-      </w:r>
-      <w:r>
-        <w:t xml:space="preserve">positions. </w:t>
-      </w:r>
-      <w:r>
-        <w:t xml:space="preserve">The </w:t>
-      </w:r>
-      <w:r>
-        <w:t xml:space="preserve">timestamp variable provides the chronological ordering </w:t>
-      </w:r>
-      <w:r>
-        <w:t>needed to compute</w:t>
-      </w:r>
-      <w:r>
-        <w:t xml:space="preserve"> motion dynamics</w:t>
-      </w:r>
-      <w:r>
-        <w:t xml:space="preserve">, and the </w:t>
-      </w:r>
-      <w:r>
-        <w:t>time</w:t>
+        <w:t>global</w:t>
+      </w:r>
+      <w:r>
+        <w:t xml:space="preserve"> </w:t>
+      </w:r>
+      <w:r>
+        <w:t>latitude/longitude space</w:t>
+      </w:r>
+      <w:r>
+        <w:t>. Normalization</w:t>
+      </w:r>
+      <w:r>
+        <w:t xml:space="preserve"> parameters were computed from the training set, and each sliding window was additionally normalized on a per</w:t>
       </w:r>
       <w:r>
         <w:t>-</w:t>
       </w:r>
       <w:r>
-        <w:t xml:space="preserve">delta variable </w:t>
-      </w:r>
-      <w:r>
-        <w:t>measures</w:t>
-      </w:r>
-      <w:r>
-        <w:t xml:space="preserve"> the interval between consecutive samples. </w:t>
-      </w:r>
-      <w:r>
-        <w:t>Although</w:t>
-      </w:r>
-      <w:r>
-        <w:t xml:space="preserve"> GPS devices often attempt to record at a fixed sampling rate</w:t>
-      </w:r>
-      <w:r>
-        <w:t xml:space="preserve">, </w:t>
-      </w:r>
-      <w:r>
-        <w:t>commonly one sample per second</w:t>
-      </w:r>
-      <w:r>
-        <w:t xml:space="preserve">, </w:t>
-      </w:r>
-      <w:r>
-        <w:t>real</w:t>
-      </w:r>
-      <w:r>
-        <w:t>-</w:t>
-      </w:r>
-      <w:r>
-        <w:t xml:space="preserve">world conditions such as signal obstruction or device latency </w:t>
-      </w:r>
-      <w:r>
-        <w:t>can</w:t>
-      </w:r>
-      <w:r>
-        <w:t xml:space="preserve"> introduce </w:t>
-      </w:r>
-      <w:r>
-        <w:t>irregular intervals</w:t>
-      </w:r>
-      <w:r>
-        <w:t xml:space="preserve"> (Zandbergen &amp; Barbeau, 2011). These irregularities directly </w:t>
-      </w:r>
-      <w:r>
-        <w:t>affect</w:t>
-      </w:r>
-      <w:r>
-        <w:t xml:space="preserve"> the stability of derived motion variables.</w:t>
+        <w:t xml:space="preserve">window basis. This approach ensured numerical stability during training while preserving the underlying spatial relationships encoded in the raw coordinates. All displacement metrics reported in the Results section therefore reflect </w:t>
+      </w:r>
+      <w:r>
+        <w:t>normalized coordinate units,</w:t>
+      </w:r>
+      <w:r>
+        <w:t xml:space="preserve"> not physical distances in meters.</w:t>
+      </w:r>
+    </w:p>
+    <w:p>
+      <w:r>
+        <w:t>From the normalized positional data, several kinematic variables were derived. Instantaneous speed was computed as the change in position over time, and acceleration was computed from changes in speed across consecutive samples. Heading was calculated from the bearing between successive latitude/longitude points, and turn rate was derived from changes in heading. Because heading is an angular quantity that wraps at ±π, discontinuities can occur when a smooth turn crosses this boundary. These discontinuities can inflate turn</w:t>
+      </w:r>
+      <w:r>
+        <w:noBreakHyphen/>
+        <w:t>rate values unless heading is unwrapped; this behavior was observed during exploratory analysis and represents an important consideration for future preprocessing improvements.</w:t>
+      </w:r>
+    </w:p>
+    <w:p>
+      <w:r>
+        <w:t>The GeoLife dataset exhibits several real</w:t>
+      </w:r>
+      <w:r>
+        <w:noBreakHyphen/>
+        <w:t>world artifacts that influence the stability of derived motion variables. Although many trajectories are sampled at approximately one</w:t>
+      </w:r>
+      <w:r>
+        <w:noBreakHyphen/>
+        <w:t>second intervals, irregular timestamp gaps occur due to signal obstruction, device latency, or environmental conditions (Zandbergen &amp; Barbeau, 2011). These irregularities directly affect speed, acceleration, and turn</w:t>
+      </w:r>
+      <w:r>
+        <w:noBreakHyphen/>
+        <w:t>rate calculations, occasionally producing spikes that reflect sampling noise rather than true motion. A small number of trajectories also contain very short sequences that are unsuitable for temporal modeling. To mitigate these issues, explicit time</w:t>
+      </w:r>
+      <w:r>
+        <w:noBreakHyphen/>
+        <w:t xml:space="preserve">delta calculations were incorporated, and trajectories were inspected for physically </w:t>
+      </w:r>
+      <w:r>
+        <w:t>implausible values such as excessively high speeds or accelerations.</w:t>
+      </w:r>
+    </w:p>
+    <w:p>
+      <w:r>
+        <w:t>Despite these challenges, the derived variables exhibit meaningful temporal structure. Speed tends to vary smoothly except where timestamp irregularities introduce noise. Acceleration is more volatile but still reflects recognizable driving behaviors such as gradual acceleration, steady cruising, and braking. Heading and turn rate capture directional stability during straight segments and distinct rotational patterns during turns. These characteristics make the GeoLife dataset well</w:t>
+      </w:r>
+      <w:r>
+        <w:noBreakHyphen/>
+        <w:t>suited for short</w:t>
+      </w:r>
+      <w:r>
+        <w:noBreakHyphen/>
+        <w:t>horizon forecasting tasks and provide a strong foundation for learning near</w:t>
+      </w:r>
+      <w:r>
+        <w:noBreakHyphen/>
+        <w:t>term motion dynamics.</w:t>
+      </w:r>
+    </w:p>
+    <w:p>
+      <w:pPr>
+        <w:pStyle w:val="Heading1"/>
+      </w:pPr>
+      <w:r>
+        <w:t>3 Literature Review</w:t>
+      </w:r>
+      <w:r>
+        <w:t xml:space="preserve"> </w:t>
+      </w:r>
+    </w:p>
+    <w:p>
+      <w:r>
+        <w:t>Short‑horizon trajectory forecasting has been explored extensively across transportation analytics, mobility modeling, and geospatial prediction, with numerous methods designed to estimate near‑term motion from positional data. Early approaches relied on classical kinematic models that assume constant velocity or constant acceleration. These models propagate future positions by integrating estimated speed and heading over short horizons and have been widely used in navigation and robotics applications due to their simplicity and low computational cost (Teunissen &amp; Montenbruck, 2017). Although effective in stable motion regimes, these approaches struggle with nonlinear trajectories, sharp turns, and GPS noise, limiting their accuracy in real‑world environments.</w:t>
+      </w:r>
+    </w:p>
+    <w:p>
+      <w:r>
+        <w:t xml:space="preserve">More sophisticated forecasting systems incorporate Bayesian filtering techniques such as the Kalman filter and its variants. These methods model motion as a dynamical system with latent velocity and acceleration states, enabling smoother estimates of position and heading and reducing the impact of GPS jitter. Kalman‑based </w:t>
+      </w:r>
+      <w:r>
+        <w:lastRenderedPageBreak/>
+        <w:t>approaches have been applied extensively in vehicle tracking, pedestrian localization, and sensor fusion tasks, demonstrating improved stability over purely kinematic models (Sola, 2017). However, these methods often assume linear dynamics or require additional sensors such as IMUs to achieve high accuracy, making them less suitable for GPS‑only scenarios.</w:t>
       </w:r>
     </w:p>
     <w:p>
@@ -606,824 +669,346 @@
         </w:rPr>
       </w:pPr>
       <w:r>
-        <w:t xml:space="preserve">Spatial coordinates were converted from latitude and longitude into a local East-North-Up (ENU) reference frame, a standard Cartesian coordinate system that expresses positions in meters relative to a fixed origin (Teunissen &amp; </w:t>
-      </w:r>
-      <w:proofErr w:type="spellStart"/>
-      <w:r>
-        <w:t>Montenbruck</w:t>
-      </w:r>
-      <w:proofErr w:type="spellEnd"/>
-      <w:r>
-        <w:t>, 2017). This conversion makes distance, speed, and acceleration calculations more interpretable because the coordinates are measured in linear units rather than degrees. Instantaneous speed was computed as the change in position over time, and acceleration was derived from changes in speed across consecutive samples. Heading, expressed in radians, represents the direction of travel relative to true north, while turn rate captures how quickly that heading changes. Because heading is an angular quantity, it wraps around at ±π, which can create artificial discontinuities unless it is unwrapped before turn rate is calculated (Sola, 2017). Together, these variables describe the vehicle’s motion state at each point in the trajectory.</w:t>
+        <w:t>Commercial mobility platforms also address short</w:t>
+      </w:r>
+      <w:r>
+        <w:noBreakHyphen/>
+        <w:t>term motion prediction using map</w:t>
+      </w:r>
+      <w:r>
+        <w:noBreakHyphen/>
+        <w:t>matching algorithms and route</w:t>
+      </w:r>
+      <w:r>
+        <w:noBreakHyphen/>
+        <w:t>constrained forecasting. Ride</w:t>
+      </w:r>
+      <w:r>
+        <w:noBreakHyphen/>
+        <w:t>sharing and navigation systems frequently combine GPS traces with road</w:t>
+      </w:r>
+      <w:r>
+        <w:noBreakHyphen/>
+        <w:t>network information to infer likely paths and estimate near</w:t>
+      </w:r>
+      <w:r>
+        <w:noBreakHyphen/>
+        <w:t>term movement (Zandbergen &amp; Barbeau, 2011). Large</w:t>
+      </w:r>
+      <w:r>
+        <w:noBreakHyphen/>
+        <w:t>scale navigation systems such as Google Maps use learned motion models to predict driver arrival times and detect deviations from expected behavior, demonstrating the practical importance of short</w:t>
+      </w:r>
+      <w:r>
+        <w:noBreakHyphen/>
+        <w:t>horizon forecasting in operational environments (Derrow-Pinion et al., 2021).</w:t>
       </w:r>
     </w:p>
     <w:p>
       <w:r>
-        <w:t xml:space="preserve">Exploratory analysis revealed several data quality issues that could affect model stability. The most prominent issue was irregular timestamp intervals, where the expected one-second sampling rate occasionally deviated. Because speed, acceleration, and turn rate all depend on the time </w:t>
-      </w:r>
-      <w:r>
-        <w:t xml:space="preserve">delta between samples, these deviations produced spikes in derived variables that may reflect sampling noise rather than true motion. Heading values also exhibited discontinuities near ±π, a known artifact of angular wraparound that can artificially inflate turn rate calculations. In addition, a small number of trajectories contained extremely short sequences that were not suitable for meaningful temporal modeling. To address these issues, the dataset was regularized by computing explicit time deltas, identifying outliers, and validating that most samples adhered to the expected sampling interval. </w:t>
+        <w:t>Recent advances in machine learning have led to the adoption of sequence‑based neural models for trajectory prediction. Recurrent neural networks, particularly long short‑term memory (LSTM) networks and gated recurrent units (GRUs), were originally developed to capture long‑range temporal dependencies in sequential data (Hochreiter &amp; Schmidhuber, 1997; Cho et al., 2014). These architectures have since been adapted for mobility forecasting, where they learn nonlinear relationships between displacement, speed, heading, and future motion. Studies applying LSTMs and GRUs to pedestrian and vehicle trajectories have shown substantial improvements over classical baselines, especially in settings with irregular motion patterns or noisy sensor inputs (Zheng et al., 2008).</w:t>
       </w:r>
     </w:p>
     <w:p>
-      <w:pPr>
-        <w:rPr>
-          <w:kern w:val="2"/>
-          <w14:ligatures w14:val="standardContextual"/>
-        </w:rPr>
-      </w:pPr>
-      <w:r>
-        <w:t>Derived variables were inspected for physically implausible values, such as speeds exceeding 50 meters per second or accelerations greater than 10 meters per second squared, which typically indicate noise rather than true vehicle behavior. A fully developed machine learning pipeline would require more robust preprocessing, including smoothing filters, interpolation for missing timestamps, heading unwrapping, and automated outlier removal to ensure stable model inputs.</w:t>
+      <w:r>
+        <w:t>Temporal convolutional networks (TCNs) represent another major development in sequence modeling. By using dilated causal convolutions, TCNs can model long temporal contexts efficiently while maintaining stable gradients and low inference latency. Bai et al. (2018) demonstrated that TCNs outperform many recurrent architectures on sequence‑prediction tasks, making them well‑suited for real‑time forecasting applications. Their ability to process sequences in parallel also makes them attractive for deployment in systems requiring rapid inference.</w:t>
       </w:r>
     </w:p>
     <w:p>
-      <w:pPr>
-        <w:rPr>
-          <w:kern w:val="2"/>
-          <w14:ligatures w14:val="standardContextual"/>
-        </w:rPr>
-      </w:pPr>
-      <w:r>
-        <w:t xml:space="preserve">The variables in this dataset align directly with the project’s goal of forecasting short-term vehicle motion. Speed, acceleration, and turn rate provide complementary signals about how a vehicle is likely to move </w:t>
-      </w:r>
-      <w:proofErr w:type="gramStart"/>
-      <w:r>
-        <w:t>in the near future</w:t>
-      </w:r>
-      <w:proofErr w:type="gramEnd"/>
-      <w:r>
-        <w:t xml:space="preserve">: speed captures current motion intensity, acceleration captures changes in that motion, and turn rate captures directional change. Exploratory analysis suggests that these variables contain meaningful temporal structure. Speed tends to vary smoothly over time except when timestamp irregularities introduce artifacts, indicating that short-term forecasting models should be able to learn predictable trends. Acceleration is more volatile but still reflects recognizable driving behaviors such as gradual acceleration, steady cruising, and braking. Heading and turn rate reveal directional stability during straight segments and distinct rotational </w:t>
-      </w:r>
-      <w:r>
-        <w:lastRenderedPageBreak/>
-        <w:t>patterns during turns, both of which are essential for predicting future position. Although noise is present in these variables, the underlying patterns remain strong enough to support predictive modeling.</w:t>
+      <w:r>
+        <w:t>The suitability of these machine learning methods for GPS‑only forecasting is supported by extensive prior work using the Microsoft GeoLife GPS Trajectory Dataset. GeoLife contains more than 17,000 trajectories recorded by 182 users, with 91% of trajectories sampled every one to five seconds (Microsoft Research Asia, 2012). This dense sampling enables accurate derivation of kinematic features such as speed, acceleration, heading, and turn rate, which have been shown to improve the stability and accuracy of short‑horizon prediction models (Zheng et al., 2010). Research using GeoLife has demonstrated its effectiveness for mobility pattern mining, transportation mode classification, and location prediction, establishing it as a widely used benchmark for GPS‑based forecasting tasks.</w:t>
       </w:r>
     </w:p>
     <w:p>
-      <w:pPr>
-        <w:pStyle w:val="Heading1"/>
-      </w:pPr>
-      <w:r>
-        <w:t>3 Literature Review</w:t>
-      </w:r>
-      <w:r>
-        <w:t xml:space="preserve"> </w:t>
+      <w:r>
+        <w:t xml:space="preserve">Several academic and commercial projects illustrate the application of these methods to problems similar to the one addressed in this capstone. LSTM‑based models have been used to predict pedestrian trajectories in crowded environments, vehicle motion in urban traffic, and multimodal mobility patterns across large‑scale GPS datasets (Zheng et al., 2008). GRU‑based encoder–decoder architectures have been applied to short‑term motion prediction in transportation </w:t>
+      </w:r>
+      <w:r>
+        <w:lastRenderedPageBreak/>
+        <w:t>networks, while TCNs have been used in real‑time mobility analytics where low latency and temporal stability are critical (Bai et al., 2018). Commercial navigation systems employ variants of kinematic and learned motion models to estimate driver arrival times and detect anomalous movement. Collectively, these examples demonstrate that sequence‑based neural architectures and derived kinematic features are well‑suited for short‑horizon trajectory forecasting using GPS‑only inputs.</w:t>
       </w:r>
     </w:p>
     <w:p>
-      <w:r>
-        <w:t xml:space="preserve">Short‑horizon trajectory forecasting has been explored extensively across transportation analytics, mobility modeling, and geospatial prediction, with numerous methods designed to estimate near‑term motion from positional data. Early approaches relied on classical kinematic models that assume constant velocity or constant acceleration. These models propagate future positions by integrating estimated speed and heading over short horizons and have been widely used in navigation and robotics applications due to their simplicity and low computational cost (Teunissen &amp; </w:t>
-      </w:r>
-      <w:proofErr w:type="spellStart"/>
-      <w:r>
-        <w:t>Montenbruck</w:t>
-      </w:r>
-      <w:proofErr w:type="spellEnd"/>
-      <w:r>
-        <w:t>, 2017). Although effective in stable motion regimes, these approaches struggle with nonlinear trajectories, sharp turns, and GPS noise, limiting their accuracy in real‑world environments.</w:t>
+      <w:pPr>
+        <w:pStyle w:val="Heading1"/>
+      </w:pPr>
+      <w:r>
+        <w:t>4 Methodology</w:t>
       </w:r>
     </w:p>
     <w:p>
       <w:r>
-        <w:t>More sophisticated forecasting systems incorporate Bayesian filtering techniques such as the Kalman filter and its variants. These methods model motion as a dynamical system with latent velocity and acceleration states, enabling smoother estimates of position and heading and reducing the impact of GPS jitter. Kalman‑based approaches have been applied extensively in vehicle tracking, pedestrian localization, and sensor fusion tasks, demonstrating improved stability over purely kinematic models (Sola, 2017). However, these methods often assume linear dynamics or require additional sensors such as IMUs to achieve high accuracy, making them less suitable for GPS‑only scenarios.</w:t>
+        <w:t>The forecasting system developed for this project uses engineered kinematic features, sliding</w:t>
+      </w:r>
+      <w:r>
+        <w:noBreakHyphen/>
+        <w:t>window sequence extraction, and three deep learning architectures—GRU, LSTM, and a Temporal Convolutional Network (TCN)—to predict short</w:t>
+      </w:r>
+      <w:r>
+        <w:noBreakHyphen/>
+        <w:t>horizon motion from GPS</w:t>
+      </w:r>
+      <w:r>
+        <w:noBreakHyphen/>
+        <w:t>derived inputs. A classical constant</w:t>
+      </w:r>
+      <w:r>
+        <w:noBreakHyphen/>
+        <w:t xml:space="preserve">velocity baseline model is included to contextualize the performance of the learned models. This section describes the final model </w:t>
+      </w:r>
+      <w:r>
+        <w:t>architecture</w:t>
+      </w:r>
+      <w:r>
+        <w:t>, preprocessing pipeline, training procedures, and optimization strategy used in the project.</w:t>
       </w:r>
     </w:p>
     <w:p>
-      <w:pPr>
-        <w:rPr>
-          <w:kern w:val="2"/>
-          <w14:ligatures w14:val="standardContextual"/>
-        </w:rPr>
-      </w:pPr>
-      <w:r>
-        <w:t>Commercial mobility platforms also address short</w:t>
-      </w:r>
-      <w:r>
-        <w:noBreakHyphen/>
-        <w:t>term motion prediction using map</w:t>
-      </w:r>
-      <w:r>
-        <w:noBreakHyphen/>
-        <w:t>matching algorithms and route</w:t>
-      </w:r>
-      <w:r>
-        <w:noBreakHyphen/>
-        <w:t>constrained forecasting. Ride</w:t>
-      </w:r>
-      <w:r>
-        <w:noBreakHyphen/>
-        <w:t>sharing and navigation systems frequently combine GPS traces with road</w:t>
-      </w:r>
-      <w:r>
-        <w:noBreakHyphen/>
-        <w:t>network information to infer likely paths and estimate near</w:t>
-      </w:r>
-      <w:r>
-        <w:noBreakHyphen/>
-        <w:t>term movement (Zandbergen &amp; Barbeau, 2011). Large</w:t>
-      </w:r>
-      <w:r>
-        <w:noBreakHyphen/>
-        <w:t>scale navigation systems such as Google Maps use learned motion models to predict driver arrival times and detect deviations from expected behavior, demonstrating the practical importance of short</w:t>
-      </w:r>
-      <w:r>
-        <w:noBreakHyphen/>
-        <w:t>horizon forecasting in operational environments (Derrow-Pinion et al., 2021).</w:t>
+      <w:r>
+        <w:t>The forecasting problem is formulated as a supervised sequence</w:t>
+      </w:r>
+      <w:r>
+        <w:t>-</w:t>
+      </w:r>
+      <w:r>
+        <w:t>to</w:t>
+      </w:r>
+      <w:r>
+        <w:t>-</w:t>
+      </w:r>
+      <w:r>
+        <w:t>sequence task. Each model receives a fixed</w:t>
+      </w:r>
+      <w:r>
+        <w:t>-</w:t>
+      </w:r>
+      <w:r>
+        <w:t>length input window of twenty consecutive motion states and predicts the two</w:t>
+      </w:r>
+      <w:r>
+        <w:t>-</w:t>
+      </w:r>
+      <w:r>
+        <w:t xml:space="preserve">dimensional displacement for the next five </w:t>
+      </w:r>
+      <w:r>
+        <w:t>time steps.</w:t>
+      </w:r>
+      <w:r>
+        <w:t xml:space="preserve"> Each motion state includes six engineered features derived from raw GPS coordinates: normalized latitude and longitude deltas, instantaneous speed, heading, linear acceleration, and turn rate. These variables capture both translational and rotational motion dynamics and are commonly used in mobility modeling and navigation systems. Although many GPS</w:t>
+      </w:r>
+      <w:r>
+        <w:t>-</w:t>
+      </w:r>
+      <w:r>
+        <w:t xml:space="preserve">based forecasting pipelines convert coordinates into a Cartesian frame such as ENU, the final implementation for this project operated entirely </w:t>
+      </w:r>
+      <w:r>
+        <w:t>in normalized latitude/longitude space. All displacement metrics therefore reflect normalized coordinate units rather than physical distances in meters.</w:t>
       </w:r>
     </w:p>
     <w:p>
       <w:r>
-        <w:t xml:space="preserve">Recent advances in machine learning have led to the adoption of sequence‑based neural models for trajectory prediction. Recurrent neural networks, particularly long short‑term memory (LSTM) networks and gated recurrent units (GRUs), were originally developed to capture long‑range temporal dependencies in sequential data (Hochreiter &amp; </w:t>
-      </w:r>
-      <w:proofErr w:type="spellStart"/>
-      <w:r>
-        <w:t>Schmidhuber</w:t>
-      </w:r>
-      <w:proofErr w:type="spellEnd"/>
-      <w:r>
-        <w:t>, 1997; Cho et al., 2014). These architectures have since been adapted for mobility forecasting, where they learn nonlinear relationships between displacement, speed, heading, and future motion. Studies applying LSTMs and GRUs to pedestrian and vehicle trajectories have shown substantial improvements over classical baselines, especially in settings with irregular motion patterns or noisy sensor inputs (Zheng et al., 2008).</w:t>
+        <w:t>A simple kinematic baseline model was implemented to provide a lower</w:t>
+      </w:r>
+      <w:r>
+        <w:noBreakHyphen/>
+        <w:t>bound reference for evaluating the learned architectures. The baseline assumes constant velocity over the prediction horizon by extrapolating the most recent observed displacement. It computes the difference between the final two positions in the input window and repeats this displacement for each of the five future timesteps. Using the same window generator and evaluation metrics as the learned models ensures a fair comparison.</w:t>
       </w:r>
     </w:p>
     <w:p>
       <w:r>
-        <w:t xml:space="preserve">Temporal convolutional networks (TCNs) represent another major development in sequence modeling. By using dilated causal convolutions, TCNs can model long temporal contexts efficiently while maintaining stable gradients and low inference latency. Bai et al. (2018) demonstrated that TCNs outperform many recurrent architectures on sequence‑prediction tasks, making them well‑suited for real‑time </w:t>
-      </w:r>
-      <w:r>
-        <w:lastRenderedPageBreak/>
-        <w:t>forecasting applications. Their ability to process sequences in parallel also makes them attractive for deployment in systems requiring rapid inference.</w:t>
+        <w:t>Three neural architectures were developed to explore different approaches to temporal modeling. The GRU model consists of a single gated recurrent unit layer with 64 hidden units, followed by a fully connected layer that maps the final hidden state to the ten displacement outputs. The LSTM model mirrors this structure, replacing the GRU layer with a long short</w:t>
+      </w:r>
+      <w:r>
+        <w:noBreakHyphen/>
+        <w:t>term memory layer of the same width. Both architectures are designed to capture temporal dependencies through gating mechanisms that regulate information flow.</w:t>
       </w:r>
     </w:p>
     <w:p>
       <w:r>
-        <w:t>The suitability of these machine learning methods for GPS‑only forecasting is supported by extensive prior work using the Microsoft GeoLife GPS Trajectory Dataset. GeoLife contains more than 17,000 trajectories recorded by 182 users, with 91% of trajectories sampled every one to five seconds (Microsoft Research Asia, 2012). This dense sampling enables accurate derivation of kinematic features such as speed, acceleration, heading, and turn rate, which have been shown to improve the stability and accuracy of short‑horizon prediction models (Zheng et al., 2010). Research using GeoLife has demonstrated its effectiveness for mobility pattern mining, transportation mode classification, and location prediction, establishing it as a widely used benchmark for GPS‑based forecasting tasks.</w:t>
+        <w:t>The TCN model incorporates a deeper and more expressive architecture. It uses five temporal convolutional blocks with dilation factors of 1, 2, 4, 8, and 16, enabling the receptive field to span and exceed the twenty</w:t>
+      </w:r>
+      <w:r>
+        <w:noBreakHyphen/>
+        <w:t>step input window. Each block includes a dilated convolution, batch normalization, ReLU activation, dropout, and a residual connection. Sinusoidal positional encodings are added to the input sequence to provide temporal context, and a multi</w:t>
+      </w:r>
+      <w:r>
+        <w:noBreakHyphen/>
+        <w:t>head self</w:t>
+      </w:r>
+      <w:r>
+        <w:noBreakHyphen/>
+        <w:t xml:space="preserve">attention layer with four heads processes the temporal features after the convolutional stack. A final fully connected layer maps the attended </w:t>
+      </w:r>
+      <w:r>
+        <w:lastRenderedPageBreak/>
+        <w:t>representation to the displacement outputs. This architecture was selected to evaluate whether convolutional temporal modeling and attention mechanisms can outperform recurrent baselines in short</w:t>
+      </w:r>
+      <w:r>
+        <w:noBreakHyphen/>
+        <w:t>horizon forecasting.</w:t>
       </w:r>
     </w:p>
     <w:p>
       <w:r>
-        <w:t xml:space="preserve">Several academic and commercial projects illustrate the application of these methods to problems </w:t>
-      </w:r>
-      <w:proofErr w:type="gramStart"/>
-      <w:r>
-        <w:t>similar to</w:t>
-      </w:r>
-      <w:proofErr w:type="gramEnd"/>
-      <w:r>
-        <w:t xml:space="preserve"> the one addressed in this capstone. LSTM‑based models have been used to predict pedestrian trajectories in crowded environments, vehicle motion in urban traffic, and multimodal mobility patterns across large‑scale GPS datasets (Zheng et al., 2008). GRU‑based encoder–decoder architectures have been applied to short‑term motion prediction in transportation networks, while TCNs have been used in real‑time mobility analytics where low latency and temporal stability are critical (Bai et al., 2018). Commercial navigation systems employ variants of kinematic and learned motion models to estimate driver arrival times and detect anomalous movement. Collectively, these examples demonstrate that sequence‑based neural architectures and derived kinematic features are well‑suited for </w:t>
-      </w:r>
-      <w:r>
-        <w:t>short‑horizon trajectory forecasting using GPS‑only inputs.</w:t>
+        <w:t>Training follows a unified pipeline across all models. The GeoLife dataset is split at the trajectory level into 60 percent training, 20 percent validation, and 20 percent test sets to prevent leakage between segments of the same trajectory. Global normalization parameters are computed across all training trajectories, and each sliding window is additionally normalized on a per</w:t>
+      </w:r>
+      <w:r>
+        <w:noBreakHyphen/>
+        <w:t>window basis to stabilize training. A streaming window generator produces batches of input windows and future displacement targets without loading all windows into memory simultaneously. Because some GeoLife trajectories contain tens of thousands of samples, adaptive caps are applied to limit the number of windows extracted from any single trajectory, ensuring consistent batch sizes and preventing memory exhaustion.</w:t>
       </w:r>
     </w:p>
     <w:p>
-      <w:pPr>
-        <w:pStyle w:val="Heading1"/>
-      </w:pPr>
-      <w:r>
-        <w:t>4 Methodology</w:t>
+      <w:r>
+        <w:t>All models are trained using the Adam optimizer with a learning rate of 1×10⁻³ and mean squared error loss</w:t>
+      </w:r>
+      <w:r>
+        <w:t xml:space="preserve"> (Kingma</w:t>
+      </w:r>
+      <w:r>
+        <w:t xml:space="preserve"> &amp; Ba, 2015).</w:t>
+      </w:r>
+      <w:r>
+        <w:t xml:space="preserve"> Training proceeds for twenty epochs, with progress and system</w:t>
+      </w:r>
+      <w:r>
+        <w:t>-</w:t>
+      </w:r>
+      <w:r>
+        <w:t xml:space="preserve">resource heartbeats logged periodically. </w:t>
+      </w:r>
+      <w:r>
+        <w:t>Effective</w:t>
+      </w:r>
+      <w:r>
+        <w:t xml:space="preserve"> batch </w:t>
+      </w:r>
+      <w:r>
+        <w:t>composition depends on</w:t>
+      </w:r>
+      <w:r>
+        <w:t xml:space="preserve"> the number of windows generated per trajectory, which varies </w:t>
+      </w:r>
+      <w:r>
+        <w:t>with</w:t>
+      </w:r>
+      <w:r>
+        <w:t xml:space="preserve"> trajectory length and the adaptive caps. This approach maintains computational feasibility while preserving the temporal diversity of the dataset.</w:t>
       </w:r>
     </w:p>
     <w:p>
       <w:r>
-        <w:t xml:space="preserve">The forecasting system developed for this project uses engineered kinematic features, sliding‑window sequence extraction, and three deep learning architectures—GRU, LSTM, and a Temporal Convolutional Network (TCN)—to predict short‑horizon motion from GPS‑derived inputs. A classical constant‑velocity baseline model is included to contextualize the performance of the learned models. This section describes the final model </w:t>
-      </w:r>
-      <w:proofErr w:type="gramStart"/>
-      <w:r>
-        <w:t>architectures</w:t>
-      </w:r>
-      <w:proofErr w:type="gramEnd"/>
-      <w:r>
-        <w:t>, preprocessing pipeline, training procedures, and optimization strategy used in the project. All performance outcomes are reserved for the Results section.</w:t>
+        <w:t xml:space="preserve">Model optimization involved iterative adjustments to architectural and training hyperparameters. Hidden sizes of 32, 64, and 128 were evaluated for the recurrent models, along with variations in dropout rates and learning rates. For the TCN, the number of convolutional layers, dilation schedule, </w:t>
+      </w:r>
+      <w:r>
+        <w:t>and attention</w:t>
+      </w:r>
+      <w:r>
+        <w:noBreakHyphen/>
+        <w:t>head count were explored. Window caps were tuned to balance memory constraints with training diversity. These optimization experiments informed the final architecture selections described above; comparative performance outcomes are presented in the Results section.</w:t>
       </w:r>
     </w:p>
     <w:p>
-      <w:r>
-        <w:t xml:space="preserve">The forecasting problem is formulated as a supervised sequence‑to‑sequence task. Each model receives a fixed‑length input window of twenty consecutive motion states and predicts the two‑dimensional displacement for the next five timesteps. Each motion state includes six engineered features derived from raw GPS coordinates: projected x and y position, instantaneous speed, heading, linear acceleration, and turn rate. These variables capture both translational and rotational motion dynamics and are commonly used in mobility modeling and navigation systems (Teunissen &amp; </w:t>
-      </w:r>
-      <w:proofErr w:type="spellStart"/>
-      <w:r>
-        <w:t>Montenbruck</w:t>
-      </w:r>
-      <w:proofErr w:type="spellEnd"/>
-      <w:r>
-        <w:t>, 2017; Sola, 2017). Their inclusion allows the models to learn short‑term motion patterns that influence future displacement.</w:t>
+      <w:pPr>
+        <w:pStyle w:val="Heading1"/>
+      </w:pPr>
+      <w:r>
+        <w:t>5</w:t>
+      </w:r>
+      <w:r>
+        <w:t xml:space="preserve">    </w:t>
+      </w:r>
+      <w:r>
+        <w:t>Results</w:t>
       </w:r>
     </w:p>
     <w:p>
       <w:r>
-        <w:t xml:space="preserve">A simple kinematic baseline model was implemented to provide a lower‑bound reference for evaluating the learned architectures. The baseline assumes constant velocity over the prediction horizon by extrapolating the most recent observed displacement. Specifically, it computes the difference between the final two </w:t>
-      </w:r>
-      <w:r>
-        <w:lastRenderedPageBreak/>
-        <w:t xml:space="preserve">positions in the input window and repeats this displacement for each of the five future timesteps. Constant‑velocity models are widely used in navigation and tracking applications due to their simplicity and low computational cost (Teunissen &amp; </w:t>
-      </w:r>
-      <w:proofErr w:type="spellStart"/>
-      <w:r>
-        <w:t>Montenbruck</w:t>
-      </w:r>
-      <w:proofErr w:type="spellEnd"/>
-      <w:r>
-        <w:t>, 2017). Using the same window generator and evaluation metrics as the learned models ensures a fair comparison.</w:t>
+        <w:t>Model performance was evaluated using three displacement</w:t>
+      </w:r>
+      <w:r>
+        <w:noBreakHyphen/>
+        <w:t>based metrics commonly used in short</w:t>
+      </w:r>
+      <w:r>
+        <w:noBreakHyphen/>
+        <w:t>horizon trajectory forecasting: Average Displacement Error (ADE), Maximum Displacement Error (MDE), and Final Displacement Error (FDE). These metrics quantify how far predicted positions deviate from ground</w:t>
+      </w:r>
+      <w:r>
+        <w:noBreakHyphen/>
+        <w:t>truth future positions over the five</w:t>
+      </w:r>
+      <w:r>
+        <w:noBreakHyphen/>
+        <w:t>step prediction horizon. All metrics were computed directly in normalized latitude and longitude coordinate space. Evaluation was conducted on both validation and held</w:t>
+      </w:r>
+      <w:r>
+        <w:noBreakHyphen/>
+        <w:t>out test trajectories to assess generalization.</w:t>
       </w:r>
     </w:p>
     <w:p>
       <w:r>
-        <w:t xml:space="preserve">Three neural architectures were developed to explore different approaches to temporal modeling. The GRU model consists of a single gated recurrent unit layer with 64 hidden units, followed by a fully connected layer that maps the final hidden state to the ten displacement outputs. GRUs are designed to capture temporal dependencies efficiently through gating mechanisms that regulate information flow (Cho et al., 2014). The LSTM model mirrors this structure, replacing the GRU layer with a </w:t>
-      </w:r>
-      <w:proofErr w:type="gramStart"/>
-      <w:r>
-        <w:t>long short</w:t>
-      </w:r>
-      <w:proofErr w:type="gramEnd"/>
-      <w:r>
-        <w:t xml:space="preserve">‑term memory layer of the same width. LSTMs incorporate additional gating structures that help preserve long‑range temporal information and have been widely used in sequential prediction tasks (Hochreiter &amp; </w:t>
-      </w:r>
-      <w:proofErr w:type="spellStart"/>
-      <w:r>
-        <w:t>Schmidhuber</w:t>
-      </w:r>
-      <w:proofErr w:type="spellEnd"/>
-      <w:r>
-        <w:t>, 1997).</w:t>
+        <w:t>The initial, pre</w:t>
+      </w:r>
+      <w:r>
+        <w:noBreakHyphen/>
+        <w:t>tuning results revealed clear differences in model stability and accuracy. The constant</w:t>
+      </w:r>
+      <w:r>
+        <w:noBreakHyphen/>
+        <w:t>velocity baseline performed poorly on MDE, with values as high as 8.448 in normalized coordinate units on the test set. This confirmed that simple kinematic extrapolation is insufficient for noisy GPS trajectories. The GRU and LSTM models substantially outperformed the baseline, achieving validation ADE values of 0.012 and 0.006, and test ADE values of 0.014 and 0.009. The LSTM consistently produced the lowest displacement errors among the recurrent models, which aligns with prior work showing its strength in sequential prediction tasks. The TCN model showed mixed behavior in the pre</w:t>
+      </w:r>
+      <w:r>
+        <w:noBreakHyphen/>
+        <w:t xml:space="preserve">tuning phase. Its validation ADE of 0.014 was competitive with the GRU, but its validation MDE of 0.765 and test ADE of 0.048 were significantly higher. This </w:t>
+      </w:r>
+      <w:r>
+        <w:lastRenderedPageBreak/>
+        <w:t>instability was traced to extremely long trajectories that produced tens of thousands of windows, which caused memory pressure and degraded training quality.</w:t>
       </w:r>
     </w:p>
     <w:p>
       <w:r>
-        <w:t xml:space="preserve">The TCN model incorporates </w:t>
-      </w:r>
-      <w:proofErr w:type="gramStart"/>
-      <w:r>
-        <w:t>a deeper</w:t>
-      </w:r>
-      <w:proofErr w:type="gramEnd"/>
-      <w:r>
-        <w:t xml:space="preserve"> and more expressive architecture. It uses five temporal convolutional blocks with dilation factors of 1, 2, 4, 8, and 16, enabling the receptive field to span and exceed the twenty‑step input window. Each block includes a dilated convolution, batch normalization, </w:t>
-      </w:r>
-      <w:proofErr w:type="spellStart"/>
-      <w:r>
-        <w:t>ReLU</w:t>
-      </w:r>
-      <w:proofErr w:type="spellEnd"/>
-      <w:r>
-        <w:t xml:space="preserve"> activation, dropout, and a residual connection. Dilated convolutions allow the model to capture long‑range temporal structure while maintaining stable gradients (Bai et al., 2018). To provide positional awareness, sinusoidal positional encodings are added to the input sequence, following techniques used in transformer‑based architectures (Vaswani et al., 2017). After the convolutional stack, a multi‑head </w:t>
-      </w:r>
-      <w:r>
-        <w:t>self‑attention layer with four heads processes the temporal features, enabling the model to emphasize the most informative timesteps. A final fully connected layer maps the attended representation to the displacement outputs. This architecture was selected to evaluate whether convolutional temporal modeling and attention mechanisms can outperform recurrent baselines in short‑horizon forecasting.</w:t>
+        <w:t>The tuned TCN achieved strong overall performance once memory constraints were addressed. Its validation ADE of approximately 0.0024 and test ADE of approximately 0.0025 were competitive with the GRU, while its MDE values remained higher than those of the LSTM. Although the TCN did not outperform the LSTM in normalized displacement metrics, its stability improved substantially compared to the pre</w:t>
+      </w:r>
+      <w:r>
+        <w:t>-</w:t>
+      </w:r>
+      <w:r>
+        <w:t>tuning phase, demonstrating the importance of preprocessing and window</w:t>
+      </w:r>
+      <w:r>
+        <w:t>-</w:t>
+      </w:r>
+      <w:r>
+        <w:t>generation optimizations.</w:t>
       </w:r>
     </w:p>
     <w:p>
       <w:r>
-        <w:t>Training follows a unified pipeline across all models. The GeoLife dataset is split at the trajectory level into 60% training, 20% validation, and 20% test sets to prevent leakage between segments of the same trajectory (Microsoft Research Asia, 2012). Global normalization parameters are computed across all training trajectories, and each sliding window is additionally normalized on a per‑window basis to stabilize training. A streaming window generator produces batches of input windows and future displacement targets without loading all windows into memory simultaneously. Because some GeoLife trajectories contain tens of thousands of samples, adaptive caps are applied to limit the number of windows extracted from any single trajectory, ensuring consistent batch sizes and preventing memory exhaustion.</w:t>
+        <w:t>As shown in Figure 1, all three models exhibit smooth and monotonic decreases in training loss, with no divergence between training and validation splits. This indicates that none of the tuned models exhibited severe overfitting. The addition of per</w:t>
+      </w:r>
+      <w:r>
+        <w:noBreakHyphen/>
+        <w:t>window normalization and adaptive window caps was essential for preventing instability, particularly in the TCN. These optimizations directly addressed the irregular sampling intervals and long</w:t>
+      </w:r>
+      <w:r>
+        <w:noBreakHyphen/>
+        <w:t>trajectory artifacts present in the GeoLife dataset.</w:t>
       </w:r>
     </w:p>
     <w:p>
-      <w:r>
-        <w:t>All models are trained using the Adam optimizer with a learning rate of 1×10⁻³ and mean squared error loss. Training proceeds for twenty epochs, with progress and system‑resource heartbeats logged periodically. The batch size is implicitly determined by the number of windows generated per trajectory, which varies depending on trajectory length and the adaptive caps. This approach maintains computational feasibility while preserving the temporal diversity of the dataset.</w:t>
-      </w:r>
-    </w:p>
-    <w:p>
-      <w:r>
-        <w:t xml:space="preserve">Model optimization involved iterative adjustments to architectural and training hyperparameters. </w:t>
-      </w:r>
-      <w:r>
-        <w:rPr>
-          <w:rFonts w:cstheme="majorBidi"/>
-        </w:rPr>
-        <w:lastRenderedPageBreak/>
-        <w:t>Hidden sizes of 32, 64, and 128 were evaluated for the recurrent models, along with variations in dropout rates and learning rates. For the TCN, the number of convolutional layers, dilation schedule, and attention‑head count were explored. Window caps were tuned to balance memory constraints with training diversity. These optimization experiments informed the final architecture selections described above; comparative performance outcomes are presented in the Results section.</w:t>
-      </w:r>
-    </w:p>
-    <w:p>
-      <w:pPr>
-        <w:pStyle w:val="Heading1"/>
-      </w:pPr>
-      <w:r>
-        <w:t>5 Results</w:t>
-      </w:r>
-    </w:p>
-    <w:p>
-      <w:r>
-        <w:t xml:space="preserve">This section of your final report should describe how your model/system performed and provide evidence for how your work did or did not support your experimental hypothesis or solve your chosen problem. The reader should be able to answer the following questions: </w:t>
-      </w:r>
-    </w:p>
-    <w:p>
-      <w:pPr>
-        <w:pStyle w:val="ListParagraph"/>
-        <w:numPr>
-          <w:ilvl w:val="0"/>
-          <w:numId w:val="7"/>
-        </w:numPr>
-      </w:pPr>
-      <w:r>
-        <w:t xml:space="preserve">How effective was your machine learning model at learning the task? e.g. Did the model overfit/underfit the training data? What does the training accuracy/loss curve look like for your model? </w:t>
-      </w:r>
-    </w:p>
-    <w:p>
-      <w:pPr>
-        <w:pStyle w:val="ListParagraph"/>
-        <w:numPr>
-          <w:ilvl w:val="0"/>
-          <w:numId w:val="7"/>
-        </w:numPr>
-      </w:pPr>
-      <w:r>
-        <w:t xml:space="preserve">If your project is focused on answering a research question, what evidence do you have to support or disprove your hypothesis? </w:t>
-      </w:r>
-    </w:p>
-    <w:p>
-      <w:pPr>
-        <w:pStyle w:val="ListParagraph"/>
-        <w:numPr>
-          <w:ilvl w:val="0"/>
-          <w:numId w:val="7"/>
-        </w:numPr>
-      </w:pPr>
-      <w:r>
-        <w:t xml:space="preserve">If your project is focused on solving a problem, how will your model performance affect the application of your model to that problem? </w:t>
-      </w:r>
-    </w:p>
-    <w:p>
-      <w:pPr>
-        <w:pStyle w:val="ListParagraph"/>
-        <w:numPr>
-          <w:ilvl w:val="0"/>
-          <w:numId w:val="7"/>
-        </w:numPr>
-        <w:rPr>
-          <w:rFonts w:eastAsia="Times New Roman"/>
-        </w:rPr>
-      </w:pPr>
-      <w:r>
-        <w:t>If your project is focused on implementing a complete machine learning system, what is the user experience? Are there any delays or remaining bugs that affect your model output either in common or edge use cases?</w:t>
-      </w:r>
-    </w:p>
-    <w:p>
-      <w:pPr>
-        <w:pStyle w:val="Heading1"/>
-        <w:rPr>
-          <w:rFonts w:cs="Linux Libertine"/>
-        </w:rPr>
-      </w:pPr>
-      <w:r>
-        <w:rPr>
-          <w:rFonts w:cs="Linux Libertine"/>
-        </w:rPr>
-        <w:t>6</w:t>
-      </w:r>
-      <w:r>
-        <w:tab/>
-      </w:r>
-      <w:r>
-        <w:rPr>
-          <w:rFonts w:cs="Linux Libertine"/>
-        </w:rPr>
-        <w:t>Conclusion</w:t>
-      </w:r>
-    </w:p>
-    <w:p>
-      <w:pPr>
-        <w:spacing w:before="20"/>
-        <w:rPr>
-          <w:rFonts w:asciiTheme="majorBidi" w:hAnsiTheme="majorBidi" w:cstheme="majorBidi"/>
-        </w:rPr>
-      </w:pPr>
-      <w:r>
-        <w:rPr>
-          <w:rFonts w:cstheme="majorBidi"/>
-        </w:rPr>
-        <w:t xml:space="preserve">This section of your final report should provide a very </w:t>
-      </w:r>
-      <w:proofErr w:type="gramStart"/>
-      <w:r>
-        <w:rPr>
-          <w:rFonts w:cstheme="majorBidi"/>
-        </w:rPr>
-        <w:t>brief summary</w:t>
-      </w:r>
-      <w:proofErr w:type="gramEnd"/>
-      <w:r>
-        <w:rPr>
-          <w:rFonts w:cstheme="majorBidi"/>
-        </w:rPr>
-        <w:t xml:space="preserve"> of your entire project. It should highlight the most interesting or significant results and discuss any future work that you or another researcher might do. The reader should be able to answer the following questions:</w:t>
-      </w:r>
-    </w:p>
-    <w:p>
-      <w:pPr>
-        <w:pStyle w:val="ListParagraph"/>
-        <w:numPr>
-          <w:ilvl w:val="0"/>
-          <w:numId w:val="8"/>
-        </w:numPr>
-      </w:pPr>
-      <w:r>
-        <w:t>What was the main hypothesis or goal of the project, and how did your models perform in relation to this hypothesis/goal?</w:t>
-      </w:r>
-    </w:p>
-    <w:p>
-      <w:pPr>
-        <w:pStyle w:val="ListParagraph"/>
-        <w:numPr>
-          <w:ilvl w:val="0"/>
-          <w:numId w:val="8"/>
-        </w:numPr>
-      </w:pPr>
-      <w:r>
-        <w:t>What was the most interesting or significant result of your project?</w:t>
-      </w:r>
-    </w:p>
-    <w:p>
-      <w:pPr>
-        <w:pStyle w:val="ListParagraph"/>
-        <w:numPr>
-          <w:ilvl w:val="0"/>
-          <w:numId w:val="8"/>
-        </w:numPr>
-      </w:pPr>
-      <w:r>
-        <w:t>Did your model training or performance bring about any unexpected results?</w:t>
-      </w:r>
-    </w:p>
-    <w:p>
-      <w:pPr>
-        <w:pStyle w:val="ListParagraph"/>
-        <w:numPr>
-          <w:ilvl w:val="0"/>
-          <w:numId w:val="8"/>
-        </w:numPr>
-      </w:pPr>
-      <w:r>
-        <w:t>If you were to continue this project, what would your next steps be? For example, would you continue to optimize your model or try other model architectures? Would you change or expand the data used in your model? What steps need to be taken to “productionize” your model?</w:t>
-      </w:r>
-    </w:p>
-    <w:p>
-      <w:pPr>
-        <w:pStyle w:val="Heading1"/>
-        <w:rPr>
-          <w:rFonts w:cs="Linux Libertine"/>
-        </w:rPr>
-      </w:pPr>
-      <w:r>
-        <w:rPr>
-          <w:highlight w:val="yellow"/>
-        </w:rPr>
-        <w:t>7</w:t>
-      </w:r>
-      <w:r>
-        <w:tab/>
-      </w:r>
-      <w:r>
-        <w:rPr>
-          <w:highlight w:val="yellow"/>
-        </w:rPr>
-        <w:t>FORMATTING EXAMPLES</w:t>
-      </w:r>
-    </w:p>
-    <w:p>
-      <w:pPr>
-        <w:rPr>
-          <w:highlight w:val="yellow"/>
-        </w:rPr>
-      </w:pPr>
-      <w:r>
-        <w:rPr>
-          <w:highlight w:val="yellow"/>
-        </w:rPr>
-        <w:t>DELETE THIS SECTION BEFORE FINAL SUBMISSION</w:t>
-      </w:r>
-    </w:p>
-    <w:p>
-      <w:pPr>
-        <w:pStyle w:val="Heading2"/>
-      </w:pPr>
-      <w:r>
-        <w:t>7.1</w:t>
-      </w:r>
-      <w:r>
-        <w:tab/>
-        <w:t>General Formatting</w:t>
-      </w:r>
-    </w:p>
-    <w:p>
-      <w:pPr>
-        <w:rPr>
-          <w:rFonts w:eastAsia="Times New Roman" w:cs="Times New Roman"/>
-        </w:rPr>
-      </w:pPr>
-      <w:r>
-        <w:rPr>
-          <w:rFonts w:eastAsia="Times New Roman" w:cs="Times New Roman"/>
-        </w:rPr>
-        <w:t xml:space="preserve">A formal report of this type should be primarily in paragraph form, with minimal subheadings, bullet points, or numbered lists. For most of your required report sections, no subheadings will be necessary, and the information can be presented as a single, cohesive discussion of the content relevant to that section. </w:t>
-      </w:r>
-      <w:proofErr w:type="gramStart"/>
-      <w:r>
-        <w:rPr>
-          <w:rFonts w:eastAsia="Times New Roman" w:cs="Times New Roman"/>
-        </w:rPr>
-        <w:t>As a general rule</w:t>
-      </w:r>
-      <w:proofErr w:type="gramEnd"/>
-      <w:r>
-        <w:rPr>
-          <w:rFonts w:eastAsia="Times New Roman" w:cs="Times New Roman"/>
-        </w:rPr>
-        <w:t xml:space="preserve"> of thumb, </w:t>
-      </w:r>
-      <w:proofErr w:type="gramStart"/>
-      <w:r>
-        <w:rPr>
-          <w:rFonts w:eastAsia="Times New Roman" w:cs="Times New Roman"/>
-        </w:rPr>
-        <w:t>bulleted</w:t>
-      </w:r>
-      <w:proofErr w:type="gramEnd"/>
-      <w:r>
-        <w:rPr>
-          <w:rFonts w:eastAsia="Times New Roman" w:cs="Times New Roman"/>
-        </w:rPr>
-        <w:t xml:space="preserve"> or numbered lists are only appropriate in this kind of report if the list items are less than one sentence, but are too long/detailed to be presented in a table.</w:t>
-      </w:r>
-    </w:p>
-    <w:p>
-      <w:r>
-        <w:t xml:space="preserve">If you feel strongly that your content would benefit from subheadings or </w:t>
-      </w:r>
-      <w:proofErr w:type="gramStart"/>
-      <w:r>
-        <w:t>bulleted</w:t>
-      </w:r>
-      <w:proofErr w:type="gramEnd"/>
-      <w:r>
-        <w:t xml:space="preserve">/numbered lists, they </w:t>
-      </w:r>
-      <w:r>
-        <w:lastRenderedPageBreak/>
-        <w:t>should follow the formatting examples used in this section.</w:t>
-      </w:r>
-    </w:p>
-    <w:p>
-      <w:pPr>
-        <w:pStyle w:val="Heading2"/>
-      </w:pPr>
-      <w:r>
-        <w:t>7.2</w:t>
-      </w:r>
-      <w:r>
-        <w:tab/>
-        <w:t>In-text Citations</w:t>
-      </w:r>
-    </w:p>
-    <w:p>
-      <w:pPr>
-        <w:rPr>
-          <w:rFonts w:eastAsia="Times New Roman" w:cs="Times New Roman"/>
-        </w:rPr>
-      </w:pPr>
-      <w:r>
-        <w:rPr>
-          <w:rFonts w:eastAsia="Times New Roman" w:cs="Times New Roman"/>
-        </w:rPr>
-        <w:t xml:space="preserve">A report of this type should be heavily supported by in-text citations. You should include a new supporting citation in each section for: </w:t>
-      </w:r>
-    </w:p>
-    <w:p>
-      <w:pPr>
-        <w:pStyle w:val="ListParagraph"/>
-        <w:spacing w:before="240" w:after="240"/>
-        <w:ind w:hanging="360"/>
-        <w:rPr>
-          <w:rFonts w:eastAsia="Times New Roman"/>
-        </w:rPr>
-      </w:pPr>
-      <w:r>
-        <w:rPr>
-          <w:rFonts w:eastAsia="Times New Roman"/>
-        </w:rPr>
-        <w:t xml:space="preserve">The first time that you mention a specific </w:t>
-      </w:r>
-      <w:proofErr w:type="gramStart"/>
-      <w:r>
-        <w:rPr>
-          <w:rFonts w:eastAsia="Times New Roman"/>
-        </w:rPr>
-        <w:t>code library</w:t>
-      </w:r>
-      <w:proofErr w:type="gramEnd"/>
-      <w:r>
-        <w:rPr>
-          <w:rFonts w:eastAsia="Times New Roman"/>
-        </w:rPr>
-        <w:t xml:space="preserve"> or dataset,</w:t>
-      </w:r>
-    </w:p>
-    <w:p>
-      <w:pPr>
-        <w:pStyle w:val="ListParagraph"/>
-        <w:spacing w:before="240" w:after="240"/>
-        <w:ind w:hanging="360"/>
-        <w:rPr>
-          <w:rFonts w:eastAsia="Times New Roman"/>
-        </w:rPr>
-      </w:pPr>
-      <w:r>
-        <w:rPr>
-          <w:rFonts w:eastAsia="Times New Roman"/>
-        </w:rPr>
-        <w:t>The first time that you introduce a pre-trained model or model architecture,</w:t>
-      </w:r>
-    </w:p>
-    <w:p>
-      <w:pPr>
-        <w:pStyle w:val="ListParagraph"/>
-        <w:spacing w:before="240" w:after="240"/>
-        <w:ind w:hanging="360"/>
-        <w:rPr>
-          <w:rFonts w:eastAsia="Times New Roman"/>
-        </w:rPr>
-      </w:pPr>
-      <w:r>
-        <w:rPr>
-          <w:rFonts w:eastAsia="Times New Roman"/>
-        </w:rPr>
-        <w:t>Any information that is not your own original thought/idea, even if you didn't need to look it up.</w:t>
-      </w:r>
-    </w:p>
-    <w:p>
-      <w:pPr>
-        <w:rPr>
-          <w:rFonts w:eastAsia="Times New Roman" w:cs="Times New Roman"/>
-        </w:rPr>
-      </w:pPr>
-      <w:r>
-        <w:rPr>
-          <w:rFonts w:eastAsia="Times New Roman" w:cs="Times New Roman"/>
-        </w:rPr>
-        <w:t>When in doubt, it is always better to over-cite than to under-cite.</w:t>
-      </w:r>
-    </w:p>
-    <w:p>
-      <w:pPr>
-        <w:rPr>
-          <w:rFonts w:eastAsia="Times New Roman" w:cs="Times New Roman"/>
-        </w:rPr>
-      </w:pPr>
-      <w:r>
-        <w:rPr>
-          <w:rFonts w:eastAsia="Times New Roman" w:cs="Times New Roman"/>
-        </w:rPr>
-        <w:t>Formatting rules for in-text citations can be found in the APA guidelines, but examples of the three most common uses are discussed in the following paragraphs.</w:t>
-      </w:r>
-    </w:p>
-    <w:p>
-      <w:r>
-        <w:rPr>
-          <w:i/>
-          <w:iCs/>
-        </w:rPr>
-        <w:t>Parenthetical citations at the end of a sentence</w:t>
-      </w:r>
-      <w:r>
-        <w:t xml:space="preserve"> should be used when the information from the entire sentence comes from the cited source (American Psychological Association, </w:t>
-      </w:r>
-      <w:r>
-        <w:t>2024</w:t>
-      </w:r>
-      <w:r>
-        <w:t>).</w:t>
-      </w:r>
-    </w:p>
-    <w:p>
-      <w:r>
-        <w:rPr>
-          <w:i/>
-          <w:iCs/>
-        </w:rPr>
-        <w:t>Parenthetical citations mid-sentence</w:t>
-      </w:r>
-      <w:r>
-        <w:t xml:space="preserve"> should be used when only a part of the sentence comes from the cited source, or when you are providing a citation for something specific such as a company, model architecture/method, or technique. See the following examples for a sentence with multiple mid-sentence citations and a sentence with a specific mid-sentence citation below:</w:t>
-      </w:r>
-    </w:p>
-    <w:p>
-      <w:pPr>
-        <w:pStyle w:val="ListParagraph"/>
-        <w:numPr>
-          <w:ilvl w:val="0"/>
-          <w:numId w:val="9"/>
-        </w:numPr>
-      </w:pPr>
-      <w:r>
-        <w:t xml:space="preserve">The transformer model was introduced in 2017 for the application of machine translation (Vaswani et al., 2017) and quickly became the most common backbone for today’s large language </w:t>
-      </w:r>
-      <w:r>
-        <w:t>models (Devlin et al., 2019; Radford et al., 2019).</w:t>
-      </w:r>
-    </w:p>
-    <w:p>
-      <w:pPr>
-        <w:pStyle w:val="ListParagraph"/>
-        <w:numPr>
-          <w:ilvl w:val="0"/>
-          <w:numId w:val="9"/>
-        </w:numPr>
-      </w:pPr>
-      <w:r>
-        <w:t>As one of the first transformer-based generative text models, OpenAI’s GPT (Radford et al., 2019) quickly became the standard large language architecture used for generative tasks.</w:t>
-      </w:r>
-    </w:p>
-    <w:p>
-      <w:pPr>
-        <w:pStyle w:val="ListParagraph"/>
-        <w:numPr>
-          <w:ilvl w:val="0"/>
-          <w:numId w:val="0"/>
-        </w:numPr>
-        <w:ind w:left="720"/>
-      </w:pPr>
-    </w:p>
-    <w:p>
-      <w:r>
-        <w:rPr>
-          <w:i/>
-          <w:iCs/>
-        </w:rPr>
-        <w:t>Narrative in-text citations</w:t>
-      </w:r>
-      <w:r>
-        <w:t xml:space="preserve"> can be used when you want to include the name of the author(s) in your main text, as shown in the following example:</w:t>
-      </w:r>
-    </w:p>
-    <w:p>
-      <w:pPr>
-        <w:ind w:left="720"/>
-      </w:pPr>
-      <w:r>
-        <w:t>Vaswani et al. (2017) originally developed the transformer architecture for the application of machine translation.</w:t>
-      </w:r>
-    </w:p>
-    <w:p>
-      <w:pPr>
-        <w:pStyle w:val="Heading2"/>
-      </w:pPr>
-      <w:r>
-        <w:t>7.3</w:t>
-      </w:r>
-      <w:r>
-        <w:tab/>
-        <w:t>Figures, Tables, and Equations</w:t>
-      </w:r>
-    </w:p>
-    <w:p>
-      <w:r>
-        <w:t>Most of your supporting content should be included in the main text of the report, rather than at the end. While the in-line formatting can be a headache, this makes it easier for your reader to reference your figures and tables while reading, without having to scroll back and forth too much. See Section 7.5 for more details about how to properly use appendices for supplemental information.</w:t>
-      </w:r>
-    </w:p>
-    <w:p>
-      <w:pPr>
-        <w:pStyle w:val="Heading3"/>
-      </w:pPr>
-      <w:r>
-        <w:t>7.3.1</w:t>
-      </w:r>
-      <w:r>
-        <w:tab/>
-        <w:t>Figures</w:t>
-      </w:r>
-    </w:p>
-    <w:p>
-      <w:r>
-        <w:t xml:space="preserve">Figures should be numbered sequentially </w:t>
-      </w:r>
-      <w:r>
-        <w:rPr>
-          <w:i/>
-          <w:iCs/>
-        </w:rPr>
-        <w:t>below</w:t>
-      </w:r>
-      <w:r>
-        <w:t xml:space="preserve"> the image and referred to directly in your text (e.g. “As seen in Figure 7.1 [...]”, “Figure 7.1 shows [...]”). If your figure is important enough to include in your report, then it deserves at least one sentence of discussion in the text. </w:t>
-      </w:r>
-    </w:p>
-    <w:p>
-      <w:r>
-        <w:t>Each figure should also have a corresponding caption that briefly describes the content of the figure and can be used to highlight important details. If your figure is too complex to be limited to a single column width, you can include it as a full-width image at the top of the page.</w:t>
-      </w:r>
-    </w:p>
-    <w:p>
-      <w:pPr>
-        <w:pStyle w:val="Caption"/>
-      </w:pPr>
       <w:r>
         <w:rPr>
           <w:noProof/>
         </w:rPr>
-        <w:lastRenderedPageBreak/>
         <w:drawing>
-          <wp:inline distT="0" distB="0" distL="0" distR="0" wp14:anchorId="09E97ADB" wp14:editId="5D1ACF3E">
-            <wp:extent cx="3048000" cy="1781175"/>
+          <wp:inline distT="0" distB="0" distL="0" distR="0" wp14:anchorId="60566777" wp14:editId="65593895">
+            <wp:extent cx="3048000" cy="1376045"/>
             <wp:effectExtent l="0" t="0" r="0" b="0"/>
-            <wp:docPr id="1" name="image1.jpg" descr="Abstract particle graph background"/>
+            <wp:docPr id="1769089811" name="Picture 1"/>
             <wp:cNvGraphicFramePr>
               <a:graphicFrameLocks xmlns:a="http://schemas.openxmlformats.org/drawingml/2006/main" noChangeAspect="1"/>
             </wp:cNvGraphicFramePr>
@@ -1431,10 +1016,8 @@
               <a:graphicData uri="http://schemas.openxmlformats.org/drawingml/2006/picture">
                 <pic:pic xmlns:pic="http://schemas.openxmlformats.org/drawingml/2006/picture">
                   <pic:nvPicPr>
-                    <pic:cNvPr id="1" name="image1.jpg" descr="Abstract particle graph background"/>
-                    <pic:cNvPicPr>
-                      <a:picLocks noChangeAspect="1" noChangeArrowheads="1"/>
-                    </pic:cNvPicPr>
+                    <pic:cNvPr id="1769089811" name=""/>
+                    <pic:cNvPicPr/>
                   </pic:nvPicPr>
                   <pic:blipFill>
                     <a:blip r:embed="rId16"/>
@@ -1442,10 +1025,10 @@
                       <a:fillRect/>
                     </a:stretch>
                   </pic:blipFill>
-                  <pic:spPr bwMode="auto">
+                  <pic:spPr>
                     <a:xfrm>
                       <a:off x="0" y="0"/>
-                      <a:ext cx="3048000" cy="1781175"/>
+                      <a:ext cx="3048000" cy="1376045"/>
                     </a:xfrm>
                     <a:prstGeom prst="rect">
                       <a:avLst/>
@@ -1457,481 +1040,547 @@
           </wp:inline>
         </w:drawing>
       </w:r>
-      <w:r>
-        <w:t>Figure 7.1</w:t>
-      </w:r>
     </w:p>
     <w:p>
       <w:pPr>
         <w:pStyle w:val="Caption"/>
       </w:pPr>
       <w:r>
-        <w:t>Example text: Model accuracy for our six models during training. The best performing model is shown in red.</w:t>
+        <w:rPr>
+          <w:bCs/>
+        </w:rPr>
+        <w:t>Figure 1</w:t>
+      </w:r>
+      <w:r>
+        <w:br/>
+      </w:r>
+      <w:r>
+        <w:t>Training</w:t>
+      </w:r>
+      <w:r>
+        <w:t>-</w:t>
+      </w:r>
+      <w:r>
+        <w:t>loss curves for the GRU, LSTM, and TCN models. All three models show stable and monotonic convergence.</w:t>
       </w:r>
     </w:p>
     <w:p>
-      <w:pPr>
-        <w:pStyle w:val="Heading3"/>
-      </w:pPr>
-      <w:r>
-        <w:t>7.3.2</w:t>
-      </w:r>
-      <w:r>
-        <w:tab/>
-        <w:t>Tables</w:t>
+      <w:r>
+        <w:t>The displacement</w:t>
+      </w:r>
+      <w:r>
+        <w:noBreakHyphen/>
+        <w:t>error distributions for the learned models on the held</w:t>
+      </w:r>
+      <w:r>
+        <w:noBreakHyphen/>
+        <w:t xml:space="preserve">out test set are shown </w:t>
+      </w:r>
+      <w:r>
+        <w:t>in Figure 2. The GRU, LSTM, and TCN models all exhibit sharply concentrated densities near zero, with the LSTM showing the tightest cluster. These distributions visually reinforce the quantitative results reported earlier, where the tuned LSTM achieved the lowest ADE and MDE values among the learned models.</w:t>
       </w:r>
     </w:p>
     <w:p>
       <w:r>
-        <w:t xml:space="preserve">Tables should be numbered sequentially above the table and should have an in-text mention and a descriptive caption, like the figure examples given above. </w:t>
+        <w:rPr>
+          <w:noProof/>
+        </w:rPr>
+        <w:drawing>
+          <wp:inline distT="0" distB="0" distL="0" distR="0" wp14:anchorId="14AF8E55" wp14:editId="0D46D3F2">
+            <wp:extent cx="3048000" cy="1410970"/>
+            <wp:effectExtent l="0" t="0" r="0" b="0"/>
+            <wp:docPr id="1470606084" name="Picture 1"/>
+            <wp:cNvGraphicFramePr>
+              <a:graphicFrameLocks xmlns:a="http://schemas.openxmlformats.org/drawingml/2006/main" noChangeAspect="1"/>
+            </wp:cNvGraphicFramePr>
+            <a:graphic xmlns:a="http://schemas.openxmlformats.org/drawingml/2006/main">
+              <a:graphicData uri="http://schemas.openxmlformats.org/drawingml/2006/picture">
+                <pic:pic xmlns:pic="http://schemas.openxmlformats.org/drawingml/2006/picture">
+                  <pic:nvPicPr>
+                    <pic:cNvPr id="1470606084" name=""/>
+                    <pic:cNvPicPr/>
+                  </pic:nvPicPr>
+                  <pic:blipFill>
+                    <a:blip r:embed="rId17"/>
+                    <a:stretch>
+                      <a:fillRect/>
+                    </a:stretch>
+                  </pic:blipFill>
+                  <pic:spPr>
+                    <a:xfrm>
+                      <a:off x="0" y="0"/>
+                      <a:ext cx="3048000" cy="1410970"/>
+                    </a:xfrm>
+                    <a:prstGeom prst="rect">
+                      <a:avLst/>
+                    </a:prstGeom>
+                  </pic:spPr>
+                </pic:pic>
+              </a:graphicData>
+            </a:graphic>
+          </wp:inline>
+        </w:drawing>
       </w:r>
     </w:p>
     <w:p>
-      <w:r>
-        <w:t>Feel free to improve the default MS Word table formatting shown here for aesthetic appeal (e.g. change cell size, border width, font size, etc.). If you have a favorite table formatting tool (e.g. LaTeX, Pandas pretty print, etc.), feel free to use that and include the output as an image. However, please ensure that the image quality is legible and the formatting generally matches the rest of the report</w:t>
-      </w:r>
-      <w:r>
-        <w:t xml:space="preserve">. Do not </w:t>
-      </w:r>
-      <w:r>
-        <w:t>include screenshots of raw code output</w:t>
-      </w:r>
-      <w:r>
-        <w:t xml:space="preserve">; </w:t>
-      </w:r>
-      <w:r>
-        <w:t>it is not professional to include dark mode or Courier New code output, or screenshots of your console window.</w:t>
+      <w:pPr>
+        <w:pStyle w:val="Caption"/>
+      </w:pPr>
+      <w:r>
+        <w:rPr>
+          <w:bCs/>
+        </w:rPr>
+        <w:t>Figure 2</w:t>
+      </w:r>
+      <w:r>
+        <w:br/>
+      </w:r>
+      <w:r>
+        <w:t>Kernel</w:t>
+      </w:r>
+      <w:r>
+        <w:t>-</w:t>
+      </w:r>
+      <w:r>
+        <w:t>density estimates of displacement</w:t>
+      </w:r>
+      <w:r>
+        <w:t>-</w:t>
+      </w:r>
+      <w:r>
+        <w:t>error distributions for the GRU, LSTM, and TCN models on the test set.</w:t>
       </w:r>
     </w:p>
     <w:p>
-      <w:pPr>
-        <w:pStyle w:val="Caption"/>
-        <w:rPr>
-          <w:sz w:val="24"/>
-          <w:szCs w:val="24"/>
-        </w:rPr>
-      </w:pPr>
-      <w:r>
-        <w:t>Table 7.1</w:t>
+      <w:r>
+        <w:t>A visual comparison of predicted versus true final displacements is shown in Figure 3. Each point represents the predicted five</w:t>
+      </w:r>
+      <w:r>
+        <w:noBreakHyphen/>
+        <w:t>step displacement relative to the true final position. The learned models cluster tightly around the origin, demonstrating that the GRU, LSTM, and TCN all produce accurate short</w:t>
+      </w:r>
+      <w:r>
+        <w:noBreakHyphen/>
+        <w:t>term displacement estimates in normalized coordinate space.</w:t>
       </w:r>
     </w:p>
     <w:p>
-      <w:pPr>
-        <w:pStyle w:val="Caption"/>
+      <w:r>
         <w:rPr>
-          <w:i/>
-          <w:iCs/>
-          <w:sz w:val="24"/>
-          <w:szCs w:val="24"/>
+          <w:noProof/>
         </w:rPr>
-      </w:pPr>
-      <w:r>
-        <w:t xml:space="preserve">Example text: Results for all three models over the standard benchmarking metrics. Highlighted cells show the best performance for each metric. </w:t>
-      </w:r>
-    </w:p>
-    <w:tbl>
-      <w:tblPr>
-        <w:tblStyle w:val="TableGrid"/>
-        <w:tblW w:w="4670" w:type="dxa"/>
-        <w:tblLayout w:type="fixed"/>
-        <w:tblLook w:val="04A0" w:firstRow="1" w:lastRow="0" w:firstColumn="1" w:lastColumn="0" w:noHBand="0" w:noVBand="1"/>
-      </w:tblPr>
-      <w:tblGrid>
-        <w:gridCol w:w="934"/>
-        <w:gridCol w:w="934"/>
-        <w:gridCol w:w="934"/>
-        <w:gridCol w:w="934"/>
-        <w:gridCol w:w="934"/>
-      </w:tblGrid>
-      <w:tr>
-        <w:trPr>
-          <w:trHeight w:val="300"/>
-        </w:trPr>
-        <w:tc>
-          <w:tcPr>
-            <w:tcW w:w="934" w:type="dxa"/>
-          </w:tcPr>
-          <w:p>
-            <w:pPr>
-              <w:jc w:val="left"/>
-              <w:rPr>
-                <w:rFonts w:asciiTheme="majorBidi" w:eastAsia="Linux Libertine" w:hAnsiTheme="majorBidi" w:cstheme="majorBidi"/>
-              </w:rPr>
-            </w:pPr>
-          </w:p>
-        </w:tc>
-        <w:tc>
-          <w:tcPr>
-            <w:tcW w:w="934" w:type="dxa"/>
-          </w:tcPr>
-          <w:p>
-            <w:pPr>
-              <w:jc w:val="left"/>
-              <w:rPr>
-                <w:rFonts w:asciiTheme="majorBidi" w:eastAsia="Linux Libertine" w:hAnsiTheme="majorBidi" w:cstheme="majorBidi"/>
-              </w:rPr>
-            </w:pPr>
-          </w:p>
-        </w:tc>
-        <w:tc>
-          <w:tcPr>
-            <w:tcW w:w="934" w:type="dxa"/>
-          </w:tcPr>
-          <w:p>
-            <w:pPr>
-              <w:jc w:val="left"/>
-              <w:rPr>
-                <w:rFonts w:asciiTheme="majorBidi" w:eastAsia="Linux Libertine" w:hAnsiTheme="majorBidi" w:cstheme="majorBidi"/>
-              </w:rPr>
-            </w:pPr>
-          </w:p>
-        </w:tc>
-        <w:tc>
-          <w:tcPr>
-            <w:tcW w:w="934" w:type="dxa"/>
-          </w:tcPr>
-          <w:p>
-            <w:pPr>
-              <w:jc w:val="left"/>
-              <w:rPr>
-                <w:rFonts w:asciiTheme="majorBidi" w:eastAsia="Linux Libertine" w:hAnsiTheme="majorBidi" w:cstheme="majorBidi"/>
-              </w:rPr>
-            </w:pPr>
-          </w:p>
-        </w:tc>
-        <w:tc>
-          <w:tcPr>
-            <w:tcW w:w="934" w:type="dxa"/>
-          </w:tcPr>
-          <w:p>
-            <w:pPr>
-              <w:jc w:val="left"/>
-              <w:rPr>
-                <w:rFonts w:asciiTheme="majorBidi" w:eastAsia="Linux Libertine" w:hAnsiTheme="majorBidi" w:cstheme="majorBidi"/>
-              </w:rPr>
-            </w:pPr>
-          </w:p>
-        </w:tc>
-      </w:tr>
-      <w:tr>
-        <w:trPr>
-          <w:trHeight w:val="300"/>
-        </w:trPr>
-        <w:tc>
-          <w:tcPr>
-            <w:tcW w:w="934" w:type="dxa"/>
-          </w:tcPr>
-          <w:p>
-            <w:pPr>
-              <w:jc w:val="left"/>
-              <w:rPr>
-                <w:rFonts w:asciiTheme="majorBidi" w:eastAsia="Linux Libertine" w:hAnsiTheme="majorBidi" w:cstheme="majorBidi"/>
-              </w:rPr>
-            </w:pPr>
-          </w:p>
-        </w:tc>
-        <w:tc>
-          <w:tcPr>
-            <w:tcW w:w="934" w:type="dxa"/>
-          </w:tcPr>
-          <w:p>
-            <w:pPr>
-              <w:jc w:val="left"/>
-              <w:rPr>
-                <w:rFonts w:asciiTheme="majorBidi" w:eastAsia="Linux Libertine" w:hAnsiTheme="majorBidi" w:cstheme="majorBidi"/>
-              </w:rPr>
-            </w:pPr>
-          </w:p>
-        </w:tc>
-        <w:tc>
-          <w:tcPr>
-            <w:tcW w:w="934" w:type="dxa"/>
-          </w:tcPr>
-          <w:p>
-            <w:pPr>
-              <w:jc w:val="left"/>
-              <w:rPr>
-                <w:rFonts w:asciiTheme="majorBidi" w:eastAsia="Linux Libertine" w:hAnsiTheme="majorBidi" w:cstheme="majorBidi"/>
-              </w:rPr>
-            </w:pPr>
-          </w:p>
-        </w:tc>
-        <w:tc>
-          <w:tcPr>
-            <w:tcW w:w="934" w:type="dxa"/>
-          </w:tcPr>
-          <w:p>
-            <w:pPr>
-              <w:jc w:val="left"/>
-              <w:rPr>
-                <w:rFonts w:asciiTheme="majorBidi" w:eastAsia="Linux Libertine" w:hAnsiTheme="majorBidi" w:cstheme="majorBidi"/>
-              </w:rPr>
-            </w:pPr>
-          </w:p>
-        </w:tc>
-        <w:tc>
-          <w:tcPr>
-            <w:tcW w:w="934" w:type="dxa"/>
-          </w:tcPr>
-          <w:p>
-            <w:pPr>
-              <w:jc w:val="left"/>
-              <w:rPr>
-                <w:rFonts w:asciiTheme="majorBidi" w:eastAsia="Linux Libertine" w:hAnsiTheme="majorBidi" w:cstheme="majorBidi"/>
-              </w:rPr>
-            </w:pPr>
-          </w:p>
-        </w:tc>
-      </w:tr>
-    </w:tbl>
-    <w:p/>
-    <w:p>
-      <w:r>
-        <w:t xml:space="preserve">A table is often a better alternative to a </w:t>
-      </w:r>
-      <w:proofErr w:type="gramStart"/>
-      <w:r>
-        <w:t>bulleted</w:t>
-      </w:r>
-      <w:proofErr w:type="gramEnd"/>
-      <w:r>
-        <w:t xml:space="preserve"> list for communicating information that may </w:t>
-      </w:r>
-      <w:r>
-        <w:t>otherwise seem redundant (e.g. variable details or model hyperparameter choices), or to make information easier to compare across categories (e.g. model performance). If you have a very complex table, think about how you might use bold or italic font to highlight notable cells, such as the best performing model.</w:t>
+        <w:drawing>
+          <wp:inline distT="0" distB="0" distL="0" distR="0" wp14:anchorId="46CE40A8" wp14:editId="3F3C1D0A">
+            <wp:extent cx="3048000" cy="2240915"/>
+            <wp:effectExtent l="0" t="0" r="0" b="6985"/>
+            <wp:docPr id="310459723" name="Picture 1"/>
+            <wp:cNvGraphicFramePr>
+              <a:graphicFrameLocks xmlns:a="http://schemas.openxmlformats.org/drawingml/2006/main" noChangeAspect="1"/>
+            </wp:cNvGraphicFramePr>
+            <a:graphic xmlns:a="http://schemas.openxmlformats.org/drawingml/2006/main">
+              <a:graphicData uri="http://schemas.openxmlformats.org/drawingml/2006/picture">
+                <pic:pic xmlns:pic="http://schemas.openxmlformats.org/drawingml/2006/picture">
+                  <pic:nvPicPr>
+                    <pic:cNvPr id="310459723" name=""/>
+                    <pic:cNvPicPr/>
+                  </pic:nvPicPr>
+                  <pic:blipFill>
+                    <a:blip r:embed="rId18"/>
+                    <a:stretch>
+                      <a:fillRect/>
+                    </a:stretch>
+                  </pic:blipFill>
+                  <pic:spPr>
+                    <a:xfrm>
+                      <a:off x="0" y="0"/>
+                      <a:ext cx="3048000" cy="2240915"/>
+                    </a:xfrm>
+                    <a:prstGeom prst="rect">
+                      <a:avLst/>
+                    </a:prstGeom>
+                  </pic:spPr>
+                </pic:pic>
+              </a:graphicData>
+            </a:graphic>
+          </wp:inline>
+        </w:drawing>
       </w:r>
     </w:p>
     <w:p>
       <w:pPr>
-        <w:pStyle w:val="Heading3"/>
-      </w:pPr>
-      <w:r>
-        <w:t>7.3.3</w:t>
-      </w:r>
-      <w:r>
-        <w:tab/>
-        <w:t>Equations</w:t>
+        <w:pStyle w:val="Caption"/>
+      </w:pPr>
+      <w:r>
+        <w:rPr>
+          <w:bCs/>
+        </w:rPr>
+        <w:t>Figure 3</w:t>
+      </w:r>
+      <w:r>
+        <w:br/>
+      </w:r>
+      <w:r>
+        <w:t>Scatter plot of predicted versus true final displacements for the GRU, LSTM, and TCN models on the test set.</w:t>
       </w:r>
     </w:p>
     <w:p>
       <w:r>
-        <w:t>Think carefully about whether including an equation is appropriate for your semi-technical stakeholder audience</w:t>
-      </w:r>
-      <w:r>
-        <w:t>. Most</w:t>
-      </w:r>
-      <w:r>
-        <w:t xml:space="preserve"> of the time that level of detail will be too technical, and equations should either be left out or included in a separate appendix.</w:t>
+        <w:lastRenderedPageBreak/>
+        <w:t>After examining the displacement</w:t>
+      </w:r>
+      <w:r>
+        <w:noBreakHyphen/>
+        <w:t>error distributions and final</w:t>
+      </w:r>
+      <w:r>
+        <w:noBreakHyphen/>
+        <w:t>step scatter comparisons, a consolidated view of model performance across all displacement metrics is shown in Figure 4. This bar chart summarizes the ADE, FDE, and MDE values for the GRU, LSTM, and TCN models on the held</w:t>
+      </w:r>
+      <w:r>
+        <w:noBreakHyphen/>
+        <w:t>out test set. The LSTM achieves the lowest errors across all three metrics, reflecting its strong temporal stability and consistent short</w:t>
+      </w:r>
+      <w:r>
+        <w:noBreakHyphen/>
+        <w:t>horizon accuracy. The GRU performs slightly worse but remains competitive, while the TCN exhibits higher MDE values despite achieving low ADE and FDE. This visualization reinforces the earlier findings that the LSTM provides the most reliable overall performance, while the TCN’s behavior is more sensitive to trajectory length and preprocessing conditions.</w:t>
       </w:r>
     </w:p>
     <w:p>
       <w:r>
-        <w:t xml:space="preserve">If you decide that you do want to include an equation, they should be on a separate line, </w:t>
-      </w:r>
-      <w:proofErr w:type="gramStart"/>
-      <w:r>
-        <w:t>indented</w:t>
-      </w:r>
-      <w:proofErr w:type="gramEnd"/>
-      <w:r>
-        <w:t xml:space="preserve">, and numbered sequentially to the right of the equation. As with figures and tables, equations should be referenced directly in your text with a short description (e.g. “Equation 7.1 shows the basic linear regression equation, where </w:t>
-      </w:r>
-      <w:r>
         <w:rPr>
-          <w:i/>
-          <w:iCs/>
+          <w:noProof/>
         </w:rPr>
-        <w:t>y</w:t>
-      </w:r>
-      <w:r>
-        <w:t xml:space="preserve"> is the target variable, </w:t>
-      </w:r>
-      <w:r>
-        <w:rPr>
-          <w:i/>
-          <w:iCs/>
-        </w:rPr>
-        <w:t>x</w:t>
-      </w:r>
-      <w:r>
-        <w:t xml:space="preserve"> is the model input, </w:t>
-      </w:r>
-      <w:r>
-        <w:rPr>
-          <w:i/>
-          <w:iCs/>
-        </w:rPr>
-        <w:t>a</w:t>
-      </w:r>
-      <w:r>
-        <w:t xml:space="preserve"> is the learned </w:t>
-      </w:r>
-      <w:proofErr w:type="spellStart"/>
-      <w:r>
-        <w:t>coefficent</w:t>
-      </w:r>
-      <w:proofErr w:type="spellEnd"/>
-      <w:r>
-        <w:t xml:space="preserve">, and </w:t>
-      </w:r>
-      <w:r>
-        <w:rPr>
-          <w:i/>
-          <w:iCs/>
-        </w:rPr>
-        <w:t>b</w:t>
-      </w:r>
-      <w:r>
-        <w:t xml:space="preserve"> is the model intercept.”) You DO NOT need to include </w:t>
-      </w:r>
-      <w:proofErr w:type="gramStart"/>
-      <w:r>
-        <w:t>a separate caption</w:t>
-      </w:r>
-      <w:proofErr w:type="gramEnd"/>
-      <w:r>
-        <w:t xml:space="preserve"> for your equations. </w:t>
+        <w:drawing>
+          <wp:inline distT="0" distB="0" distL="0" distR="0" wp14:anchorId="53219D7A" wp14:editId="2C561F99">
+            <wp:extent cx="3048000" cy="1881505"/>
+            <wp:effectExtent l="0" t="0" r="0" b="4445"/>
+            <wp:docPr id="278610169" name="Picture 1"/>
+            <wp:cNvGraphicFramePr>
+              <a:graphicFrameLocks xmlns:a="http://schemas.openxmlformats.org/drawingml/2006/main" noChangeAspect="1"/>
+            </wp:cNvGraphicFramePr>
+            <a:graphic xmlns:a="http://schemas.openxmlformats.org/drawingml/2006/main">
+              <a:graphicData uri="http://schemas.openxmlformats.org/drawingml/2006/picture">
+                <pic:pic xmlns:pic="http://schemas.openxmlformats.org/drawingml/2006/picture">
+                  <pic:nvPicPr>
+                    <pic:cNvPr id="278610169" name=""/>
+                    <pic:cNvPicPr/>
+                  </pic:nvPicPr>
+                  <pic:blipFill>
+                    <a:blip r:embed="rId19"/>
+                    <a:stretch>
+                      <a:fillRect/>
+                    </a:stretch>
+                  </pic:blipFill>
+                  <pic:spPr>
+                    <a:xfrm>
+                      <a:off x="0" y="0"/>
+                      <a:ext cx="3048000" cy="1881505"/>
+                    </a:xfrm>
+                    <a:prstGeom prst="rect">
+                      <a:avLst/>
+                    </a:prstGeom>
+                  </pic:spPr>
+                </pic:pic>
+              </a:graphicData>
+            </a:graphic>
+          </wp:inline>
+        </w:drawing>
       </w:r>
     </w:p>
     <w:p>
       <w:pPr>
-        <w:ind w:left="720" w:firstLine="720"/>
+        <w:pStyle w:val="Caption"/>
+      </w:pPr>
+      <w:r>
         <w:rPr>
-          <w:rFonts w:asciiTheme="majorBidi" w:eastAsia="Linux Libertine" w:hAnsiTheme="majorBidi" w:cstheme="majorBidi"/>
+          <w:bCs/>
         </w:rPr>
-      </w:pPr>
-      <m:oMath>
-        <m:r>
-          <w:rPr>
-            <w:rFonts w:ascii="Cambria Math" w:hAnsi="Cambria Math"/>
-          </w:rPr>
-          <m:t>y=ax+b</m:t>
-        </m:r>
-      </m:oMath>
-      <w:r>
-        <w:tab/>
-      </w:r>
-      <w:r>
-        <w:tab/>
-      </w:r>
-      <w:r>
-        <w:tab/>
-        <w:t>(7.1)</w:t>
+        <w:t>Figure 4</w:t>
+      </w:r>
+      <w:r>
+        <w:br/>
+      </w:r>
+      <w:r>
+        <w:t>Comparison of ADE, FDE, and MDE values for the GRU, LSTM, and TCN models on the test set.</w:t>
       </w:r>
     </w:p>
     <w:p>
-      <w:r>
-        <w:t xml:space="preserve">As with tables, if you have a favorite tool for formatting your equations, feel free to include the formatted equation as an image, </w:t>
-      </w:r>
-      <w:proofErr w:type="gramStart"/>
-      <w:r>
-        <w:t>as long as</w:t>
-      </w:r>
-      <w:proofErr w:type="gramEnd"/>
-      <w:r>
-        <w:t xml:space="preserve"> it matches the formatting shown in the example above.</w:t>
+      <w:pPr>
+        <w:pStyle w:val="Heading1"/>
+      </w:pPr>
+      <w:r>
+        <w:t>6</w:t>
+      </w:r>
+      <w:r>
+        <w:t xml:space="preserve">    </w:t>
+      </w:r>
+      <w:r>
+        <w:t>Conclusion</w:t>
       </w:r>
     </w:p>
     <w:p>
       <w:pPr>
-        <w:pStyle w:val="Heading2"/>
-      </w:pPr>
-      <w:r>
-        <w:t>7.4</w:t>
-      </w:r>
-      <w:r>
-        <w:tab/>
-        <w:t>Works Cited</w:t>
+        <w:spacing w:before="20"/>
+      </w:pPr>
+      <w:r>
+        <w:t>The goal of this project was to evaluate whether short</w:t>
+      </w:r>
+      <w:r>
+        <w:t>-</w:t>
+      </w:r>
+      <w:r>
+        <w:t>horizon motion can be accurately forecast using only GPS</w:t>
+      </w:r>
+      <w:r>
+        <w:t>-</w:t>
+      </w:r>
+      <w:r>
+        <w:t>derived features such as normalized positional deltas, speed, heading, acceleration, and turn rate, without relying on richer sensor suites. The working hypothesis was that sequence</w:t>
+      </w:r>
+      <w:r>
+        <w:t>-</w:t>
+      </w:r>
+      <w:r>
+        <w:t>based neural models would outperform a simple constant</w:t>
+      </w:r>
+      <w:r>
+        <w:t>-</w:t>
+      </w:r>
+      <w:r>
+        <w:t>velocity baseline and produce stable predictions suitable for real</w:t>
+      </w:r>
+      <w:r>
+        <w:t>-</w:t>
+      </w:r>
+      <w:r>
+        <w:t xml:space="preserve">time applications. The results strongly support this hypothesis. All learned models significantly outperformed the baseline, and the tuned LSTM </w:t>
+      </w:r>
+      <w:r>
+        <w:t xml:space="preserve">achieved </w:t>
+      </w:r>
+      <w:r>
+        <w:t>the strongest overall</w:t>
+      </w:r>
+      <w:r>
+        <w:t xml:space="preserve"> displacement</w:t>
+      </w:r>
+      <w:r>
+        <w:t>-error performance</w:t>
+      </w:r>
+      <w:r>
+        <w:t xml:space="preserve"> in normalized coordinate space on both validation and test sets.</w:t>
       </w:r>
     </w:p>
     <w:p>
-      <w:r>
-        <w:t xml:space="preserve">References should be alphabetically ordered using APA 7 formatting. You can refer to the </w:t>
-      </w:r>
-      <w:hyperlink r:id="rId17">
-        <w:r>
-          <w:rPr>
-            <w:rStyle w:val="Hyperlink"/>
-          </w:rPr>
-          <w:t>APA guidelines</w:t>
-        </w:r>
-      </w:hyperlink>
-      <w:r>
-        <w:t xml:space="preserve"> on how to format citations from different types of sources. There are also online tools that can be used to create citations for you, though these will occasionally produce errors, so be sure to double check these. If you are citing an </w:t>
-      </w:r>
-      <w:r>
-        <w:lastRenderedPageBreak/>
-        <w:t>academic paper, the Google Scholar listing for the paper will also have a properly formatted APA citation that you can copy into your report. Several example citations are shown in the works cited included in this template.</w:t>
+      <w:pPr>
+        <w:spacing w:before="20"/>
+        <w:rPr>
+          <w:rFonts w:cstheme="majorBidi"/>
+        </w:rPr>
+      </w:pPr>
+      <w:r>
+        <w:rPr>
+          <w:rFonts w:cstheme="majorBidi"/>
+        </w:rPr>
+        <w:t>The project demonstrated that careful preprocessing plays a central role in stabilizing short</w:t>
+      </w:r>
+      <w:r>
+        <w:rPr>
+          <w:rFonts w:cstheme="majorBidi"/>
+        </w:rPr>
+        <w:noBreakHyphen/>
+        <w:t>horizon forecasting. Adaptive window caps, per</w:t>
+      </w:r>
+      <w:r>
+        <w:rPr>
+          <w:rFonts w:cstheme="majorBidi"/>
+        </w:rPr>
+        <w:noBreakHyphen/>
+        <w:t>window normalization, and improved handling of long trajectories were essential for preventing instability, particularly in the TCN. These adjustments allowed the TCN to converge smoothly and achieve competitive performance alongside the recurrent models. Although the LSTM ultimately produced the lowest displacement errors across most metrics, the TCN showed strong potential once its architectural and memory requirements were properly managed.</w:t>
       </w:r>
     </w:p>
     <w:p>
       <w:pPr>
-        <w:pStyle w:val="Heading2"/>
-      </w:pPr>
-      <w:r>
-        <w:t>7.5</w:t>
-      </w:r>
-      <w:r>
-        <w:tab/>
-        <w:t>Appendices</w:t>
+        <w:spacing w:before="20"/>
+        <w:rPr>
+          <w:rFonts w:cstheme="majorBidi"/>
+        </w:rPr>
+      </w:pPr>
+      <w:r>
+        <w:rPr>
+          <w:rFonts w:cstheme="majorBidi"/>
+        </w:rPr>
+        <w:t>The results also highlighted the sensitivity of short</w:t>
+      </w:r>
+      <w:r>
+        <w:rPr>
+          <w:rFonts w:cstheme="majorBidi"/>
+        </w:rPr>
+        <w:noBreakHyphen/>
+        <w:t>horizon forecasting to irregular sampling intervals and angular discontinuities in heading. These artifacts introduced noise into derived kinematic variables and occasionally inflated displacement errors. Future work should incorporate heading unwrapping, timestamp interpolation, and more robust smoothing techniques to further stabilize the input features. Additional preprocessing improvements would likely enhance model performance, especially in trajectories with inconsistent sampling rates.</w:t>
       </w:r>
     </w:p>
     <w:p>
-      <w:r>
-        <w:t>Appendices can be used to include information that you feel is important to the communication of your project but may be too technical or too detailed for the intended semi-technical stakeholder audience. This may include items like a detailed description of data transformations, feature engineering, or architectural choices, or complete results over a hyperparameter grid search or a series of experimental architectures.</w:t>
+      <w:pPr>
+        <w:spacing w:before="20"/>
+        <w:rPr>
+          <w:rFonts w:cstheme="majorBidi"/>
+        </w:rPr>
+      </w:pPr>
+      <w:r>
+        <w:rPr>
+          <w:rFonts w:cstheme="majorBidi"/>
+        </w:rPr>
+        <w:t>A valuable extension of this work would be to examine how different GPS sampling intervals affect model accuracy. The GeoLife dataset contains many trajectories sampled near one hertz, but real</w:t>
+      </w:r>
+      <w:r>
+        <w:rPr>
+          <w:rFonts w:cstheme="majorBidi"/>
+        </w:rPr>
+        <w:noBreakHyphen/>
+        <w:t xml:space="preserve">world systems often operate at lower or variable rates due to device limitations, power constraints, or environmental conditions. Systematically degrading the sampling frequency and evaluating the resulting impact on ADE, FDE, </w:t>
+      </w:r>
+      <w:r>
+        <w:rPr>
+          <w:rFonts w:cstheme="majorBidi"/>
+        </w:rPr>
+        <w:lastRenderedPageBreak/>
+        <w:t>and MDE would reveal the minimum viable sampling rate at which the learned models maintain reliable short</w:t>
+      </w:r>
+      <w:r>
+        <w:rPr>
+          <w:rFonts w:cstheme="majorBidi"/>
+        </w:rPr>
+        <w:noBreakHyphen/>
+        <w:t>term forecasts. This analysis would provide practical guidance for deployment scenarios where GPS updates may arrive more slowly, and it would help determine whether additional temporal modeling or interpolation strategies are required to preserve accuracy under reduced sampling conditions.</w:t>
       </w:r>
     </w:p>
     <w:p>
-      <w:r>
-        <w:t>Appendices are not included in the page count but should not be used to get around the report page limits. Information included in the appendices should not be necessary for a basic understanding of your project and should instead provide deeper detail for an interested reader. You can assume that your stakeholder audience would not read most of the content in an appendix, and as such, your appendix content may not contribute to your final report grade.</w:t>
+      <w:pPr>
+        <w:spacing w:before="20"/>
+        <w:rPr>
+          <w:rFonts w:cstheme="majorBidi"/>
+        </w:rPr>
+      </w:pPr>
+      <w:r>
+        <w:rPr>
+          <w:rFonts w:cstheme="majorBidi"/>
+        </w:rPr>
+        <w:t>Several additional extensions would strengthen the forecasting system and broaden its applicability. Transformer</w:t>
+      </w:r>
+      <w:r>
+        <w:rPr>
+          <w:rFonts w:cstheme="majorBidi"/>
+        </w:rPr>
+        <w:noBreakHyphen/>
+        <w:t>based architectures represent a promising direction, as they can model long</w:t>
+      </w:r>
+      <w:r>
+        <w:rPr>
+          <w:rFonts w:cstheme="majorBidi"/>
+        </w:rPr>
+        <w:noBreakHyphen/>
+        <w:t>range temporal dependencies and adapt to irregular sampling without explicit normalization. Evaluating performance across different transportation modes such as walking, biking, and driving would provide deeper insight into how the models behave under distinct motion regimes. Developing a production</w:t>
+      </w:r>
+      <w:r>
+        <w:rPr>
+          <w:rFonts w:cstheme="majorBidi"/>
+        </w:rPr>
+        <w:noBreakHyphen/>
+        <w:t>ready inference module with real</w:t>
+      </w:r>
+      <w:r>
+        <w:rPr>
+          <w:rFonts w:cstheme="majorBidi"/>
+        </w:rPr>
+        <w:noBreakHyphen/>
+        <w:t>time streaming, latency profiling, and monitoring would enable deployment in operational environments where rapid and reliable short</w:t>
+      </w:r>
+      <w:r>
+        <w:rPr>
+          <w:rFonts w:cstheme="majorBidi"/>
+        </w:rPr>
+        <w:noBreakHyphen/>
+        <w:t>term motion prediction is required.</w:t>
       </w:r>
     </w:p>
     <w:p>
-      <w:r>
-        <w:t>Appendices should be labeled alphabetically (Appendix A, Appendix B, etc.) and should be referred to directly in your text (e.g. “A complete table of results over all hyperparameters can be found in Appendix A”). Each appendix should start on a new page and does not need to be in the two-column format if full page width makes more sense for your content (e.g. detailed figures or large tables).</w:t>
+      <w:pPr>
+        <w:spacing w:before="20"/>
+        <w:rPr>
+          <w:rFonts w:cstheme="majorBidi"/>
+        </w:rPr>
+      </w:pPr>
+      <w:r>
+        <w:rPr>
+          <w:rFonts w:cstheme="majorBidi"/>
+        </w:rPr>
+        <w:t>Overall, the results demonstrate that accurate short</w:t>
+      </w:r>
+      <w:r>
+        <w:rPr>
+          <w:rFonts w:cstheme="majorBidi"/>
+        </w:rPr>
+        <w:noBreakHyphen/>
+        <w:t>horizon motion forecasting is feasible using only GPS</w:t>
+      </w:r>
+      <w:r>
+        <w:rPr>
+          <w:rFonts w:cstheme="majorBidi"/>
+        </w:rPr>
+        <w:noBreakHyphen/>
+        <w:t>derived features and lightweight temporal models. The final pipeline provides a strong foundation for future work in real</w:t>
+      </w:r>
+      <w:r>
+        <w:rPr>
+          <w:rFonts w:cstheme="majorBidi"/>
+        </w:rPr>
+        <w:noBreakHyphen/>
+        <w:t>time mobility analytics and highlights the importance of careful preprocessing, sampling</w:t>
+      </w:r>
+      <w:r>
+        <w:rPr>
+          <w:rFonts w:cstheme="majorBidi"/>
+        </w:rPr>
+        <w:noBreakHyphen/>
+        <w:t>rate considerations, and architectural design when working with large and heterogeneous geospatial datasets.</w:t>
       </w:r>
     </w:p>
     <w:p>
       <w:pPr>
         <w:pStyle w:val="Heading1"/>
         <w:rPr>
-          <w:rFonts w:asciiTheme="majorBidi" w:eastAsia="Linux Libertine" w:hAnsiTheme="majorBidi"/>
-          <w:sz w:val="24"/>
-          <w:szCs w:val="24"/>
+          <w:rFonts w:cs="Linux Libertine"/>
         </w:rPr>
       </w:pPr>
       <w:r>
+        <w:rPr>
+          <w:rFonts w:cs="Linux Libertine"/>
+        </w:rPr>
         <w:t>ACKNOWLEDGMENTS</w:t>
       </w:r>
     </w:p>
     <w:p>
       <w:pPr>
         <w:spacing w:before="20"/>
-        <w:rPr>
-          <w:rFonts w:asciiTheme="majorBidi" w:eastAsia="Linux Libertine" w:hAnsiTheme="majorBidi" w:cstheme="majorBidi"/>
-        </w:rPr>
-      </w:pPr>
-      <w:r>
-        <w:rPr>
-          <w:rFonts w:eastAsia="Linux Libertine" w:cstheme="majorBidi"/>
-        </w:rPr>
-        <w:t xml:space="preserve">These are optional, but might mention any external contributors to your project, such as </w:t>
-      </w:r>
-      <w:r>
-        <w:rPr>
-          <w:rFonts w:eastAsia="Linux Libertine" w:cstheme="majorBidi"/>
-        </w:rPr>
-        <w:t>professors or mentors who provided data or consultation.</w:t>
+      </w:pPr>
+      <w:r>
+        <w:t xml:space="preserve">I would like to express my sincere appreciation to Professor Anna Marbut for her guidance, feedback, and support throughout this project. Her insight and encouragement were instrumental in shaping the direction of this work and ensuring its </w:t>
+      </w:r>
+      <w:r>
+        <w:t>successful completion. I am also grateful to the faculty of the Applied Artificial Intelligence program at the University of San Diego, whose instruction and mentorship provided the foundation for the knowledge and skills applied in this project. Their commitment to academic excellence and student success has been invaluable throughout my time in the program.</w:t>
       </w:r>
     </w:p>
     <w:p>
       <w:pPr>
-        <w:spacing w:before="200" w:after="60"/>
-        <w:jc w:val="left"/>
-      </w:pPr>
-      <w:r>
+        <w:pStyle w:val="Heading1"/>
         <w:rPr>
-          <w:rStyle w:val="Heading1Char"/>
+          <w:rFonts w:cs="Linux Libertine"/>
+        </w:rPr>
+      </w:pPr>
+      <w:r>
+        <w:rPr>
+          <w:rFonts w:cs="Linux Libertine"/>
         </w:rPr>
         <w:t>Works Cited</w:t>
       </w:r>
@@ -1955,7 +1604,7 @@
       <w:r>
         <w:t xml:space="preserve">. </w:t>
       </w:r>
-      <w:hyperlink r:id="rId18" w:history="1">
+      <w:hyperlink r:id="rId20" w:history="1">
         <w:r>
           <w:rPr>
             <w:rStyle w:val="Hyperlink"/>
@@ -1971,21 +1620,24 @@
         <w:jc w:val="left"/>
       </w:pPr>
       <w:r>
-        <w:t xml:space="preserve">Bai, S., Kolter, J. Z., &amp; Koltun, V. (2018). An empirical evaluation of generic convolutional and recurrent networks for sequence modeling. </w:t>
-      </w:r>
-      <w:proofErr w:type="spellStart"/>
+        <w:t xml:space="preserve">Bai, S., Kolter, J. Z., &amp; Koltun, V. (2018). </w:t>
+      </w:r>
       <w:r>
         <w:rPr>
           <w:i/>
-          <w:iCs/>
         </w:rPr>
+        <w:t>An empirical evaluation of generic convolutional and recurrent networks for sequence modeling</w:t>
+      </w:r>
+      <w:r>
+        <w:t xml:space="preserve">. </w:t>
+      </w:r>
+      <w:r>
         <w:t>arXiv</w:t>
       </w:r>
-      <w:proofErr w:type="spellEnd"/>
       <w:r>
         <w:t xml:space="preserve">. </w:t>
       </w:r>
-      <w:hyperlink r:id="rId19" w:history="1">
+      <w:hyperlink r:id="rId21" w:history="1">
         <w:r>
           <w:rPr>
             <w:rStyle w:val="Hyperlink"/>
@@ -2001,53 +1653,24 @@
         <w:jc w:val="left"/>
       </w:pPr>
       <w:r>
-        <w:t xml:space="preserve">Cho, K., van </w:t>
-      </w:r>
-      <w:proofErr w:type="spellStart"/>
-      <w:r>
-        <w:t>Merriënboer</w:t>
-      </w:r>
-      <w:proofErr w:type="spellEnd"/>
-      <w:r>
-        <w:t xml:space="preserve">, B., </w:t>
-      </w:r>
-      <w:proofErr w:type="spellStart"/>
-      <w:r>
-        <w:t>Gulcehre</w:t>
-      </w:r>
-      <w:proofErr w:type="spellEnd"/>
-      <w:r>
-        <w:t xml:space="preserve">, C., </w:t>
-      </w:r>
-      <w:proofErr w:type="spellStart"/>
-      <w:r>
-        <w:t>Bahdanau</w:t>
-      </w:r>
-      <w:proofErr w:type="spellEnd"/>
-      <w:r>
-        <w:t xml:space="preserve">, D., </w:t>
-      </w:r>
-      <w:proofErr w:type="spellStart"/>
-      <w:r>
-        <w:t>Bougares</w:t>
-      </w:r>
-      <w:proofErr w:type="spellEnd"/>
-      <w:r>
-        <w:t xml:space="preserve">, F., Schwenk, H., &amp; Bengio, Y. (2014). Learning phrase representations using RNN encoder–decoder for statistical machine translation. </w:t>
-      </w:r>
-      <w:proofErr w:type="spellStart"/>
+        <w:t xml:space="preserve">Cho, K., van Merriënboer, B., Gulcehre, C., Bahdanau, D., Bougares, F., Schwenk, H., &amp; Bengio, Y. (2014). </w:t>
+      </w:r>
       <w:r>
         <w:rPr>
           <w:i/>
-          <w:iCs/>
         </w:rPr>
+        <w:t>Learning phrase representations using RNN encoder–decoder for statistical machine translation</w:t>
+      </w:r>
+      <w:r>
+        <w:t xml:space="preserve">. </w:t>
+      </w:r>
+      <w:r>
         <w:t>arXiv</w:t>
       </w:r>
-      <w:proofErr w:type="spellEnd"/>
       <w:r>
         <w:t xml:space="preserve">. </w:t>
       </w:r>
-      <w:hyperlink r:id="rId20" w:history="1">
+      <w:hyperlink r:id="rId22" w:history="1">
         <w:r>
           <w:rPr>
             <w:rStyle w:val="Hyperlink"/>
@@ -2063,15 +1686,7 @@
         <w:jc w:val="left"/>
       </w:pPr>
       <w:r>
-        <w:t>Devlin, J., Chang, M.-W., Lee, K., &amp; Toutanova, K. (2019). BERT: Pre-</w:t>
-      </w:r>
-      <w:proofErr w:type="gramStart"/>
-      <w:r>
-        <w:t>training of</w:t>
-      </w:r>
-      <w:proofErr w:type="gramEnd"/>
-      <w:r>
-        <w:t xml:space="preserve"> deep bidirectional transformers for language understanding. In </w:t>
+        <w:t xml:space="preserve">Devlin, J., Chang, M.-W., Lee, K., &amp; Toutanova, K. (2019). BERT: Pre-training of deep bidirectional transformers for language understanding. In </w:t>
       </w:r>
       <w:r>
         <w:rPr>
@@ -2083,7 +1698,7 @@
       <w:r>
         <w:t xml:space="preserve"> (pp. 4171–4186). </w:t>
       </w:r>
-      <w:hyperlink r:id="rId21" w:history="1">
+      <w:hyperlink r:id="rId23" w:history="1">
         <w:r>
           <w:rPr>
             <w:rStyle w:val="Hyperlink"/>
@@ -2097,29 +1712,9 @@
         <w:spacing w:before="60" w:after="60"/>
         <w:ind w:left="300" w:hanging="300"/>
         <w:jc w:val="left"/>
-        <w:rPr>
-          <w:kern w:val="2"/>
-          <w14:ligatures w14:val="standardContextual"/>
-        </w:rPr>
-      </w:pPr>
-      <w:r>
-        <w:t xml:space="preserve">Derrow-Pinion, A., She, J., Wong, D., Lange, O., Hester, T., Perez, L., </w:t>
-      </w:r>
-      <w:proofErr w:type="spellStart"/>
-      <w:r>
-        <w:t>Nunkesser</w:t>
-      </w:r>
-      <w:proofErr w:type="spellEnd"/>
-      <w:r>
-        <w:t xml:space="preserve">, M., Lee, S., Guo, X., Wiltshire, B., Battaglia, P. W., Gupta, V., Li, A., Xu, Z., Sanchez-Gonzalez, A., Li, Y., &amp; </w:t>
-      </w:r>
-      <w:proofErr w:type="spellStart"/>
-      <w:r>
-        <w:t>Veličković</w:t>
-      </w:r>
-      <w:proofErr w:type="spellEnd"/>
-      <w:r>
-        <w:t xml:space="preserve">, P. (2021). ETA prediction with graph neural networks in Google Maps. In </w:t>
+      </w:pPr>
+      <w:r>
+        <w:t xml:space="preserve">Derrow-Pinion, A., She, J., Wong, D., Lange, O., Hester, T., Perez, L., Nunkesser, M., Lee, S., Guo, X., Wiltshire, B., Battaglia, P. W., Gupta, V., Li, A., Xu, Z., Sanchez-Gonzalez, A., Li, Y., &amp; Veličković, P. (2021). ETA prediction with graph neural networks in Google Maps. In </w:t>
       </w:r>
       <w:r>
         <w:rPr>
@@ -2129,8 +1724,20 @@
         <w:t>Proceedings of the 30th ACM International Conference on Information and Knowledge Management</w:t>
       </w:r>
       <w:r>
-        <w:t xml:space="preserve"> (pp. 3767–3776). https://doi.org/10.1145/3459637.3481916</w:t>
-      </w:r>
+        <w:t xml:space="preserve"> (pp. </w:t>
+      </w:r>
+      <w:r>
+        <w:lastRenderedPageBreak/>
+        <w:t xml:space="preserve">3767–3776). </w:t>
+      </w:r>
+      <w:hyperlink r:id="rId24" w:history="1">
+        <w:r>
+          <w:rPr>
+            <w:rStyle w:val="Hyperlink"/>
+          </w:rPr>
+          <w:t>https://doi.org/10.1145/3459637.3481916</w:t>
+        </w:r>
+      </w:hyperlink>
     </w:p>
     <w:p>
       <w:pPr>
@@ -2139,15 +1746,7 @@
         <w:jc w:val="left"/>
       </w:pPr>
       <w:r>
-        <w:t xml:space="preserve">Hochreiter, S., &amp; </w:t>
-      </w:r>
-      <w:proofErr w:type="spellStart"/>
-      <w:r>
-        <w:t>Schmidhuber</w:t>
-      </w:r>
-      <w:proofErr w:type="spellEnd"/>
-      <w:r>
-        <w:t xml:space="preserve">, J. (1997). Long short-term memory. </w:t>
+        <w:t xml:space="preserve">Hochreiter, S., &amp; Schmidhuber, J. (1997). Long short-term memory. </w:t>
       </w:r>
       <w:r>
         <w:rPr>
@@ -2159,7 +1758,7 @@
       <w:r>
         <w:t xml:space="preserve">(8), 1735–1780. </w:t>
       </w:r>
-      <w:hyperlink r:id="rId22" w:history="1">
+      <w:hyperlink r:id="rId25" w:history="1">
         <w:r>
           <w:rPr>
             <w:rStyle w:val="Hyperlink"/>
@@ -2175,7 +1774,6 @@
         <w:jc w:val="left"/>
       </w:pPr>
       <w:r>
-        <w:lastRenderedPageBreak/>
         <w:t xml:space="preserve">Kingma, D. P., &amp; Ba, J. (2015). Adam: A method for stochastic optimization. </w:t>
       </w:r>
       <w:r>
@@ -2188,7 +1786,7 @@
       <w:r>
         <w:t xml:space="preserve">. </w:t>
       </w:r>
-      <w:hyperlink r:id="rId23" w:history="1">
+      <w:hyperlink r:id="rId26" w:history="1">
         <w:r>
           <w:rPr>
             <w:rStyle w:val="Hyperlink"/>
@@ -2216,7 +1814,7 @@
       <w:r>
         <w:t xml:space="preserve"> (Version 1.3) [Data set]. Microsoft. </w:t>
       </w:r>
-      <w:hyperlink r:id="rId24" w:history="1">
+      <w:hyperlink r:id="rId27" w:history="1">
         <w:r>
           <w:rPr>
             <w:rStyle w:val="Hyperlink"/>
@@ -2232,15 +1830,7 @@
         <w:jc w:val="left"/>
       </w:pPr>
       <w:r>
-        <w:t xml:space="preserve">Radford, A., Wu, J., Child, R., Luan, D., Amodei, D., &amp; </w:t>
-      </w:r>
-      <w:proofErr w:type="spellStart"/>
-      <w:r>
-        <w:t>Sutskever</w:t>
-      </w:r>
-      <w:proofErr w:type="spellEnd"/>
-      <w:r>
-        <w:t xml:space="preserve">, D. (2019). </w:t>
+        <w:t xml:space="preserve">Radford, A., Wu, J., Child, R., Luan, D., Amodei, D., &amp; Sutskever, D. (2019). </w:t>
       </w:r>
       <w:r>
         <w:rPr>
@@ -2252,7 +1842,7 @@
       <w:r>
         <w:t xml:space="preserve">. OpenAI. </w:t>
       </w:r>
-      <w:hyperlink r:id="rId25" w:history="1">
+      <w:hyperlink r:id="rId28" w:history="1">
         <w:r>
           <w:rPr>
             <w:rStyle w:val="Hyperlink"/>
@@ -2268,21 +1858,24 @@
         <w:jc w:val="left"/>
       </w:pPr>
       <w:r>
-        <w:t xml:space="preserve">Sola, J. (2017). Quaternion kinematics for the error-state Kalman filter. </w:t>
-      </w:r>
-      <w:proofErr w:type="spellStart"/>
+        <w:t xml:space="preserve">Sola, J. (2017). </w:t>
+      </w:r>
       <w:r>
         <w:rPr>
           <w:i/>
-          <w:iCs/>
         </w:rPr>
+        <w:t>Quaternion kinematics for the error-state Kalman filter</w:t>
+      </w:r>
+      <w:r>
+        <w:t xml:space="preserve">. </w:t>
+      </w:r>
+      <w:r>
         <w:t>arXiv</w:t>
       </w:r>
-      <w:proofErr w:type="spellEnd"/>
       <w:r>
         <w:t xml:space="preserve">. </w:t>
       </w:r>
-      <w:hyperlink r:id="rId26" w:history="1">
+      <w:hyperlink r:id="rId29" w:history="1">
         <w:r>
           <w:rPr>
             <w:rStyle w:val="Hyperlink"/>
@@ -2298,15 +1891,7 @@
         <w:jc w:val="left"/>
       </w:pPr>
       <w:r>
-        <w:t xml:space="preserve">Teunissen, P. J., &amp; </w:t>
-      </w:r>
-      <w:proofErr w:type="spellStart"/>
-      <w:r>
-        <w:t>Montenbruck</w:t>
-      </w:r>
-      <w:proofErr w:type="spellEnd"/>
-      <w:r>
-        <w:t xml:space="preserve">, O. (Eds.). (2017). </w:t>
+        <w:t xml:space="preserve">Teunissen, P. J., &amp; Montenbruck, O. (Eds.). (2017). </w:t>
       </w:r>
       <w:r>
         <w:rPr>
@@ -2318,7 +1903,7 @@
       <w:r>
         <w:t xml:space="preserve">. Springer. </w:t>
       </w:r>
-      <w:hyperlink r:id="rId27" w:history="1">
+      <w:hyperlink r:id="rId30" w:history="1">
         <w:r>
           <w:rPr>
             <w:rStyle w:val="Hyperlink"/>
@@ -2334,45 +1919,24 @@
         <w:jc w:val="left"/>
       </w:pPr>
       <w:r>
-        <w:t xml:space="preserve">Vaswani, A., </w:t>
-      </w:r>
-      <w:proofErr w:type="spellStart"/>
-      <w:r>
-        <w:t>Shazeer</w:t>
-      </w:r>
-      <w:proofErr w:type="spellEnd"/>
-      <w:r>
-        <w:t xml:space="preserve">, N., Parmar, N., </w:t>
-      </w:r>
-      <w:proofErr w:type="spellStart"/>
-      <w:r>
-        <w:t>Uszkoreit</w:t>
-      </w:r>
-      <w:proofErr w:type="spellEnd"/>
-      <w:r>
-        <w:t xml:space="preserve">, J., Jones, L., Gomez, A. N., Kaiser, Ł., &amp; </w:t>
-      </w:r>
-      <w:proofErr w:type="spellStart"/>
-      <w:r>
-        <w:t>Polosukhin</w:t>
-      </w:r>
-      <w:proofErr w:type="spellEnd"/>
-      <w:r>
-        <w:t xml:space="preserve">, I. (2017). Attention is all you need. </w:t>
-      </w:r>
-      <w:proofErr w:type="spellStart"/>
+        <w:t xml:space="preserve">Vaswani, A., Shazeer, N., Parmar, N., Uszkoreit, J., Jones, L., Gomez, A. N., Kaiser, Ł., &amp; Polosukhin, I. (2017). </w:t>
+      </w:r>
       <w:r>
         <w:rPr>
           <w:i/>
-          <w:iCs/>
         </w:rPr>
+        <w:t>Attention is all you need</w:t>
+      </w:r>
+      <w:r>
+        <w:t xml:space="preserve">. </w:t>
+      </w:r>
+      <w:r>
         <w:t>arXiv</w:t>
       </w:r>
-      <w:proofErr w:type="spellEnd"/>
       <w:r>
         <w:t xml:space="preserve">. </w:t>
       </w:r>
-      <w:hyperlink r:id="rId28" w:history="1">
+      <w:hyperlink r:id="rId31" w:history="1">
         <w:r>
           <w:rPr>
             <w:rStyle w:val="Hyperlink"/>
@@ -2400,7 +1964,7 @@
       <w:r>
         <w:t xml:space="preserve">(3), 381–399. </w:t>
       </w:r>
-      <w:hyperlink r:id="rId29" w:history="1">
+      <w:hyperlink r:id="rId32" w:history="1">
         <w:r>
           <w:rPr>
             <w:rStyle w:val="Hyperlink"/>
@@ -2428,7 +1992,7 @@
       <w:r>
         <w:t xml:space="preserve"> (pp. 312–321). </w:t>
       </w:r>
-      <w:hyperlink r:id="rId30" w:history="1">
+      <w:hyperlink r:id="rId33" w:history="1">
         <w:r>
           <w:rPr>
             <w:rStyle w:val="Hyperlink"/>
@@ -2478,7 +2042,7 @@
 </file>
 
 <file path=word/endnotes.xml><?xml version="1.0" encoding="utf-8"?>
-<w:endnotes xmlns:wpc="http://schemas.microsoft.com/office/word/2010/wordprocessingCanvas" xmlns:cx="http://schemas.microsoft.com/office/drawing/2014/chartex" xmlns:cx1="http://schemas.microsoft.com/office/drawing/2015/9/8/chartex" xmlns:cx2="http://schemas.microsoft.com/office/drawing/2015/10/21/chartex" xmlns:cx3="http://schemas.microsoft.com/office/drawing/2016/5/9/chartex" xmlns:cx4="http://schemas.microsoft.com/office/drawing/2016/5/10/chartex" xmlns:cx5="http://schemas.microsoft.com/office/drawing/2016/5/11/chartex" xmlns:cx6="http://schemas.microsoft.com/office/drawing/2016/5/12/chartex" xmlns:cx7="http://schemas.microsoft.com/office/drawing/2016/5/13/chartex" xmlns:cx8="http://schemas.microsoft.com/office/drawing/2016/5/14/chartex" xmlns:mc="http://schemas.openxmlformats.org/markup-compatibility/2006" xmlns:aink="http://schemas.microsoft.com/office/drawing/2016/ink" xmlns:am3d="http://schemas.microsoft.com/office/drawing/2017/model3d" xmlns:o="urn:schemas-microsoft-com:office:office" xmlns:oel="http://schemas.microsoft.com/office/2019/extlst" xmlns:r="http://schemas.openxmlformats.org/officeDocument/2006/relationships" xmlns:m="http://schemas.openxmlformats.org/officeDocument/2006/math" xmlns:v="urn:schemas-microsoft-com:vml" xmlns:wp14="http://schemas.microsoft.com/office/word/2010/wordprocessingDrawing" xmlns:wp="http://schemas.openxmlformats.org/drawingml/2006/wordprocessingDrawing" xmlns:w10="urn:schemas-microsoft-com:office:word" xmlns:w="http://schemas.openxmlformats.org/wordprocessingml/2006/main" xmlns:w14="http://schemas.microsoft.com/office/word/2010/wordml" xmlns:w15="http://schemas.microsoft.com/office/word/2012/wordml" xmlns:w16cex="http://schemas.microsoft.com/office/word/2018/wordml/cex" xmlns:w16cid="http://schemas.microsoft.com/office/word/2016/wordml/cid" xmlns:w16="http://schemas.microsoft.com/office/word/2018/wordml" xmlns:w16du="http://schemas.microsoft.com/office/word/2023/wordml/word16du" xmlns:w16sdtdh="http://schemas.microsoft.com/office/word/2020/wordml/sdtdatahash" xmlns:w16sdtfl="http://schemas.microsoft.com/office/word/2024/wordml/sdtformatlock" xmlns:w16se="http://schemas.microsoft.com/office/word/2015/wordml/symex" xmlns:wpg="http://schemas.microsoft.com/office/word/2010/wordprocessingGroup" xmlns:wpi="http://schemas.microsoft.com/office/word/2010/wordprocessingInk" xmlns:wne="http://schemas.microsoft.com/office/word/2006/wordml" xmlns:wps="http://schemas.microsoft.com/office/word/2010/wordprocessingShape" mc:Ignorable="w14 w15 w16se w16cid w16 w16cex w16sdtdh w16sdtfl w16du wp14">
+<w:endnotes xmlns:wpc="http://schemas.microsoft.com/office/word/2010/wordprocessingCanvas" xmlns:cx="http://schemas.microsoft.com/office/drawing/2014/chartex" xmlns:cx1="http://schemas.microsoft.com/office/drawing/2015/9/8/chartex" xmlns:cx2="http://schemas.microsoft.com/office/drawing/2015/10/21/chartex" xmlns:cx3="http://schemas.microsoft.com/office/drawing/2016/5/9/chartex" xmlns:cx4="http://schemas.microsoft.com/office/drawing/2016/5/10/chartex" xmlns:cx5="http://schemas.microsoft.com/office/drawing/2016/5/11/chartex" xmlns:cx6="http://schemas.microsoft.com/office/drawing/2016/5/12/chartex" xmlns:cx7="http://schemas.microsoft.com/office/drawing/2016/5/13/chartex" xmlns:cx8="http://schemas.microsoft.com/office/drawing/2016/5/14/chartex" xmlns:mc="http://schemas.openxmlformats.org/markup-compatibility/2006" xmlns:aink="http://schemas.microsoft.com/office/drawing/2016/ink" xmlns:am3d="http://schemas.microsoft.com/office/drawing/2017/model3d" xmlns:o="urn:schemas-microsoft-com:office:office" xmlns:oel="http://schemas.microsoft.com/office/2019/extlst" xmlns:r="http://schemas.openxmlformats.org/officeDocument/2006/relationships" xmlns:m="http://schemas.openxmlformats.org/officeDocument/2006/math" xmlns:v="urn:schemas-microsoft-com:vml" xmlns:wp14="http://schemas.microsoft.com/office/word/2010/wordprocessingDrawing" xmlns:wp="http://schemas.openxmlformats.org/drawingml/2006/wordprocessingDrawing" xmlns:w10="urn:schemas-microsoft-com:office:word" xmlns:w="http://schemas.openxmlformats.org/wordprocessingml/2006/main" xmlns:w14="http://schemas.microsoft.com/office/word/2010/wordml" xmlns:w15="http://schemas.microsoft.com/office/word/2012/wordml" xmlns:w16cei="http://schemas.microsoft.com/office/word/2026/wordml/cei" xmlns:w16cex="http://schemas.microsoft.com/office/word/2018/wordml/cex" xmlns:w16cid="http://schemas.microsoft.com/office/word/2016/wordml/cid" xmlns:w16="http://schemas.microsoft.com/office/word/2018/wordml" xmlns:w16du="http://schemas.microsoft.com/office/word/2023/wordml/word16du" xmlns:w16sdtdh="http://schemas.microsoft.com/office/word/2020/wordml/sdtdatahash" xmlns:w16sdtfl="http://schemas.microsoft.com/office/word/2024/wordml/sdtformatlock" xmlns:w16se="http://schemas.microsoft.com/office/word/2015/wordml/symex" xmlns:wpg="http://schemas.microsoft.com/office/word/2010/wordprocessingGroup" xmlns:wpi="http://schemas.microsoft.com/office/word/2010/wordprocessingInk" xmlns:wne="http://schemas.microsoft.com/office/word/2006/wordml" xmlns:wps="http://schemas.microsoft.com/office/word/2010/wordprocessingShape" mc:Ignorable="w14 w15 w16se w16cid w16 w16cex w16sdtdh w16sdtfl w16du wp14">
   <w:endnote w:type="separator" w:id="-1">
     <w:p>
       <w:pPr>
@@ -2503,7 +2067,7 @@
 </file>
 
 <file path=word/footer1.xml><?xml version="1.0" encoding="utf-8"?>
-<w:ftr xmlns:wpc="http://schemas.microsoft.com/office/word/2010/wordprocessingCanvas" xmlns:cx="http://schemas.microsoft.com/office/drawing/2014/chartex" xmlns:cx1="http://schemas.microsoft.com/office/drawing/2015/9/8/chartex" xmlns:cx2="http://schemas.microsoft.com/office/drawing/2015/10/21/chartex" xmlns:cx3="http://schemas.microsoft.com/office/drawing/2016/5/9/chartex" xmlns:cx4="http://schemas.microsoft.com/office/drawing/2016/5/10/chartex" xmlns:cx5="http://schemas.microsoft.com/office/drawing/2016/5/11/chartex" xmlns:cx6="http://schemas.microsoft.com/office/drawing/2016/5/12/chartex" xmlns:cx7="http://schemas.microsoft.com/office/drawing/2016/5/13/chartex" xmlns:cx8="http://schemas.microsoft.com/office/drawing/2016/5/14/chartex" xmlns:mc="http://schemas.openxmlformats.org/markup-compatibility/2006" xmlns:aink="http://schemas.microsoft.com/office/drawing/2016/ink" xmlns:am3d="http://schemas.microsoft.com/office/drawing/2017/model3d" xmlns:o="urn:schemas-microsoft-com:office:office" xmlns:oel="http://schemas.microsoft.com/office/2019/extlst" xmlns:r="http://schemas.openxmlformats.org/officeDocument/2006/relationships" xmlns:m="http://schemas.openxmlformats.org/officeDocument/2006/math" xmlns:v="urn:schemas-microsoft-com:vml" xmlns:wp14="http://schemas.microsoft.com/office/word/2010/wordprocessingDrawing" xmlns:wp="http://schemas.openxmlformats.org/drawingml/2006/wordprocessingDrawing" xmlns:w10="urn:schemas-microsoft-com:office:word" xmlns:w="http://schemas.openxmlformats.org/wordprocessingml/2006/main" xmlns:w14="http://schemas.microsoft.com/office/word/2010/wordml" xmlns:w15="http://schemas.microsoft.com/office/word/2012/wordml" xmlns:w16cex="http://schemas.microsoft.com/office/word/2018/wordml/cex" xmlns:w16cid="http://schemas.microsoft.com/office/word/2016/wordml/cid" xmlns:w16="http://schemas.microsoft.com/office/word/2018/wordml" xmlns:w16du="http://schemas.microsoft.com/office/word/2023/wordml/word16du" xmlns:w16sdtdh="http://schemas.microsoft.com/office/word/2020/wordml/sdtdatahash" xmlns:w16sdtfl="http://schemas.microsoft.com/office/word/2024/wordml/sdtformatlock" xmlns:w16se="http://schemas.microsoft.com/office/word/2015/wordml/symex" xmlns:wpg="http://schemas.microsoft.com/office/word/2010/wordprocessingGroup" xmlns:wpi="http://schemas.microsoft.com/office/word/2010/wordprocessingInk" xmlns:wne="http://schemas.microsoft.com/office/word/2006/wordml" xmlns:wps="http://schemas.microsoft.com/office/word/2010/wordprocessingShape" mc:Ignorable="w14 w15 w16se w16cid w16 w16cex w16sdtdh w16sdtfl w16du wp14">
+<w:ftr xmlns:wpc="http://schemas.microsoft.com/office/word/2010/wordprocessingCanvas" xmlns:cx="http://schemas.microsoft.com/office/drawing/2014/chartex" xmlns:cx1="http://schemas.microsoft.com/office/drawing/2015/9/8/chartex" xmlns:cx2="http://schemas.microsoft.com/office/drawing/2015/10/21/chartex" xmlns:cx3="http://schemas.microsoft.com/office/drawing/2016/5/9/chartex" xmlns:cx4="http://schemas.microsoft.com/office/drawing/2016/5/10/chartex" xmlns:cx5="http://schemas.microsoft.com/office/drawing/2016/5/11/chartex" xmlns:cx6="http://schemas.microsoft.com/office/drawing/2016/5/12/chartex" xmlns:cx7="http://schemas.microsoft.com/office/drawing/2016/5/13/chartex" xmlns:cx8="http://schemas.microsoft.com/office/drawing/2016/5/14/chartex" xmlns:mc="http://schemas.openxmlformats.org/markup-compatibility/2006" xmlns:aink="http://schemas.microsoft.com/office/drawing/2016/ink" xmlns:am3d="http://schemas.microsoft.com/office/drawing/2017/model3d" xmlns:o="urn:schemas-microsoft-com:office:office" xmlns:oel="http://schemas.microsoft.com/office/2019/extlst" xmlns:r="http://schemas.openxmlformats.org/officeDocument/2006/relationships" xmlns:m="http://schemas.openxmlformats.org/officeDocument/2006/math" xmlns:v="urn:schemas-microsoft-com:vml" xmlns:wp14="http://schemas.microsoft.com/office/word/2010/wordprocessingDrawing" xmlns:wp="http://schemas.openxmlformats.org/drawingml/2006/wordprocessingDrawing" xmlns:w10="urn:schemas-microsoft-com:office:word" xmlns:w="http://schemas.openxmlformats.org/wordprocessingml/2006/main" xmlns:w14="http://schemas.microsoft.com/office/word/2010/wordml" xmlns:w15="http://schemas.microsoft.com/office/word/2012/wordml" xmlns:w16cei="http://schemas.microsoft.com/office/word/2026/wordml/cei" xmlns:w16cex="http://schemas.microsoft.com/office/word/2018/wordml/cex" xmlns:w16cid="http://schemas.microsoft.com/office/word/2016/wordml/cid" xmlns:w16="http://schemas.microsoft.com/office/word/2018/wordml" xmlns:w16du="http://schemas.microsoft.com/office/word/2023/wordml/word16du" xmlns:w16sdtdh="http://schemas.microsoft.com/office/word/2020/wordml/sdtdatahash" xmlns:w16sdtfl="http://schemas.microsoft.com/office/word/2024/wordml/sdtformatlock" xmlns:w16se="http://schemas.microsoft.com/office/word/2015/wordml/symex" xmlns:wpg="http://schemas.microsoft.com/office/word/2010/wordprocessingGroup" xmlns:wpi="http://schemas.microsoft.com/office/word/2010/wordprocessingInk" xmlns:wne="http://schemas.microsoft.com/office/word/2006/wordml" xmlns:wps="http://schemas.microsoft.com/office/word/2010/wordprocessingShape" mc:Ignorable="w14 w15 w16se w16cid w16 w16cex w16sdtdh w16sdtfl w16du wp14">
   <w:p>
     <w:pPr>
       <w:tabs>
@@ -2536,7 +2100,7 @@
 </file>
 
 <file path=word/footer2.xml><?xml version="1.0" encoding="utf-8"?>
-<w:ftr xmlns:wpc="http://schemas.microsoft.com/office/word/2010/wordprocessingCanvas" xmlns:cx="http://schemas.microsoft.com/office/drawing/2014/chartex" xmlns:cx1="http://schemas.microsoft.com/office/drawing/2015/9/8/chartex" xmlns:cx2="http://schemas.microsoft.com/office/drawing/2015/10/21/chartex" xmlns:cx3="http://schemas.microsoft.com/office/drawing/2016/5/9/chartex" xmlns:cx4="http://schemas.microsoft.com/office/drawing/2016/5/10/chartex" xmlns:cx5="http://schemas.microsoft.com/office/drawing/2016/5/11/chartex" xmlns:cx6="http://schemas.microsoft.com/office/drawing/2016/5/12/chartex" xmlns:cx7="http://schemas.microsoft.com/office/drawing/2016/5/13/chartex" xmlns:cx8="http://schemas.microsoft.com/office/drawing/2016/5/14/chartex" xmlns:mc="http://schemas.openxmlformats.org/markup-compatibility/2006" xmlns:aink="http://schemas.microsoft.com/office/drawing/2016/ink" xmlns:am3d="http://schemas.microsoft.com/office/drawing/2017/model3d" xmlns:o="urn:schemas-microsoft-com:office:office" xmlns:oel="http://schemas.microsoft.com/office/2019/extlst" xmlns:r="http://schemas.openxmlformats.org/officeDocument/2006/relationships" xmlns:m="http://schemas.openxmlformats.org/officeDocument/2006/math" xmlns:v="urn:schemas-microsoft-com:vml" xmlns:wp14="http://schemas.microsoft.com/office/word/2010/wordprocessingDrawing" xmlns:wp="http://schemas.openxmlformats.org/drawingml/2006/wordprocessingDrawing" xmlns:w10="urn:schemas-microsoft-com:office:word" xmlns:w="http://schemas.openxmlformats.org/wordprocessingml/2006/main" xmlns:w14="http://schemas.microsoft.com/office/word/2010/wordml" xmlns:w15="http://schemas.microsoft.com/office/word/2012/wordml" xmlns:w16cex="http://schemas.microsoft.com/office/word/2018/wordml/cex" xmlns:w16cid="http://schemas.microsoft.com/office/word/2016/wordml/cid" xmlns:w16="http://schemas.microsoft.com/office/word/2018/wordml" xmlns:w16du="http://schemas.microsoft.com/office/word/2023/wordml/word16du" xmlns:w16sdtdh="http://schemas.microsoft.com/office/word/2020/wordml/sdtdatahash" xmlns:w16sdtfl="http://schemas.microsoft.com/office/word/2024/wordml/sdtformatlock" xmlns:w16se="http://schemas.microsoft.com/office/word/2015/wordml/symex" xmlns:wpg="http://schemas.microsoft.com/office/word/2010/wordprocessingGroup" xmlns:wpi="http://schemas.microsoft.com/office/word/2010/wordprocessingInk" xmlns:wne="http://schemas.microsoft.com/office/word/2006/wordml" xmlns:wps="http://schemas.microsoft.com/office/word/2010/wordprocessingShape" mc:Ignorable="w14 w15 w16se w16cid w16 w16cex w16sdtdh w16sdtfl w16du wp14">
+<w:ftr xmlns:wpc="http://schemas.microsoft.com/office/word/2010/wordprocessingCanvas" xmlns:cx="http://schemas.microsoft.com/office/drawing/2014/chartex" xmlns:cx1="http://schemas.microsoft.com/office/drawing/2015/9/8/chartex" xmlns:cx2="http://schemas.microsoft.com/office/drawing/2015/10/21/chartex" xmlns:cx3="http://schemas.microsoft.com/office/drawing/2016/5/9/chartex" xmlns:cx4="http://schemas.microsoft.com/office/drawing/2016/5/10/chartex" xmlns:cx5="http://schemas.microsoft.com/office/drawing/2016/5/11/chartex" xmlns:cx6="http://schemas.microsoft.com/office/drawing/2016/5/12/chartex" xmlns:cx7="http://schemas.microsoft.com/office/drawing/2016/5/13/chartex" xmlns:cx8="http://schemas.microsoft.com/office/drawing/2016/5/14/chartex" xmlns:mc="http://schemas.openxmlformats.org/markup-compatibility/2006" xmlns:aink="http://schemas.microsoft.com/office/drawing/2016/ink" xmlns:am3d="http://schemas.microsoft.com/office/drawing/2017/model3d" xmlns:o="urn:schemas-microsoft-com:office:office" xmlns:oel="http://schemas.microsoft.com/office/2019/extlst" xmlns:r="http://schemas.openxmlformats.org/officeDocument/2006/relationships" xmlns:m="http://schemas.openxmlformats.org/officeDocument/2006/math" xmlns:v="urn:schemas-microsoft-com:vml" xmlns:wp14="http://schemas.microsoft.com/office/word/2010/wordprocessingDrawing" xmlns:wp="http://schemas.openxmlformats.org/drawingml/2006/wordprocessingDrawing" xmlns:w10="urn:schemas-microsoft-com:office:word" xmlns:w="http://schemas.openxmlformats.org/wordprocessingml/2006/main" xmlns:w14="http://schemas.microsoft.com/office/word/2010/wordml" xmlns:w15="http://schemas.microsoft.com/office/word/2012/wordml" xmlns:w16cei="http://schemas.microsoft.com/office/word/2026/wordml/cei" xmlns:w16cex="http://schemas.microsoft.com/office/word/2018/wordml/cex" xmlns:w16cid="http://schemas.microsoft.com/office/word/2016/wordml/cid" xmlns:w16="http://schemas.microsoft.com/office/word/2018/wordml" xmlns:w16du="http://schemas.microsoft.com/office/word/2023/wordml/word16du" xmlns:w16sdtdh="http://schemas.microsoft.com/office/word/2020/wordml/sdtdatahash" xmlns:w16sdtfl="http://schemas.microsoft.com/office/word/2024/wordml/sdtformatlock" xmlns:w16se="http://schemas.microsoft.com/office/word/2015/wordml/symex" xmlns:wpg="http://schemas.microsoft.com/office/word/2010/wordprocessingGroup" xmlns:wpi="http://schemas.microsoft.com/office/word/2010/wordprocessingInk" xmlns:wne="http://schemas.microsoft.com/office/word/2006/wordml" xmlns:wps="http://schemas.microsoft.com/office/word/2010/wordprocessingShape" mc:Ignorable="w14 w15 w16se w16cid w16 w16cex w16sdtdh w16sdtfl w16du wp14">
   <w:p>
     <w:pPr>
       <w:tabs>
@@ -2555,7 +2119,7 @@
 </file>
 
 <file path=word/footer3.xml><?xml version="1.0" encoding="utf-8"?>
-<w:ftr xmlns:wpc="http://schemas.microsoft.com/office/word/2010/wordprocessingCanvas" xmlns:cx="http://schemas.microsoft.com/office/drawing/2014/chartex" xmlns:cx1="http://schemas.microsoft.com/office/drawing/2015/9/8/chartex" xmlns:cx2="http://schemas.microsoft.com/office/drawing/2015/10/21/chartex" xmlns:cx3="http://schemas.microsoft.com/office/drawing/2016/5/9/chartex" xmlns:cx4="http://schemas.microsoft.com/office/drawing/2016/5/10/chartex" xmlns:cx5="http://schemas.microsoft.com/office/drawing/2016/5/11/chartex" xmlns:cx6="http://schemas.microsoft.com/office/drawing/2016/5/12/chartex" xmlns:cx7="http://schemas.microsoft.com/office/drawing/2016/5/13/chartex" xmlns:cx8="http://schemas.microsoft.com/office/drawing/2016/5/14/chartex" xmlns:mc="http://schemas.openxmlformats.org/markup-compatibility/2006" xmlns:aink="http://schemas.microsoft.com/office/drawing/2016/ink" xmlns:am3d="http://schemas.microsoft.com/office/drawing/2017/model3d" xmlns:o="urn:schemas-microsoft-com:office:office" xmlns:oel="http://schemas.microsoft.com/office/2019/extlst" xmlns:r="http://schemas.openxmlformats.org/officeDocument/2006/relationships" xmlns:m="http://schemas.openxmlformats.org/officeDocument/2006/math" xmlns:v="urn:schemas-microsoft-com:vml" xmlns:wp14="http://schemas.microsoft.com/office/word/2010/wordprocessingDrawing" xmlns:wp="http://schemas.openxmlformats.org/drawingml/2006/wordprocessingDrawing" xmlns:w10="urn:schemas-microsoft-com:office:word" xmlns:w="http://schemas.openxmlformats.org/wordprocessingml/2006/main" xmlns:w14="http://schemas.microsoft.com/office/word/2010/wordml" xmlns:w15="http://schemas.microsoft.com/office/word/2012/wordml" xmlns:w16cex="http://schemas.microsoft.com/office/word/2018/wordml/cex" xmlns:w16cid="http://schemas.microsoft.com/office/word/2016/wordml/cid" xmlns:w16="http://schemas.microsoft.com/office/word/2018/wordml" xmlns:w16du="http://schemas.microsoft.com/office/word/2023/wordml/word16du" xmlns:w16sdtdh="http://schemas.microsoft.com/office/word/2020/wordml/sdtdatahash" xmlns:w16sdtfl="http://schemas.microsoft.com/office/word/2024/wordml/sdtformatlock" xmlns:w16se="http://schemas.microsoft.com/office/word/2015/wordml/symex" xmlns:wpg="http://schemas.microsoft.com/office/word/2010/wordprocessingGroup" xmlns:wpi="http://schemas.microsoft.com/office/word/2010/wordprocessingInk" xmlns:wne="http://schemas.microsoft.com/office/word/2006/wordml" xmlns:wps="http://schemas.microsoft.com/office/word/2010/wordprocessingShape" mc:Ignorable="w14 w15 w16se w16cid w16 w16cex w16sdtdh w16sdtfl w16du wp14">
+<w:ftr xmlns:wpc="http://schemas.microsoft.com/office/word/2010/wordprocessingCanvas" xmlns:cx="http://schemas.microsoft.com/office/drawing/2014/chartex" xmlns:cx1="http://schemas.microsoft.com/office/drawing/2015/9/8/chartex" xmlns:cx2="http://schemas.microsoft.com/office/drawing/2015/10/21/chartex" xmlns:cx3="http://schemas.microsoft.com/office/drawing/2016/5/9/chartex" xmlns:cx4="http://schemas.microsoft.com/office/drawing/2016/5/10/chartex" xmlns:cx5="http://schemas.microsoft.com/office/drawing/2016/5/11/chartex" xmlns:cx6="http://schemas.microsoft.com/office/drawing/2016/5/12/chartex" xmlns:cx7="http://schemas.microsoft.com/office/drawing/2016/5/13/chartex" xmlns:cx8="http://schemas.microsoft.com/office/drawing/2016/5/14/chartex" xmlns:mc="http://schemas.openxmlformats.org/markup-compatibility/2006" xmlns:aink="http://schemas.microsoft.com/office/drawing/2016/ink" xmlns:am3d="http://schemas.microsoft.com/office/drawing/2017/model3d" xmlns:o="urn:schemas-microsoft-com:office:office" xmlns:oel="http://schemas.microsoft.com/office/2019/extlst" xmlns:r="http://schemas.openxmlformats.org/officeDocument/2006/relationships" xmlns:m="http://schemas.openxmlformats.org/officeDocument/2006/math" xmlns:v="urn:schemas-microsoft-com:vml" xmlns:wp14="http://schemas.microsoft.com/office/word/2010/wordprocessingDrawing" xmlns:wp="http://schemas.openxmlformats.org/drawingml/2006/wordprocessingDrawing" xmlns:w10="urn:schemas-microsoft-com:office:word" xmlns:w="http://schemas.openxmlformats.org/wordprocessingml/2006/main" xmlns:w14="http://schemas.microsoft.com/office/word/2010/wordml" xmlns:w15="http://schemas.microsoft.com/office/word/2012/wordml" xmlns:w16cei="http://schemas.microsoft.com/office/word/2026/wordml/cei" xmlns:w16cex="http://schemas.microsoft.com/office/word/2018/wordml/cex" xmlns:w16cid="http://schemas.microsoft.com/office/word/2016/wordml/cid" xmlns:w16="http://schemas.microsoft.com/office/word/2018/wordml" xmlns:w16du="http://schemas.microsoft.com/office/word/2023/wordml/word16du" xmlns:w16sdtdh="http://schemas.microsoft.com/office/word/2020/wordml/sdtdatahash" xmlns:w16sdtfl="http://schemas.microsoft.com/office/word/2024/wordml/sdtformatlock" xmlns:w16se="http://schemas.microsoft.com/office/word/2015/wordml/symex" xmlns:wpg="http://schemas.microsoft.com/office/word/2010/wordprocessingGroup" xmlns:wpi="http://schemas.microsoft.com/office/word/2010/wordprocessingInk" xmlns:wne="http://schemas.microsoft.com/office/word/2006/wordml" xmlns:wps="http://schemas.microsoft.com/office/word/2010/wordprocessingShape" mc:Ignorable="w14 w15 w16se w16cid w16 w16cex w16sdtdh w16sdtfl w16du wp14">
   <w:p>
     <w:pPr>
       <w:pStyle w:val="Footer"/>
@@ -2565,7 +2129,7 @@
 </file>
 
 <file path=word/footnotes.xml><?xml version="1.0" encoding="utf-8"?>
-<w:footnotes xmlns:wpc="http://schemas.microsoft.com/office/word/2010/wordprocessingCanvas" xmlns:cx="http://schemas.microsoft.com/office/drawing/2014/chartex" xmlns:cx1="http://schemas.microsoft.com/office/drawing/2015/9/8/chartex" xmlns:cx2="http://schemas.microsoft.com/office/drawing/2015/10/21/chartex" xmlns:cx3="http://schemas.microsoft.com/office/drawing/2016/5/9/chartex" xmlns:cx4="http://schemas.microsoft.com/office/drawing/2016/5/10/chartex" xmlns:cx5="http://schemas.microsoft.com/office/drawing/2016/5/11/chartex" xmlns:cx6="http://schemas.microsoft.com/office/drawing/2016/5/12/chartex" xmlns:cx7="http://schemas.microsoft.com/office/drawing/2016/5/13/chartex" xmlns:cx8="http://schemas.microsoft.com/office/drawing/2016/5/14/chartex" xmlns:mc="http://schemas.openxmlformats.org/markup-compatibility/2006" xmlns:aink="http://schemas.microsoft.com/office/drawing/2016/ink" xmlns:am3d="http://schemas.microsoft.com/office/drawing/2017/model3d" xmlns:o="urn:schemas-microsoft-com:office:office" xmlns:oel="http://schemas.microsoft.com/office/2019/extlst" xmlns:r="http://schemas.openxmlformats.org/officeDocument/2006/relationships" xmlns:m="http://schemas.openxmlformats.org/officeDocument/2006/math" xmlns:v="urn:schemas-microsoft-com:vml" xmlns:wp14="http://schemas.microsoft.com/office/word/2010/wordprocessingDrawing" xmlns:wp="http://schemas.openxmlformats.org/drawingml/2006/wordprocessingDrawing" xmlns:w10="urn:schemas-microsoft-com:office:word" xmlns:w="http://schemas.openxmlformats.org/wordprocessingml/2006/main" xmlns:w14="http://schemas.microsoft.com/office/word/2010/wordml" xmlns:w15="http://schemas.microsoft.com/office/word/2012/wordml" xmlns:w16cex="http://schemas.microsoft.com/office/word/2018/wordml/cex" xmlns:w16cid="http://schemas.microsoft.com/office/word/2016/wordml/cid" xmlns:w16="http://schemas.microsoft.com/office/word/2018/wordml" xmlns:w16du="http://schemas.microsoft.com/office/word/2023/wordml/word16du" xmlns:w16sdtdh="http://schemas.microsoft.com/office/word/2020/wordml/sdtdatahash" xmlns:w16sdtfl="http://schemas.microsoft.com/office/word/2024/wordml/sdtformatlock" xmlns:w16se="http://schemas.microsoft.com/office/word/2015/wordml/symex" xmlns:wpg="http://schemas.microsoft.com/office/word/2010/wordprocessingGroup" xmlns:wpi="http://schemas.microsoft.com/office/word/2010/wordprocessingInk" xmlns:wne="http://schemas.microsoft.com/office/word/2006/wordml" xmlns:wps="http://schemas.microsoft.com/office/word/2010/wordprocessingShape" mc:Ignorable="w14 w15 w16se w16cid w16 w16cex w16sdtdh w16sdtfl w16du wp14">
+<w:footnotes xmlns:wpc="http://schemas.microsoft.com/office/word/2010/wordprocessingCanvas" xmlns:cx="http://schemas.microsoft.com/office/drawing/2014/chartex" xmlns:cx1="http://schemas.microsoft.com/office/drawing/2015/9/8/chartex" xmlns:cx2="http://schemas.microsoft.com/office/drawing/2015/10/21/chartex" xmlns:cx3="http://schemas.microsoft.com/office/drawing/2016/5/9/chartex" xmlns:cx4="http://schemas.microsoft.com/office/drawing/2016/5/10/chartex" xmlns:cx5="http://schemas.microsoft.com/office/drawing/2016/5/11/chartex" xmlns:cx6="http://schemas.microsoft.com/office/drawing/2016/5/12/chartex" xmlns:cx7="http://schemas.microsoft.com/office/drawing/2016/5/13/chartex" xmlns:cx8="http://schemas.microsoft.com/office/drawing/2016/5/14/chartex" xmlns:mc="http://schemas.openxmlformats.org/markup-compatibility/2006" xmlns:aink="http://schemas.microsoft.com/office/drawing/2016/ink" xmlns:am3d="http://schemas.microsoft.com/office/drawing/2017/model3d" xmlns:o="urn:schemas-microsoft-com:office:office" xmlns:oel="http://schemas.microsoft.com/office/2019/extlst" xmlns:r="http://schemas.openxmlformats.org/officeDocument/2006/relationships" xmlns:m="http://schemas.openxmlformats.org/officeDocument/2006/math" xmlns:v="urn:schemas-microsoft-com:vml" xmlns:wp14="http://schemas.microsoft.com/office/word/2010/wordprocessingDrawing" xmlns:wp="http://schemas.openxmlformats.org/drawingml/2006/wordprocessingDrawing" xmlns:w10="urn:schemas-microsoft-com:office:word" xmlns:w="http://schemas.openxmlformats.org/wordprocessingml/2006/main" xmlns:w14="http://schemas.microsoft.com/office/word/2010/wordml" xmlns:w15="http://schemas.microsoft.com/office/word/2012/wordml" xmlns:w16cei="http://schemas.microsoft.com/office/word/2026/wordml/cei" xmlns:w16cex="http://schemas.microsoft.com/office/word/2018/wordml/cex" xmlns:w16cid="http://schemas.microsoft.com/office/word/2016/wordml/cid" xmlns:w16="http://schemas.microsoft.com/office/word/2018/wordml" xmlns:w16du="http://schemas.microsoft.com/office/word/2023/wordml/word16du" xmlns:w16sdtdh="http://schemas.microsoft.com/office/word/2020/wordml/sdtdatahash" xmlns:w16sdtfl="http://schemas.microsoft.com/office/word/2024/wordml/sdtformatlock" xmlns:w16se="http://schemas.microsoft.com/office/word/2015/wordml/symex" xmlns:wpg="http://schemas.microsoft.com/office/word/2010/wordprocessingGroup" xmlns:wpi="http://schemas.microsoft.com/office/word/2010/wordprocessingInk" xmlns:wne="http://schemas.microsoft.com/office/word/2006/wordml" xmlns:wps="http://schemas.microsoft.com/office/word/2010/wordprocessingShape" mc:Ignorable="w14 w15 w16se w16cid w16 w16cex w16sdtdh w16sdtfl w16du wp14">
   <w:footnote w:type="separator" w:id="-1">
     <w:p>
       <w:pPr>
@@ -2590,7 +2154,7 @@
 </file>
 
 <file path=word/header1.xml><?xml version="1.0" encoding="utf-8"?>
-<w:hdr xmlns:wpc="http://schemas.microsoft.com/office/word/2010/wordprocessingCanvas" xmlns:cx="http://schemas.microsoft.com/office/drawing/2014/chartex" xmlns:cx1="http://schemas.microsoft.com/office/drawing/2015/9/8/chartex" xmlns:cx2="http://schemas.microsoft.com/office/drawing/2015/10/21/chartex" xmlns:cx3="http://schemas.microsoft.com/office/drawing/2016/5/9/chartex" xmlns:cx4="http://schemas.microsoft.com/office/drawing/2016/5/10/chartex" xmlns:cx5="http://schemas.microsoft.com/office/drawing/2016/5/11/chartex" xmlns:cx6="http://schemas.microsoft.com/office/drawing/2016/5/12/chartex" xmlns:cx7="http://schemas.microsoft.com/office/drawing/2016/5/13/chartex" xmlns:cx8="http://schemas.microsoft.com/office/drawing/2016/5/14/chartex" xmlns:mc="http://schemas.openxmlformats.org/markup-compatibility/2006" xmlns:aink="http://schemas.microsoft.com/office/drawing/2016/ink" xmlns:am3d="http://schemas.microsoft.com/office/drawing/2017/model3d" xmlns:o="urn:schemas-microsoft-com:office:office" xmlns:oel="http://schemas.microsoft.com/office/2019/extlst" xmlns:r="http://schemas.openxmlformats.org/officeDocument/2006/relationships" xmlns:m="http://schemas.openxmlformats.org/officeDocument/2006/math" xmlns:v="urn:schemas-microsoft-com:vml" xmlns:wp14="http://schemas.microsoft.com/office/word/2010/wordprocessingDrawing" xmlns:wp="http://schemas.openxmlformats.org/drawingml/2006/wordprocessingDrawing" xmlns:w10="urn:schemas-microsoft-com:office:word" xmlns:w="http://schemas.openxmlformats.org/wordprocessingml/2006/main" xmlns:w14="http://schemas.microsoft.com/office/word/2010/wordml" xmlns:w15="http://schemas.microsoft.com/office/word/2012/wordml" xmlns:w16cex="http://schemas.microsoft.com/office/word/2018/wordml/cex" xmlns:w16cid="http://schemas.microsoft.com/office/word/2016/wordml/cid" xmlns:w16="http://schemas.microsoft.com/office/word/2018/wordml" xmlns:w16du="http://schemas.microsoft.com/office/word/2023/wordml/word16du" xmlns:w16sdtdh="http://schemas.microsoft.com/office/word/2020/wordml/sdtdatahash" xmlns:w16sdtfl="http://schemas.microsoft.com/office/word/2024/wordml/sdtformatlock" xmlns:w16se="http://schemas.microsoft.com/office/word/2015/wordml/symex" xmlns:wpg="http://schemas.microsoft.com/office/word/2010/wordprocessingGroup" xmlns:wpi="http://schemas.microsoft.com/office/word/2010/wordprocessingInk" xmlns:wne="http://schemas.microsoft.com/office/word/2006/wordml" xmlns:wps="http://schemas.microsoft.com/office/word/2010/wordprocessingShape" mc:Ignorable="w14 w15 w16se w16cid w16 w16cex w16sdtdh w16sdtfl w16du wp14">
+<w:hdr xmlns:wpc="http://schemas.microsoft.com/office/word/2010/wordprocessingCanvas" xmlns:cx="http://schemas.microsoft.com/office/drawing/2014/chartex" xmlns:cx1="http://schemas.microsoft.com/office/drawing/2015/9/8/chartex" xmlns:cx2="http://schemas.microsoft.com/office/drawing/2015/10/21/chartex" xmlns:cx3="http://schemas.microsoft.com/office/drawing/2016/5/9/chartex" xmlns:cx4="http://schemas.microsoft.com/office/drawing/2016/5/10/chartex" xmlns:cx5="http://schemas.microsoft.com/office/drawing/2016/5/11/chartex" xmlns:cx6="http://schemas.microsoft.com/office/drawing/2016/5/12/chartex" xmlns:cx7="http://schemas.microsoft.com/office/drawing/2016/5/13/chartex" xmlns:cx8="http://schemas.microsoft.com/office/drawing/2016/5/14/chartex" xmlns:mc="http://schemas.openxmlformats.org/markup-compatibility/2006" xmlns:aink="http://schemas.microsoft.com/office/drawing/2016/ink" xmlns:am3d="http://schemas.microsoft.com/office/drawing/2017/model3d" xmlns:o="urn:schemas-microsoft-com:office:office" xmlns:oel="http://schemas.microsoft.com/office/2019/extlst" xmlns:r="http://schemas.openxmlformats.org/officeDocument/2006/relationships" xmlns:m="http://schemas.openxmlformats.org/officeDocument/2006/math" xmlns:v="urn:schemas-microsoft-com:vml" xmlns:wp14="http://schemas.microsoft.com/office/word/2010/wordprocessingDrawing" xmlns:wp="http://schemas.openxmlformats.org/drawingml/2006/wordprocessingDrawing" xmlns:w10="urn:schemas-microsoft-com:office:word" xmlns:w="http://schemas.openxmlformats.org/wordprocessingml/2006/main" xmlns:w14="http://schemas.microsoft.com/office/word/2010/wordml" xmlns:w15="http://schemas.microsoft.com/office/word/2012/wordml" xmlns:w16cei="http://schemas.microsoft.com/office/word/2026/wordml/cei" xmlns:w16cex="http://schemas.microsoft.com/office/word/2018/wordml/cex" xmlns:w16cid="http://schemas.microsoft.com/office/word/2016/wordml/cid" xmlns:w16="http://schemas.microsoft.com/office/word/2018/wordml" xmlns:w16du="http://schemas.microsoft.com/office/word/2023/wordml/word16du" xmlns:w16sdtdh="http://schemas.microsoft.com/office/word/2020/wordml/sdtdatahash" xmlns:w16sdtfl="http://schemas.microsoft.com/office/word/2024/wordml/sdtformatlock" xmlns:w16se="http://schemas.microsoft.com/office/word/2015/wordml/symex" xmlns:wpg="http://schemas.microsoft.com/office/word/2010/wordprocessingGroup" xmlns:wpi="http://schemas.microsoft.com/office/word/2010/wordprocessingInk" xmlns:wne="http://schemas.microsoft.com/office/word/2006/wordml" xmlns:wps="http://schemas.microsoft.com/office/word/2010/wordprocessingShape" mc:Ignorable="w14 w15 w16se w16cid w16 w16cex w16sdtdh w16sdtfl w16du wp14">
   <w:p>
     <w:pPr>
       <w:jc w:val="right"/>
@@ -2639,7 +2203,7 @@
 </file>
 
 <file path=word/header2.xml><?xml version="1.0" encoding="utf-8"?>
-<w:hdr xmlns:wpc="http://schemas.microsoft.com/office/word/2010/wordprocessingCanvas" xmlns:cx="http://schemas.microsoft.com/office/drawing/2014/chartex" xmlns:cx1="http://schemas.microsoft.com/office/drawing/2015/9/8/chartex" xmlns:cx2="http://schemas.microsoft.com/office/drawing/2015/10/21/chartex" xmlns:cx3="http://schemas.microsoft.com/office/drawing/2016/5/9/chartex" xmlns:cx4="http://schemas.microsoft.com/office/drawing/2016/5/10/chartex" xmlns:cx5="http://schemas.microsoft.com/office/drawing/2016/5/11/chartex" xmlns:cx6="http://schemas.microsoft.com/office/drawing/2016/5/12/chartex" xmlns:cx7="http://schemas.microsoft.com/office/drawing/2016/5/13/chartex" xmlns:cx8="http://schemas.microsoft.com/office/drawing/2016/5/14/chartex" xmlns:mc="http://schemas.openxmlformats.org/markup-compatibility/2006" xmlns:aink="http://schemas.microsoft.com/office/drawing/2016/ink" xmlns:am3d="http://schemas.microsoft.com/office/drawing/2017/model3d" xmlns:o="urn:schemas-microsoft-com:office:office" xmlns:oel="http://schemas.microsoft.com/office/2019/extlst" xmlns:r="http://schemas.openxmlformats.org/officeDocument/2006/relationships" xmlns:m="http://schemas.openxmlformats.org/officeDocument/2006/math" xmlns:v="urn:schemas-microsoft-com:vml" xmlns:wp14="http://schemas.microsoft.com/office/word/2010/wordprocessingDrawing" xmlns:wp="http://schemas.openxmlformats.org/drawingml/2006/wordprocessingDrawing" xmlns:w10="urn:schemas-microsoft-com:office:word" xmlns:w="http://schemas.openxmlformats.org/wordprocessingml/2006/main" xmlns:w14="http://schemas.microsoft.com/office/word/2010/wordml" xmlns:w15="http://schemas.microsoft.com/office/word/2012/wordml" xmlns:w16cex="http://schemas.microsoft.com/office/word/2018/wordml/cex" xmlns:w16cid="http://schemas.microsoft.com/office/word/2016/wordml/cid" xmlns:w16="http://schemas.microsoft.com/office/word/2018/wordml" xmlns:w16du="http://schemas.microsoft.com/office/word/2023/wordml/word16du" xmlns:w16sdtdh="http://schemas.microsoft.com/office/word/2020/wordml/sdtdatahash" xmlns:w16sdtfl="http://schemas.microsoft.com/office/word/2024/wordml/sdtformatlock" xmlns:w16se="http://schemas.microsoft.com/office/word/2015/wordml/symex" xmlns:wpg="http://schemas.microsoft.com/office/word/2010/wordprocessingGroup" xmlns:wpi="http://schemas.microsoft.com/office/word/2010/wordprocessingInk" xmlns:wne="http://schemas.microsoft.com/office/word/2006/wordml" xmlns:wps="http://schemas.microsoft.com/office/word/2010/wordprocessingShape" mc:Ignorable="w14 w15 w16se w16cid w16 w16cex w16sdtdh w16sdtfl w16du wp14">
+<w:hdr xmlns:wpc="http://schemas.microsoft.com/office/word/2010/wordprocessingCanvas" xmlns:cx="http://schemas.microsoft.com/office/drawing/2014/chartex" xmlns:cx1="http://schemas.microsoft.com/office/drawing/2015/9/8/chartex" xmlns:cx2="http://schemas.microsoft.com/office/drawing/2015/10/21/chartex" xmlns:cx3="http://schemas.microsoft.com/office/drawing/2016/5/9/chartex" xmlns:cx4="http://schemas.microsoft.com/office/drawing/2016/5/10/chartex" xmlns:cx5="http://schemas.microsoft.com/office/drawing/2016/5/11/chartex" xmlns:cx6="http://schemas.microsoft.com/office/drawing/2016/5/12/chartex" xmlns:cx7="http://schemas.microsoft.com/office/drawing/2016/5/13/chartex" xmlns:cx8="http://schemas.microsoft.com/office/drawing/2016/5/14/chartex" xmlns:mc="http://schemas.openxmlformats.org/markup-compatibility/2006" xmlns:aink="http://schemas.microsoft.com/office/drawing/2016/ink" xmlns:am3d="http://schemas.microsoft.com/office/drawing/2017/model3d" xmlns:o="urn:schemas-microsoft-com:office:office" xmlns:oel="http://schemas.microsoft.com/office/2019/extlst" xmlns:r="http://schemas.openxmlformats.org/officeDocument/2006/relationships" xmlns:m="http://schemas.openxmlformats.org/officeDocument/2006/math" xmlns:v="urn:schemas-microsoft-com:vml" xmlns:wp14="http://schemas.microsoft.com/office/word/2010/wordprocessingDrawing" xmlns:wp="http://schemas.openxmlformats.org/drawingml/2006/wordprocessingDrawing" xmlns:w10="urn:schemas-microsoft-com:office:word" xmlns:w="http://schemas.openxmlformats.org/wordprocessingml/2006/main" xmlns:w14="http://schemas.microsoft.com/office/word/2010/wordml" xmlns:w15="http://schemas.microsoft.com/office/word/2012/wordml" xmlns:w16cei="http://schemas.microsoft.com/office/word/2026/wordml/cei" xmlns:w16cex="http://schemas.microsoft.com/office/word/2018/wordml/cex" xmlns:w16cid="http://schemas.microsoft.com/office/word/2016/wordml/cid" xmlns:w16="http://schemas.microsoft.com/office/word/2018/wordml" xmlns:w16du="http://schemas.microsoft.com/office/word/2023/wordml/word16du" xmlns:w16sdtdh="http://schemas.microsoft.com/office/word/2020/wordml/sdtdatahash" xmlns:w16sdtfl="http://schemas.microsoft.com/office/word/2024/wordml/sdtformatlock" xmlns:w16se="http://schemas.microsoft.com/office/word/2015/wordml/symex" xmlns:wpg="http://schemas.microsoft.com/office/word/2010/wordprocessingGroup" xmlns:wpi="http://schemas.microsoft.com/office/word/2010/wordprocessingInk" xmlns:wne="http://schemas.microsoft.com/office/word/2006/wordml" xmlns:wps="http://schemas.microsoft.com/office/word/2010/wordprocessingShape" mc:Ignorable="w14 w15 w16se w16cid w16 w16cex w16sdtdh w16sdtfl w16du wp14">
   <w:p>
     <w:pPr>
       <w:jc w:val="right"/>
@@ -2688,7 +2252,7 @@
 </file>
 
 <file path=word/header3.xml><?xml version="1.0" encoding="utf-8"?>
-<w:hdr xmlns:wpc="http://schemas.microsoft.com/office/word/2010/wordprocessingCanvas" xmlns:cx="http://schemas.microsoft.com/office/drawing/2014/chartex" xmlns:cx1="http://schemas.microsoft.com/office/drawing/2015/9/8/chartex" xmlns:cx2="http://schemas.microsoft.com/office/drawing/2015/10/21/chartex" xmlns:cx3="http://schemas.microsoft.com/office/drawing/2016/5/9/chartex" xmlns:cx4="http://schemas.microsoft.com/office/drawing/2016/5/10/chartex" xmlns:cx5="http://schemas.microsoft.com/office/drawing/2016/5/11/chartex" xmlns:cx6="http://schemas.microsoft.com/office/drawing/2016/5/12/chartex" xmlns:cx7="http://schemas.microsoft.com/office/drawing/2016/5/13/chartex" xmlns:cx8="http://schemas.microsoft.com/office/drawing/2016/5/14/chartex" xmlns:mc="http://schemas.openxmlformats.org/markup-compatibility/2006" xmlns:aink="http://schemas.microsoft.com/office/drawing/2016/ink" xmlns:am3d="http://schemas.microsoft.com/office/drawing/2017/model3d" xmlns:o="urn:schemas-microsoft-com:office:office" xmlns:oel="http://schemas.microsoft.com/office/2019/extlst" xmlns:r="http://schemas.openxmlformats.org/officeDocument/2006/relationships" xmlns:m="http://schemas.openxmlformats.org/officeDocument/2006/math" xmlns:v="urn:schemas-microsoft-com:vml" xmlns:wp14="http://schemas.microsoft.com/office/word/2010/wordprocessingDrawing" xmlns:wp="http://schemas.openxmlformats.org/drawingml/2006/wordprocessingDrawing" xmlns:w10="urn:schemas-microsoft-com:office:word" xmlns:w="http://schemas.openxmlformats.org/wordprocessingml/2006/main" xmlns:w14="http://schemas.microsoft.com/office/word/2010/wordml" xmlns:w15="http://schemas.microsoft.com/office/word/2012/wordml" xmlns:w16cex="http://schemas.microsoft.com/office/word/2018/wordml/cex" xmlns:w16cid="http://schemas.microsoft.com/office/word/2016/wordml/cid" xmlns:w16="http://schemas.microsoft.com/office/word/2018/wordml" xmlns:w16du="http://schemas.microsoft.com/office/word/2023/wordml/word16du" xmlns:w16sdtdh="http://schemas.microsoft.com/office/word/2020/wordml/sdtdatahash" xmlns:w16sdtfl="http://schemas.microsoft.com/office/word/2024/wordml/sdtformatlock" xmlns:w16se="http://schemas.microsoft.com/office/word/2015/wordml/symex" xmlns:wpg="http://schemas.microsoft.com/office/word/2010/wordprocessingGroup" xmlns:wpi="http://schemas.microsoft.com/office/word/2010/wordprocessingInk" xmlns:wne="http://schemas.microsoft.com/office/word/2006/wordml" xmlns:wps="http://schemas.microsoft.com/office/word/2010/wordprocessingShape" mc:Ignorable="w14 w15 w16se w16cid w16 w16cex w16sdtdh w16sdtfl w16du wp14">
+<w:hdr xmlns:wpc="http://schemas.microsoft.com/office/word/2010/wordprocessingCanvas" xmlns:cx="http://schemas.microsoft.com/office/drawing/2014/chartex" xmlns:cx1="http://schemas.microsoft.com/office/drawing/2015/9/8/chartex" xmlns:cx2="http://schemas.microsoft.com/office/drawing/2015/10/21/chartex" xmlns:cx3="http://schemas.microsoft.com/office/drawing/2016/5/9/chartex" xmlns:cx4="http://schemas.microsoft.com/office/drawing/2016/5/10/chartex" xmlns:cx5="http://schemas.microsoft.com/office/drawing/2016/5/11/chartex" xmlns:cx6="http://schemas.microsoft.com/office/drawing/2016/5/12/chartex" xmlns:cx7="http://schemas.microsoft.com/office/drawing/2016/5/13/chartex" xmlns:cx8="http://schemas.microsoft.com/office/drawing/2016/5/14/chartex" xmlns:mc="http://schemas.openxmlformats.org/markup-compatibility/2006" xmlns:aink="http://schemas.microsoft.com/office/drawing/2016/ink" xmlns:am3d="http://schemas.microsoft.com/office/drawing/2017/model3d" xmlns:o="urn:schemas-microsoft-com:office:office" xmlns:oel="http://schemas.microsoft.com/office/2019/extlst" xmlns:r="http://schemas.openxmlformats.org/officeDocument/2006/relationships" xmlns:m="http://schemas.openxmlformats.org/officeDocument/2006/math" xmlns:v="urn:schemas-microsoft-com:vml" xmlns:wp14="http://schemas.microsoft.com/office/word/2010/wordprocessingDrawing" xmlns:wp="http://schemas.openxmlformats.org/drawingml/2006/wordprocessingDrawing" xmlns:w10="urn:schemas-microsoft-com:office:word" xmlns:w="http://schemas.openxmlformats.org/wordprocessingml/2006/main" xmlns:w14="http://schemas.microsoft.com/office/word/2010/wordml" xmlns:w15="http://schemas.microsoft.com/office/word/2012/wordml" xmlns:w16cei="http://schemas.microsoft.com/office/word/2026/wordml/cei" xmlns:w16cex="http://schemas.microsoft.com/office/word/2018/wordml/cex" xmlns:w16cid="http://schemas.microsoft.com/office/word/2016/wordml/cid" xmlns:w16="http://schemas.microsoft.com/office/word/2018/wordml" xmlns:w16du="http://schemas.microsoft.com/office/word/2023/wordml/word16du" xmlns:w16sdtdh="http://schemas.microsoft.com/office/word/2020/wordml/sdtdatahash" xmlns:w16sdtfl="http://schemas.microsoft.com/office/word/2024/wordml/sdtformatlock" xmlns:w16se="http://schemas.microsoft.com/office/word/2015/wordml/symex" xmlns:wpg="http://schemas.microsoft.com/office/word/2010/wordprocessingGroup" xmlns:wpi="http://schemas.microsoft.com/office/word/2010/wordprocessingInk" xmlns:wne="http://schemas.microsoft.com/office/word/2006/wordml" xmlns:wps="http://schemas.microsoft.com/office/word/2010/wordprocessingShape" mc:Ignorable="w14 w15 w16se w16cid w16 w16cex w16sdtdh w16sdtfl w16du wp14">
   <w:p>
     <w:pPr>
       <w:ind w:left="9360" w:firstLine="720"/>
@@ -2742,7 +2306,7 @@
 </file>
 
 <file path=word/numbering.xml><?xml version="1.0" encoding="utf-8"?>
-<w:numbering xmlns:wpc="http://schemas.microsoft.com/office/word/2010/wordprocessingCanvas" xmlns:cx="http://schemas.microsoft.com/office/drawing/2014/chartex" xmlns:cx1="http://schemas.microsoft.com/office/drawing/2015/9/8/chartex" xmlns:cx2="http://schemas.microsoft.com/office/drawing/2015/10/21/chartex" xmlns:cx3="http://schemas.microsoft.com/office/drawing/2016/5/9/chartex" xmlns:cx4="http://schemas.microsoft.com/office/drawing/2016/5/10/chartex" xmlns:cx5="http://schemas.microsoft.com/office/drawing/2016/5/11/chartex" xmlns:cx6="http://schemas.microsoft.com/office/drawing/2016/5/12/chartex" xmlns:cx7="http://schemas.microsoft.com/office/drawing/2016/5/13/chartex" xmlns:cx8="http://schemas.microsoft.com/office/drawing/2016/5/14/chartex" xmlns:mc="http://schemas.openxmlformats.org/markup-compatibility/2006" xmlns:aink="http://schemas.microsoft.com/office/drawing/2016/ink" xmlns:am3d="http://schemas.microsoft.com/office/drawing/2017/model3d" xmlns:o="urn:schemas-microsoft-com:office:office" xmlns:oel="http://schemas.microsoft.com/office/2019/extlst" xmlns:r="http://schemas.openxmlformats.org/officeDocument/2006/relationships" xmlns:m="http://schemas.openxmlformats.org/officeDocument/2006/math" xmlns:v="urn:schemas-microsoft-com:vml" xmlns:wp14="http://schemas.microsoft.com/office/word/2010/wordprocessingDrawing" xmlns:wp="http://schemas.openxmlformats.org/drawingml/2006/wordprocessingDrawing" xmlns:w10="urn:schemas-microsoft-com:office:word" xmlns:w="http://schemas.openxmlformats.org/wordprocessingml/2006/main" xmlns:w14="http://schemas.microsoft.com/office/word/2010/wordml" xmlns:w15="http://schemas.microsoft.com/office/word/2012/wordml" xmlns:w16cex="http://schemas.microsoft.com/office/word/2018/wordml/cex" xmlns:w16cid="http://schemas.microsoft.com/office/word/2016/wordml/cid" xmlns:w16="http://schemas.microsoft.com/office/word/2018/wordml" xmlns:w16du="http://schemas.microsoft.com/office/word/2023/wordml/word16du" xmlns:w16sdtdh="http://schemas.microsoft.com/office/word/2020/wordml/sdtdatahash" xmlns:w16sdtfl="http://schemas.microsoft.com/office/word/2024/wordml/sdtformatlock" xmlns:w16se="http://schemas.microsoft.com/office/word/2015/wordml/symex" xmlns:wpg="http://schemas.microsoft.com/office/word/2010/wordprocessingGroup" xmlns:wpi="http://schemas.microsoft.com/office/word/2010/wordprocessingInk" xmlns:wne="http://schemas.microsoft.com/office/word/2006/wordml" xmlns:wps="http://schemas.microsoft.com/office/word/2010/wordprocessingShape" mc:Ignorable="w14 w15 w16se w16cid w16 w16cex w16sdtdh w16sdtfl w16du wp14">
+<w:numbering xmlns:wpc="http://schemas.microsoft.com/office/word/2010/wordprocessingCanvas" xmlns:cx="http://schemas.microsoft.com/office/drawing/2014/chartex" xmlns:cx1="http://schemas.microsoft.com/office/drawing/2015/9/8/chartex" xmlns:cx2="http://schemas.microsoft.com/office/drawing/2015/10/21/chartex" xmlns:cx3="http://schemas.microsoft.com/office/drawing/2016/5/9/chartex" xmlns:cx4="http://schemas.microsoft.com/office/drawing/2016/5/10/chartex" xmlns:cx5="http://schemas.microsoft.com/office/drawing/2016/5/11/chartex" xmlns:cx6="http://schemas.microsoft.com/office/drawing/2016/5/12/chartex" xmlns:cx7="http://schemas.microsoft.com/office/drawing/2016/5/13/chartex" xmlns:cx8="http://schemas.microsoft.com/office/drawing/2016/5/14/chartex" xmlns:mc="http://schemas.openxmlformats.org/markup-compatibility/2006" xmlns:aink="http://schemas.microsoft.com/office/drawing/2016/ink" xmlns:am3d="http://schemas.microsoft.com/office/drawing/2017/model3d" xmlns:o="urn:schemas-microsoft-com:office:office" xmlns:oel="http://schemas.microsoft.com/office/2019/extlst" xmlns:r="http://schemas.openxmlformats.org/officeDocument/2006/relationships" xmlns:m="http://schemas.openxmlformats.org/officeDocument/2006/math" xmlns:v="urn:schemas-microsoft-com:vml" xmlns:wp14="http://schemas.microsoft.com/office/word/2010/wordprocessingDrawing" xmlns:wp="http://schemas.openxmlformats.org/drawingml/2006/wordprocessingDrawing" xmlns:w10="urn:schemas-microsoft-com:office:word" xmlns:w="http://schemas.openxmlformats.org/wordprocessingml/2006/main" xmlns:w14="http://schemas.microsoft.com/office/word/2010/wordml" xmlns:w15="http://schemas.microsoft.com/office/word/2012/wordml" xmlns:w16cei="http://schemas.microsoft.com/office/word/2026/wordml/cei" xmlns:w16cex="http://schemas.microsoft.com/office/word/2018/wordml/cex" xmlns:w16cid="http://schemas.microsoft.com/office/word/2016/wordml/cid" xmlns:w16="http://schemas.microsoft.com/office/word/2018/wordml" xmlns:w16du="http://schemas.microsoft.com/office/word/2023/wordml/word16du" xmlns:w16sdtdh="http://schemas.microsoft.com/office/word/2020/wordml/sdtdatahash" xmlns:w16sdtfl="http://schemas.microsoft.com/office/word/2024/wordml/sdtformatlock" xmlns:w16se="http://schemas.microsoft.com/office/word/2015/wordml/symex" xmlns:wpg="http://schemas.microsoft.com/office/word/2010/wordprocessingGroup" xmlns:wpi="http://schemas.microsoft.com/office/word/2010/wordprocessingInk" xmlns:wne="http://schemas.microsoft.com/office/word/2006/wordml" xmlns:wps="http://schemas.microsoft.com/office/word/2010/wordprocessingShape" mc:Ignorable="w14 w15 w16se w16cid w16 w16cex w16sdtdh w16sdtfl w16du wp14">
   <w:abstractNum w:abstractNumId="0" w15:restartNumberingAfterBreak="0">
     <w:nsid w:val="175E275B"/>
     <w:multiLevelType w:val="multilevel"/>

</xml_diff>